<commit_message>
Align component directories with manuscript terminology
</commit_message>
<xml_diff>
--- a/docs/Technical_Guide.docx
+++ b/docs/Technical_Guide.docx
@@ -439,7 +439,7 @@
           <w:color w:val="000000"/>
           <w:sz w:val="16"/>
         </w:rPr>
-        <w:t>code/FYP_alin1_SmartUAVRescueSystem_Mobile_APP-main</w:t>
+        <w:t>code/mobile_application</w:t>
       </w:r>
       <w:r>
         <w:rPr>
@@ -448,7 +448,7 @@
           <w:sz w:val="16"/>
         </w:rPr>
         <w:br/>
-        <w:t>code/FYP_alin1_SmartUAVRescueSystem_Ground_Station-main</w:t>
+        <w:t>code/ground_station</w:t>
       </w:r>
       <w:r>
         <w:rPr>
@@ -457,7 +457,7 @@
           <w:sz w:val="16"/>
         </w:rPr>
         <w:br/>
-        <w:t>code/FYP_alin1_SmartUAVRescueSystem_Drone-main</w:t>
+        <w:t>code/search_uav</w:t>
       </w:r>
     </w:p>
     <w:p>
@@ -576,7 +576,7 @@
           <w:color w:val="000000"/>
           <w:sz w:val="16"/>
         </w:rPr>
-        <w:t>cd code/FYP_alin1_SmartUAVRescueSystem_Mobile_APP-main</w:t>
+        <w:t>cd code/mobile_application</w:t>
       </w:r>
       <w:r>
         <w:rPr>

</xml_diff>

<commit_message>
Make verification portable and document manuscript evidence
</commit_message>
<xml_diff>
--- a/docs/Technical_Guide.docx
+++ b/docs/Technical_Guide.docx
@@ -2,6 +2,14 @@
 <file path=word/document.xml><?xml version="1.0" encoding="utf-8"?>
 <w:document xmlns:wpc="http://schemas.microsoft.com/office/word/2010/wordprocessingCanvas" xmlns:mo="http://schemas.microsoft.com/office/mac/office/2008/main" xmlns:mc="http://schemas.openxmlformats.org/markup-compatibility/2006" xmlns:mv="urn:schemas-microsoft-com:mac:vml" xmlns:o="urn:schemas-microsoft-com:office:office" xmlns:r="http://schemas.openxmlformats.org/officeDocument/2006/relationships" xmlns:m="http://schemas.openxmlformats.org/officeDocument/2006/math" xmlns:v="urn:schemas-microsoft-com:vml" xmlns:wp14="http://schemas.microsoft.com/office/word/2010/wordprocessingDrawing" xmlns:wp="http://schemas.openxmlformats.org/drawingml/2006/wordprocessingDrawing" xmlns:w10="urn:schemas-microsoft-com:office:word" xmlns:w="http://schemas.openxmlformats.org/wordprocessingml/2006/main" xmlns:w14="http://schemas.microsoft.com/office/word/2010/wordml" xmlns:wpg="http://schemas.microsoft.com/office/word/2010/wordprocessingGroup" xmlns:wpi="http://schemas.microsoft.com/office/word/2010/wordprocessingInk" xmlns:wne="http://schemas.microsoft.com/office/word/2006/wordml" xmlns:wps="http://schemas.microsoft.com/office/word/2010/wordprocessingShape" mc:Ignorable="w14 wp14">
   <w:body>
+    <w:p>
+      <w:pPr>
+        <w:pStyle w:val="Title"/>
+      </w:pPr>
+      <w:r>
+        <w:t>Mountain Search UAV System Technical Guide</w:t>
+      </w:r>
+    </w:p>
     <w:p>
       <w:pPr>
         <w:pStyle w:val="Heading1"/>
@@ -11,19 +19,13 @@
       </w:r>
     </w:p>
     <w:p>
-      <w:pPr>
-        <w:widowControl/>
-      </w:pPr>
       <w:r>
-        <w:t>Mountain Search UAV System | Technical Guide | 28 September 2026</w:t>
+        <w:t>Mountain Search UAV System | Technical Guide | 30 September 2026</w:t>
         <w:br/>
-        <w:t>Source revision: UAV-SEARCH-20260928</w:t>
+        <w:t>Implementation baseline: UAV-SEARCH-20260928</w:t>
       </w:r>
     </w:p>
     <w:p>
-      <w:pPr>
-        <w:widowControl/>
-      </w:pPr>
       <w:r>
         <w:t>This archive contains the mobile application, ground station and UAV source code, together with MATLAB simulations of the three search modes, software verification records and outdoor footage. All paths in this guide are relative to the archive root.</w:t>
       </w:r>
@@ -31,7 +33,6 @@
     <w:p>
       <w:pPr>
         <w:pStyle w:val="Heading2"/>
-        <w:widowControl/>
       </w:pPr>
       <w:r>
         <w:t>File locations</w:t>
@@ -43,12 +44,12 @@
         <w:tblLayout w:type="fixed"/>
         <w:tblLook w:firstColumn="1" w:firstRow="1" w:lastColumn="0" w:lastRow="0" w:noHBand="0" w:noVBand="1" w:val="04A0"/>
         <w:tblBorders>
-          <w:top w:val="single" w:sz="4" w:color="000000"/>
-          <w:left w:val="single" w:sz="4" w:color="000000"/>
-          <w:bottom w:val="single" w:sz="4" w:color="000000"/>
-          <w:right w:val="single" w:sz="4" w:color="000000"/>
-          <w:insideH w:val="single" w:sz="4" w:color="000000"/>
-          <w:insideV w:val="single" w:sz="4" w:color="000000"/>
+          <w:top w:val="single" w:sz="4" w:color="D9D9D9"/>
+          <w:left w:val="single" w:sz="4" w:color="D9D9D9"/>
+          <w:bottom w:val="single" w:sz="4" w:color="D9D9D9"/>
+          <w:right w:val="single" w:sz="4" w:color="D9D9D9"/>
+          <w:insideH w:val="single" w:sz="4" w:color="D9D9D9"/>
+          <w:insideV w:val="single" w:sz="4" w:color="D9D9D9"/>
         </w:tblBorders>
       </w:tblPr>
       <w:tblGrid>
@@ -403,27 +404,18 @@
     </w:tbl>
     <w:p>
       <w:pPr>
-        <w:spacing w:after="0" w:before="0" w:line="240" w:lineRule="auto"/>
+        <w:spacing w:after="20"/>
       </w:pPr>
-      <w:r>
-        <w:rPr>
-          <w:sz w:val="6"/>
-        </w:rPr>
-      </w:r>
     </w:p>
     <w:p>
       <w:pPr>
         <w:pStyle w:val="Heading2"/>
-        <w:widowControl/>
       </w:pPr>
       <w:r>
         <w:t>Component directory abbreviations</w:t>
       </w:r>
     </w:p>
     <w:p>
-      <w:pPr>
-        <w:widowControl/>
-      </w:pPr>
       <w:r>
         <w:t>M, G and U refer to the mobile, ground-station and UAV directories, respectively:</w:t>
       </w:r>
@@ -431,31 +423,17 @@
     <w:p>
       <w:pPr>
         <w:keepLines/>
-        <w:spacing w:before="60" w:after="140" w:line="252" w:lineRule="auto"/>
+        <w:spacing w:before="60" w:after="160"/>
       </w:pPr>
       <w:r>
         <w:rPr>
-          <w:rFonts w:ascii="Liberation Mono" w:hAnsi="Liberation Mono" w:eastAsia="Arial"/>
+          <w:rFonts w:ascii="Consolas" w:hAnsi="Consolas"/>
           <w:color w:val="000000"/>
-          <w:sz w:val="16"/>
+          <w:sz w:val="18"/>
         </w:rPr>
         <w:t>code/mobile_application</w:t>
-      </w:r>
-      <w:r>
-        <w:rPr>
-          <w:rFonts w:ascii="Liberation Mono" w:hAnsi="Liberation Mono" w:eastAsia="Arial"/>
-          <w:color w:val="000000"/>
-          <w:sz w:val="16"/>
-        </w:rPr>
         <w:br/>
         <w:t>code/ground_station</w:t>
-      </w:r>
-      <w:r>
-        <w:rPr>
-          <w:rFonts w:ascii="Liberation Mono" w:hAnsi="Liberation Mono" w:eastAsia="Arial"/>
-          <w:color w:val="000000"/>
-          <w:sz w:val="16"/>
-        </w:rPr>
         <w:br/>
         <w:t>code/search_uav</w:t>
       </w:r>
@@ -463,31 +441,19 @@
     <w:p>
       <w:pPr>
         <w:pStyle w:val="Heading2"/>
-        <w:widowControl/>
       </w:pPr>
       <w:r>
         <w:t>Current behavior</w:t>
       </w:r>
     </w:p>
     <w:p>
-      <w:pPr>
-        <w:widowControl/>
-      </w:pPr>
       <w:r>
         <w:t>Mode 1 estimates the trip end time from the planned route and a fixed walking speed. Mode 2 checks whether the latest valid GPS sample exceeds the configured update timeout. Mode 3 places an SOS request in the verification queue. In all three modes, the operator verifies the situation and confirms a search before creating an event, reviewing its route and dispatching the mission.</w:t>
       </w:r>
     </w:p>
     <w:p>
-      <w:pPr>
-        <w:widowControl/>
-      </w:pPr>
       <w:r>
-        <w:t>Application and protocol version numbers are retained. The archive revision is recorded separately in code/source_revision.json. The software retains its existing language options.</w:t>
-      </w:r>
-    </w:p>
-    <w:p>
-      <w:r>
-        <w:br w:type="page"/>
+        <w:t>Application and protocol version numbers are retained. The implementation baseline is recorded in code/source_revision.json; Git history identifies later changes. The software retains its English and Chinese interface options. Section 9 maps the manuscript's functions to implementation and evidence.</w:t>
       </w:r>
     </w:p>
     <w:p>
@@ -499,17 +465,13 @@
       </w:r>
     </w:p>
     <w:p>
-      <w:pPr>
-        <w:widowControl/>
-      </w:pPr>
       <w:r>
-        <w:t>Software verification used Python 3.12, Node.js 24 and a C++14 compiler. Simulation recomputation used MATLAB R2025b. Run the following commands from the archive root.</w:t>
+        <w:t>Use Python 3.12 with Tk support, Node.js 24 and a C++14 compiler for local verification. MATLAB R2025b was used for the archived simulation; MATLAB is not required to check the saved numeric outputs. Run the following commands from the archive root.</w:t>
       </w:r>
     </w:p>
     <w:p>
       <w:pPr>
         <w:pStyle w:val="Heading2"/>
-        <w:widowControl/>
       </w:pPr>
       <w:r>
         <w:t>Create the Python environment</w:t>
@@ -518,40 +480,19 @@
     <w:p>
       <w:pPr>
         <w:keepLines/>
-        <w:spacing w:before="60" w:after="140" w:line="252" w:lineRule="auto"/>
+        <w:spacing w:before="60" w:after="160"/>
       </w:pPr>
       <w:r>
         <w:rPr>
-          <w:rFonts w:ascii="Liberation Mono" w:hAnsi="Liberation Mono" w:eastAsia="Arial"/>
+          <w:rFonts w:ascii="Consolas" w:hAnsi="Consolas"/>
           <w:color w:val="000000"/>
-          <w:sz w:val="16"/>
+          <w:sz w:val="18"/>
         </w:rPr>
-        <w:t>python3 -m venv .venv</w:t>
-      </w:r>
-      <w:r>
-        <w:rPr>
-          <w:rFonts w:ascii="Liberation Mono" w:hAnsi="Liberation Mono" w:eastAsia="Arial"/>
-          <w:color w:val="000000"/>
-          <w:sz w:val="16"/>
-        </w:rPr>
+        <w:t>python3.12 -m venv .venv</w:t>
         <w:br/>
         <w:t>source .venv/bin/activate</w:t>
-      </w:r>
-      <w:r>
-        <w:rPr>
-          <w:rFonts w:ascii="Liberation Mono" w:hAnsi="Liberation Mono" w:eastAsia="Arial"/>
-          <w:color w:val="000000"/>
-          <w:sz w:val="16"/>
-        </w:rPr>
         <w:br/>
         <w:t>python -m pip install -r requirements-verification.txt</w:t>
-      </w:r>
-      <w:r>
-        <w:rPr>
-          <w:rFonts w:ascii="Liberation Mono" w:hAnsi="Liberation Mono" w:eastAsia="Arial"/>
-          <w:color w:val="000000"/>
-          <w:sz w:val="16"/>
-        </w:rPr>
         <w:br/>
         <w:t>python scripts/prepare_local.py</w:t>
       </w:r>
@@ -559,7 +500,6 @@
     <w:p>
       <w:pPr>
         <w:pStyle w:val="Heading2"/>
-        <w:widowControl/>
       </w:pPr>
       <w:r>
         <w:t>Install mobile dependencies</w:t>
@@ -568,31 +508,17 @@
     <w:p>
       <w:pPr>
         <w:keepLines/>
-        <w:spacing w:before="60" w:after="140" w:line="252" w:lineRule="auto"/>
+        <w:spacing w:before="60" w:after="160"/>
       </w:pPr>
       <w:r>
         <w:rPr>
-          <w:rFonts w:ascii="Liberation Mono" w:hAnsi="Liberation Mono" w:eastAsia="Arial"/>
+          <w:rFonts w:ascii="Consolas" w:hAnsi="Consolas"/>
           <w:color w:val="000000"/>
-          <w:sz w:val="16"/>
+          <w:sz w:val="18"/>
         </w:rPr>
         <w:t>cd code/mobile_application</w:t>
-      </w:r>
-      <w:r>
-        <w:rPr>
-          <w:rFonts w:ascii="Liberation Mono" w:hAnsi="Liberation Mono" w:eastAsia="Arial"/>
-          <w:color w:val="000000"/>
-          <w:sz w:val="16"/>
-        </w:rPr>
         <w:br/>
         <w:t>npm ci</w:t>
-      </w:r>
-      <w:r>
-        <w:rPr>
-          <w:rFonts w:ascii="Liberation Mono" w:hAnsi="Liberation Mono" w:eastAsia="Arial"/>
-          <w:color w:val="000000"/>
-          <w:sz w:val="16"/>
-        </w:rPr>
         <w:br/>
         <w:t>cd ../..</w:t>
       </w:r>
@@ -600,7 +526,6 @@
     <w:p>
       <w:pPr>
         <w:pStyle w:val="Heading2"/>
-        <w:widowControl/>
       </w:pPr>
       <w:r>
         <w:t>Run the complete verification sequence</w:t>
@@ -609,38 +534,36 @@
     <w:p>
       <w:pPr>
         <w:keepLines/>
-        <w:spacing w:before="60" w:after="140" w:line="252" w:lineRule="auto"/>
+        <w:spacing w:before="60" w:after="160"/>
       </w:pPr>
       <w:r>
         <w:rPr>
-          <w:rFonts w:ascii="Liberation Mono" w:hAnsi="Liberation Mono" w:eastAsia="Arial"/>
+          <w:rFonts w:ascii="Consolas" w:hAnsi="Consolas"/>
           <w:color w:val="000000"/>
-          <w:sz w:val="16"/>
+          <w:sz w:val="18"/>
         </w:rPr>
-        <w:t>python scripts/verify.py --output local-results/verification</w:t>
+        <w:t>python scripts/verify.py --output local-results/verification-01</w:t>
       </w:r>
     </w:p>
     <w:p>
-      <w:pPr>
-        <w:widowControl/>
-      </w:pPr>
       <w:r>
-        <w:t>Use a new output directory for each run. The sequence checks lint rules, TypeScript types, version alignment, mobile tests, Python syntax, ground-station and UAV tests, C++ target-state handling and cross-component protocols. It then checks the saved MATLAB trajectories and figure axes. An all_passed value of true in summary.json means that all listed checks passed.</w:t>
+        <w:t>Use a new output directory for each run. The sequence checks output preservation, lint rules, TypeScript types, version alignment, mobile tests, Python syntax, ground-station and UAV tests, C++ target-state handling and cross-component protocols. It then checks the saved MATLAB trajectories and figure axes. Results and logs, including simulation_checks.json, are written inside the selected directory. An all_passed value of true in summary.json means that all listed checks passed. Archived results are preserved.</w:t>
+      </w:r>
+    </w:p>
+    <w:p>
+      <w:r>
+        <w:t>prepare_local.py creates M/services/db/firebaseConfig.ts from the example only when the local file is absent. Its placeholder values support tests with mocked cloud connections; they do not configure a live Firebase project. A direct call to python simulation/verify_outputs.py prints its findings without writing a report. Add --output followed by a new JSON path to save a report; an existing report is rejected.</w:t>
       </w:r>
     </w:p>
     <w:p>
       <w:pPr>
         <w:pStyle w:val="Heading2"/>
-        <w:widowControl/>
       </w:pPr>
       <w:r>
         <w:t>Repeat the local relay test</w:t>
       </w:r>
     </w:p>
     <w:p>
-      <w:pPr>
-        <w:widowControl/>
-      </w:pPr>
       <w:r>
         <w:t>Install Mosquitto and make the mosquitto executable available on the command path. The test starts a temporary broker that listens only on the local loopback address and stops it when the test finishes.</w:t>
       </w:r>
@@ -648,45 +571,27 @@
     <w:p>
       <w:pPr>
         <w:keepLines/>
-        <w:spacing w:before="60" w:after="140" w:line="252" w:lineRule="auto"/>
+        <w:spacing w:before="60" w:after="160"/>
       </w:pPr>
       <w:r>
         <w:rPr>
-          <w:rFonts w:ascii="Liberation Mono" w:hAnsi="Liberation Mono" w:eastAsia="Arial"/>
+          <w:rFonts w:ascii="Consolas" w:hAnsi="Consolas"/>
           <w:color w:val="000000"/>
-          <w:sz w:val="16"/>
+          <w:sz w:val="18"/>
         </w:rPr>
         <w:t>python code/integration_tests/run_phone_uav_gs_bench.py \</w:t>
-      </w:r>
-      <w:r>
-        <w:rPr>
-          <w:rFonts w:ascii="Liberation Mono" w:hAnsi="Liberation Mono" w:eastAsia="Arial"/>
-          <w:color w:val="000000"/>
-          <w:sz w:val="16"/>
-        </w:rPr>
         <w:br/>
-        <w:t xml:space="preserve">  --output local-results/phone-relay</w:t>
+        <w:t xml:space="preserve">  --output local-results/phone-relay-01</w:t>
       </w:r>
     </w:p>
     <w:p>
-      <w:pPr>
-        <w:widowControl/>
-      </w:pPr>
       <w:r>
         <w:t>The test sends a synthetic phone record through a local HTTP interface and uses a running Mosquitto broker for relay and acknowledgement. Its output includes nine key records, the broker log and file checksums.</w:t>
       </w:r>
     </w:p>
     <w:p>
-      <w:pPr>
-        <w:widowControl/>
-      </w:pPr>
       <w:r>
         <w:t>On Windows, activate Python with .venv\Scripts\Activate.ps1 in PowerShell. The complete shell-based verification entry point requires Git Bash or a compatible shell. Configure ROS programs on Ubuntu as described in Section 5.</w:t>
-      </w:r>
-    </w:p>
-    <w:p>
-      <w:r>
-        <w:br w:type="page"/>
       </w:r>
     </w:p>
     <w:p>
@@ -700,24 +605,17 @@
     <w:p>
       <w:pPr>
         <w:pStyle w:val="Heading2"/>
-        <w:widowControl/>
       </w:pPr>
       <w:r>
-        <w:t>Mode 1: trip booking</w:t>
+        <w:t>Mode 1 Event Booking</w:t>
       </w:r>
     </w:p>
     <w:p>
-      <w:pPr>
-        <w:widowControl/>
-      </w:pPr>
       <w:r>
         <w:t>The user enters a trip name, departure date and departure time, then selects successive locations along the planned route on the map. The interface displays the estimated end date and time automatically. Editing the route, departure date or departure time recalculates the estimate.</w:t>
       </w:r>
     </w:p>
     <w:p>
-      <w:pPr>
-        <w:widowControl/>
-      </w:pPr>
       <w:r>
         <w:t>The application uses the Haversine formula between consecutive coordinates and sums these distances. It uses a fixed walking speed of 4 km/h and rounds the estimated duration up to a whole minute. The end timestamp is the departure timestamp plus that duration. Dates spanning midnight, a year boundary or a leap day retain the complete end timestamp.</w:t>
       </w:r>
@@ -725,30 +623,20 @@
     <w:p>
       <w:pPr>
         <w:keepLines/>
-        <w:spacing w:before="60" w:after="140" w:line="252" w:lineRule="auto"/>
+        <w:spacing w:before="60" w:after="160"/>
       </w:pPr>
       <w:r>
         <w:rPr>
-          <w:rFonts w:ascii="Liberation Mono" w:hAnsi="Liberation Mono" w:eastAsia="Arial"/>
+          <w:rFonts w:ascii="Consolas" w:hAnsi="Consolas"/>
           <w:color w:val="000000"/>
-          <w:sz w:val="16"/>
+          <w:sz w:val="18"/>
         </w:rPr>
         <w:t>duration_minutes = ceil(route_distance_m / 4000 * 60)</w:t>
-      </w:r>
-      <w:r>
-        <w:rPr>
-          <w:rFonts w:ascii="Liberation Mono" w:hAnsi="Liberation Mono" w:eastAsia="Arial"/>
-          <w:color w:val="000000"/>
-          <w:sz w:val="16"/>
-        </w:rPr>
         <w:br/>
         <w:t>end_time = departure_time + duration_minutes * 60 seconds</w:t>
       </w:r>
     </w:p>
     <w:p>
-      <w:pPr>
-        <w:widowControl/>
-      </w:pPr>
       <w:r>
         <w:t>The 4 km/h value follows the general walking-time reference in Ordnance Survey's Map Reading guide. This estimate uses horizontal route distance; selected points should represent the planned route turns. Gradient, ground conditions and stops affect actual duration, so an overdue record still requires operator contact and verification.</w:t>
       </w:r>
@@ -759,12 +647,12 @@
         <w:tblLayout w:type="fixed"/>
         <w:tblLook w:firstColumn="1" w:firstRow="1" w:lastColumn="0" w:lastRow="0" w:noHBand="0" w:noVBand="1" w:val="04A0"/>
         <w:tblBorders>
-          <w:top w:val="single" w:sz="4" w:color="000000"/>
-          <w:left w:val="single" w:sz="4" w:color="000000"/>
-          <w:bottom w:val="single" w:sz="4" w:color="000000"/>
-          <w:right w:val="single" w:sz="4" w:color="000000"/>
-          <w:insideH w:val="single" w:sz="4" w:color="000000"/>
-          <w:insideV w:val="single" w:sz="4" w:color="000000"/>
+          <w:top w:val="single" w:sz="4" w:color="D9D9D9"/>
+          <w:left w:val="single" w:sz="4" w:color="D9D9D9"/>
+          <w:bottom w:val="single" w:sz="4" w:color="D9D9D9"/>
+          <w:right w:val="single" w:sz="4" w:color="D9D9D9"/>
+          <w:insideH w:val="single" w:sz="4" w:color="D9D9D9"/>
+          <w:insideV w:val="single" w:sz="4" w:color="D9D9D9"/>
         </w:tblBorders>
       </w:tblPr>
       <w:tblGrid>
@@ -1119,50 +1007,48 @@
     </w:tbl>
     <w:p>
       <w:pPr>
-        <w:spacing w:after="0" w:before="0" w:line="240" w:lineRule="auto"/>
+        <w:spacing w:after="20"/>
+      </w:pPr>
+    </w:p>
+    <w:p>
+      <w:pPr>
+        <w:pStyle w:val="Heading2"/>
       </w:pPr>
       <w:r>
-        <w:rPr>
-          <w:sz w:val="6"/>
-        </w:rPr>
+        <w:t>Mode 2 Quick Start and Mode 3 SOS</w:t>
+      </w:r>
+    </w:p>
+    <w:p>
+      <w:r>
+        <w:t>Mode 2 uploads GPS positions and sample timestamps during the hike. The ground station checks the latest valid sample for a timeout and uses the uploaded position history when preparing a flight. Mode 3 stores the location and request information recorded when the user activates SOS, for operator verification and square-spiral route generation.</w:t>
+      </w:r>
+    </w:p>
+    <w:p>
+      <w:r>
+        <w:t>Mode 2 uses sampling time, not upload or receipt time. A stationary position with fresh samples does not trigger the current update-timeout rule. SOS uploads go to this system's Firebase database and ground station. The separate Call 999 Now button opens the phone dialer. The manuscript retains an earlier interface screenshot; the current English and Chinese SOS instructions explicitly describe ground-station operator verification.</w:t>
+      </w:r>
+    </w:p>
+    <w:p>
+      <w:r>
+        <w:t>Implementation: M/services/eventBookingRecord.ts. Booking interface: M/pages/EventBookingPage.tsx. Tests: M/__tests__/eventBookingRecord.test.ts.</w:t>
+      </w:r>
+    </w:p>
+    <w:p>
+      <w:r>
+        <w:t>Reference: Ordnance Survey, Map Reading, “Timing”, printed page 23. The complete source link is in docs/Sources.txt.</w:t>
       </w:r>
     </w:p>
     <w:p>
       <w:pPr>
         <w:pStyle w:val="Heading2"/>
-        <w:widowControl/>
       </w:pPr>
       <w:r>
-        <w:t>Modes 2 and 3</w:t>
-      </w:r>
-    </w:p>
-    <w:p>
-      <w:pPr>
-        <w:widowControl/>
-      </w:pPr>
-      <w:r>
-        <w:t>Mode 2 uploads GPS positions and sample timestamps during the hike. The ground station checks the latest valid sample for a timeout and uses the uploaded position history when preparing a flight. Mode 3 stores the location and request information recorded when the user activates SOS, for operator verification and square-spiral route generation.</w:t>
-      </w:r>
-    </w:p>
-    <w:p>
-      <w:pPr>
-        <w:widowControl/>
-      </w:pPr>
-      <w:r>
-        <w:t>Implementation: M/services/eventBookingRecord.ts. Booking interface: M/pages/EventBookingPage.tsx. Tests: M/__tests__/eventBookingRecord.test.ts.</w:t>
-      </w:r>
-    </w:p>
-    <w:p>
-      <w:pPr>
-        <w:widowControl/>
-      </w:pPr>
-      <w:r>
-        <w:t>Reference: Ordnance Survey, Map Reading, “Timing”, printed page 23. The complete source link is in docs/Sources.txt.</w:t>
+        <w:t>Mobile deployment configuration</w:t>
       </w:r>
     </w:p>
     <w:p>
       <w:r>
-        <w:br w:type="page"/>
+        <w:t>For device operation, fill M/services/db/firebaseConfig.ts with the project's client configuration and use the same Realtime Database URL as the ground station. Configure the native Android or iOS toolchain, platform Firebase files and map credentials separately. From M, npm start starts Metro; npm run android or npm run ios invokes the native platform build. The screenshot and compile-only helpers use stubs and do not produce a verified deployment. Local Jest tests do not establish a new installed application build.</w:t>
       </w:r>
     </w:p>
     <w:p>
@@ -1176,24 +1062,17 @@
     <w:p>
       <w:pPr>
         <w:pStyle w:val="Heading2"/>
-        <w:widowControl/>
       </w:pPr>
       <w:r>
         <w:t>Common verification procedure</w:t>
       </w:r>
     </w:p>
     <w:p>
-      <w:pPr>
-        <w:widowControl/>
-      </w:pPr>
       <w:r>
         <w:t>Overdue bookings, GPS update timeouts and new SOS requests enter the verification queue. The operator reads the user and emergency-contact details, contacts them and records the outcome. A confirmed safe status closes the alert. If safety cannot be confirmed, the operator contacts the available emergency contacts. After completing these records, the operator explicitly confirms a search before the platform creates a search event.</w:t>
       </w:r>
     </w:p>
     <w:p>
-      <w:pPr>
-        <w:widowControl/>
-      </w:pPr>
       <w:r>
         <w:t>An SOS request no longer creates a dispatchable event directly. Repeated scans or confirmations do not create duplicates. A cancelled SOS cannot be confirmed through a stale alert. An unverified SOS event from the earlier implementation must complete contact verification before route preparation, provided it has not already entered execution.</w:t>
       </w:r>
@@ -1201,24 +1080,17 @@
     <w:p>
       <w:pPr>
         <w:pStyle w:val="Heading2"/>
-        <w:widowControl/>
       </w:pPr>
       <w:r>
         <w:t>Select an event, review its route and dispatch</w:t>
       </w:r>
     </w:p>
     <w:p>
-      <w:pPr>
-        <w:widowControl/>
-      </w:pPr>
       <w:r>
         <w:t>After the operator selects an event, the ground station reads the associated user records and generates a route. Mode 1 uses the planned route; Mode 2 uses GPS history ordered by sample time; Mode 3 generates a square spiral around the SOS location. The operator reviews the route and settings before dispatch. Changes to the relevant records or operation state require the mission to be prepared again.</w:t>
       </w:r>
     </w:p>
     <w:p>
-      <w:pPr>
-        <w:widowControl/>
-      </w:pPr>
       <w:r>
         <w:t>All three modes have the same initial event priority and the same waiting-time rule. SOS mode alone does not assign the highest priority. The operator selects and dispatches the mission.</w:t>
       </w:r>
@@ -1226,7 +1098,6 @@
     <w:p>
       <w:pPr>
         <w:pStyle w:val="Heading2"/>
-        <w:widowControl/>
       </w:pPr>
       <w:r>
         <w:t>Runtime configuration</w:t>
@@ -1238,12 +1109,12 @@
         <w:tblLayout w:type="fixed"/>
         <w:tblLook w:firstColumn="1" w:firstRow="1" w:lastColumn="0" w:lastRow="0" w:noHBand="0" w:noVBand="1" w:val="04A0"/>
         <w:tblBorders>
-          <w:top w:val="single" w:sz="4" w:color="000000"/>
-          <w:left w:val="single" w:sz="4" w:color="000000"/>
-          <w:bottom w:val="single" w:sz="4" w:color="000000"/>
-          <w:right w:val="single" w:sz="4" w:color="000000"/>
-          <w:insideH w:val="single" w:sz="4" w:color="000000"/>
-          <w:insideV w:val="single" w:sz="4" w:color="000000"/>
+          <w:top w:val="single" w:sz="4" w:color="D9D9D9"/>
+          <w:left w:val="single" w:sz="4" w:color="D9D9D9"/>
+          <w:bottom w:val="single" w:sz="4" w:color="D9D9D9"/>
+          <w:right w:val="single" w:sz="4" w:color="D9D9D9"/>
+          <w:insideH w:val="single" w:sz="4" w:color="D9D9D9"/>
+          <w:insideV w:val="single" w:sz="4" w:color="D9D9D9"/>
         </w:tblBorders>
       </w:tblPr>
       <w:tblGrid>
@@ -1598,33 +1469,51 @@
     </w:tbl>
     <w:p>
       <w:pPr>
-        <w:spacing w:after="0" w:before="0" w:line="240" w:lineRule="auto"/>
+        <w:spacing w:after="20"/>
       </w:pPr>
-      <w:r>
-        <w:rPr>
-          <w:sz w:val="6"/>
-        </w:rPr>
-      </w:r>
     </w:p>
     <w:p>
-      <w:pPr>
-        <w:widowControl/>
-      </w:pPr>
       <w:r>
         <w:t>Use G/runtime.env.example as the template. Supply and export the actual values, then run python ground_station.py from G. Both threshold fields are blank in the template. The 1-second GPS threshold in the tests checks time-boundary behavior.</w:t>
       </w:r>
     </w:p>
     <w:p>
+      <w:r>
+        <w:t>Copy the template to G/runtime.env and fill it locally before running the following commands from the archive root. The application reads exported environment variables; it does not automatically load runtime.env.</w:t>
+      </w:r>
+    </w:p>
+    <w:p>
       <w:pPr>
-        <w:widowControl/>
+        <w:keepLines/>
+        <w:spacing w:before="60" w:after="160"/>
       </w:pPr>
       <w:r>
-        <w:t>Verification logic: G/rescue_event_manager.py. Persistence and mission preparation: G/rescue_repository.py, G/active_event_queue.py and G/ground_station.py.</w:t>
+        <w:rPr>
+          <w:rFonts w:ascii="Consolas" w:hAnsi="Consolas"/>
+          <w:color w:val="000000"/>
+          <w:sz w:val="18"/>
+        </w:rPr>
+        <w:t>set -a</w:t>
+        <w:br/>
+        <w:t>. ./code/ground_station/runtime.env</w:t>
+        <w:br/>
+        <w:t>set +a</w:t>
+        <w:br/>
+        <w:t>python code/deployment_preflight.py</w:t>
+        <w:br/>
+        <w:t>cd code/ground_station</w:t>
+        <w:br/>
+        <w:t>python ground_station.py</w:t>
       </w:r>
     </w:p>
     <w:p>
       <w:r>
-        <w:br w:type="page"/>
+        <w:t>The preflight command checks local configuration consistency without contacting Firebase or validating an installed phone application. Both the ground station and UAV must reach the configured broker over the deployment network; localhost is only suitable when that process shares the broker's host.</w:t>
+      </w:r>
+    </w:p>
+    <w:p>
+      <w:r>
+        <w:t>Verification logic: G/rescue_event_manager.py. Persistence and mission preparation: G/rescue_repository.py, G/active_event_queue.py and G/ground_station.py.</w:t>
       </w:r>
     </w:p>
     <w:p>
@@ -1638,26 +1527,19 @@
     <w:p>
       <w:pPr>
         <w:pStyle w:val="Heading2"/>
-        <w:widowControl/>
       </w:pPr>
       <w:r>
         <w:t>Mission reception and execution status</w:t>
       </w:r>
     </w:p>
     <w:p>
-      <w:pPr>
-        <w:widowControl/>
-      </w:pPr>
       <w:r>
         <w:t>The ground station and UAV exchange missions and status over Wi-Fi using MQTT messages. A mission contains event and execution identifiers, a waypoint sequence, flight altitude, hover duration and return settings. The bridge validates the mission, passes it to the flight program and reports waypoint arrivals and mission stages to the ground station.</w:t>
       </w:r>
     </w:p>
     <w:p>
-      <w:pPr>
-        <w:widowControl/>
-      </w:pPr>
       <w:r>
-        <w:t>The phone-record receiver saves uploads received through its HTTP interface. When the forwarding condition is met, it sends the record to the ground station. The ground station saves the record and returns an acknowledgement matching its identifier and content hash. The UAV then marks that transfer as complete. The recording program saves downward-facing video on the onboard computer.</w:t>
+        <w:t>The phone-record receiver saves uploads received through its HTTP interface. After a matching mission reports completion of all waypoints and requests landing, the receiver forwards stored records to the ground station. The ground station saves each record and returns an acknowledgement matching its identifier and content hash. The UAV then marks that transfer as complete. This message marks a landing request, not measured physical touchdown. The recording program saves downward-facing video on the onboard computer.</w:t>
       </w:r>
     </w:p>
     <w:tbl>
@@ -1666,12 +1548,12 @@
         <w:tblLayout w:type="fixed"/>
         <w:tblLook w:firstColumn="1" w:firstRow="1" w:lastColumn="0" w:lastRow="0" w:noHBand="0" w:noVBand="1" w:val="04A0"/>
         <w:tblBorders>
-          <w:top w:val="single" w:sz="4" w:color="000000"/>
-          <w:left w:val="single" w:sz="4" w:color="000000"/>
-          <w:bottom w:val="single" w:sz="4" w:color="000000"/>
-          <w:right w:val="single" w:sz="4" w:color="000000"/>
-          <w:insideH w:val="single" w:sz="4" w:color="000000"/>
-          <w:insideV w:val="single" w:sz="4" w:color="000000"/>
+          <w:top w:val="single" w:sz="4" w:color="D9D9D9"/>
+          <w:left w:val="single" w:sz="4" w:color="D9D9D9"/>
+          <w:bottom w:val="single" w:sz="4" w:color="D9D9D9"/>
+          <w:right w:val="single" w:sz="4" w:color="D9D9D9"/>
+          <w:insideH w:val="single" w:sz="4" w:color="D9D9D9"/>
+          <w:insideV w:val="single" w:sz="4" w:color="D9D9D9"/>
         </w:tblBorders>
       </w:tblPr>
       <w:tblGrid>
@@ -1940,27 +1822,18 @@
     </w:tbl>
     <w:p>
       <w:pPr>
-        <w:spacing w:after="0" w:before="0" w:line="240" w:lineRule="auto"/>
+        <w:spacing w:after="20"/>
       </w:pPr>
-      <w:r>
-        <w:rPr>
-          <w:sz w:val="6"/>
-        </w:rPr>
-      </w:r>
     </w:p>
     <w:p>
       <w:pPr>
         <w:pStyle w:val="Heading2"/>
-        <w:widowControl/>
       </w:pPr>
       <w:r>
         <w:t>Pinned external dependency</w:t>
       </w:r>
     </w:p>
     <w:p>
-      <w:pPr>
-        <w:widowControl/>
-      </w:pPr>
       <w:r>
         <w:t>The flight stack uses Fast-Drone-250 from the original Drone repository at the commit below. Its 979 regular files were compared with the original local copy and matched. The external dependency retains its own licenses and documentation.</w:t>
       </w:r>
@@ -1968,44 +1841,30 @@
     <w:p>
       <w:pPr>
         <w:keepLines/>
-        <w:spacing w:before="60" w:after="140" w:line="252" w:lineRule="auto"/>
+        <w:spacing w:before="60" w:after="160"/>
       </w:pPr>
       <w:r>
         <w:rPr>
-          <w:rFonts w:ascii="Liberation Mono" w:hAnsi="Liberation Mono" w:eastAsia="Arial"/>
+          <w:rFonts w:ascii="Consolas" w:hAnsi="Consolas"/>
           <w:color w:val="000000"/>
-          <w:sz w:val="16"/>
+          <w:sz w:val="18"/>
         </w:rPr>
         <w:t>b3ac1591b63d15270c9856e7b664da0cf9d3ea48</w:t>
       </w:r>
     </w:p>
     <w:p>
-      <w:pPr>
-        <w:widowControl/>
-      </w:pPr>
       <w:r>
         <w:t>Download and placement commands are in docs/Flight_Environment_Setup.txt. The original onboard directories are /home/mike/Fast-Drone-250, /home/mike/catkin_ws and /home/mike/drone_system. On a different machine, check directory paths, camera indices, serial ports and sensor calibration.</w:t>
       </w:r>
     </w:p>
     <w:p>
-      <w:pPr>
-        <w:widowControl/>
-      </w:pPr>
       <w:r>
         <w:t>The ROS environment uses Noetic and catkin. Build the external flight workspace before the rescue_bridge workspace. The default flight altitude in rescue_bridge.launch is the original project setting of 5 m. The 80 m above-ground setting in Section 6 belongs to the separate MATLAB simulation.</w:t>
       </w:r>
     </w:p>
     <w:p>
-      <w:pPr>
-        <w:widowControl/>
-      </w:pPr>
       <w:r>
         <w:t>Phone-receiver settings are in U/drone_system/config/rescue_receiver.env.example. Set UAV_RESCUE_TOKEN when exposing the interface on the local network. Keep database credentials, runtime tokens and actual user records in their respective deployment environments.</w:t>
-      </w:r>
-    </w:p>
-    <w:p>
-      <w:r>
-        <w:br w:type="page"/>
       </w:r>
     </w:p>
     <w:p>
@@ -2017,9 +1876,6 @@
       </w:r>
     </w:p>
     <w:p>
-      <w:pPr>
-        <w:widowControl/>
-      </w:pPr>
       <w:r>
         <w:t>The simulation uses terrain near Pak Tam Chung, Sai Kung. The three modes share a launch location and a target in the hills, using a planned route, pre-dispatch GPS history and a square spiral around the target, respectively. Each mission includes takeoff, cruise, target-area activity, return and landing.</w:t>
       </w:r>
@@ -2030,12 +1886,12 @@
         <w:tblLayout w:type="fixed"/>
         <w:tblLook w:firstColumn="1" w:firstRow="1" w:lastColumn="0" w:lastRow="0" w:noHBand="0" w:noVBand="1" w:val="04A0"/>
         <w:tblBorders>
-          <w:top w:val="single" w:sz="4" w:color="000000"/>
-          <w:left w:val="single" w:sz="4" w:color="000000"/>
-          <w:bottom w:val="single" w:sz="4" w:color="000000"/>
-          <w:right w:val="single" w:sz="4" w:color="000000"/>
-          <w:insideH w:val="single" w:sz="4" w:color="000000"/>
-          <w:insideV w:val="single" w:sz="4" w:color="000000"/>
+          <w:top w:val="single" w:sz="4" w:color="D9D9D9"/>
+          <w:left w:val="single" w:sz="4" w:color="D9D9D9"/>
+          <w:bottom w:val="single" w:sz="4" w:color="D9D9D9"/>
+          <w:right w:val="single" w:sz="4" w:color="D9D9D9"/>
+          <w:insideH w:val="single" w:sz="4" w:color="D9D9D9"/>
+          <w:insideV w:val="single" w:sz="4" w:color="D9D9D9"/>
         </w:tblBorders>
       </w:tblPr>
       <w:tblGrid>
@@ -2433,27 +2289,18 @@
     </w:tbl>
     <w:p>
       <w:pPr>
-        <w:spacing w:after="0" w:before="0" w:line="240" w:lineRule="auto"/>
+        <w:spacing w:after="20"/>
       </w:pPr>
-      <w:r>
-        <w:rPr>
-          <w:sz w:val="6"/>
-        </w:rPr>
-      </w:r>
     </w:p>
     <w:p>
       <w:pPr>
         <w:pStyle w:val="Heading2"/>
-        <w:widowControl/>
       </w:pPr>
       <w:r>
         <w:t>Run commands</w:t>
       </w:r>
     </w:p>
     <w:p>
-      <w:pPr>
-        <w:widowControl/>
-      </w:pPr>
       <w:r>
         <w:t>Set the MATLAB current folder to simulation and select the required entry point:</w:t>
       </w:r>
@@ -2461,41 +2308,24 @@
     <w:p>
       <w:pPr>
         <w:keepLines/>
-        <w:spacing w:before="60" w:after="140" w:line="252" w:lineRule="auto"/>
+        <w:spacing w:before="60" w:after="160"/>
       </w:pPr>
       <w:r>
         <w:rPr>
-          <w:rFonts w:ascii="Liberation Mono" w:hAnsi="Liberation Mono" w:eastAsia="Arial"/>
+          <w:rFonts w:ascii="Consolas" w:hAnsi="Consolas"/>
           <w:color w:val="000000"/>
-          <w:sz w:val="16"/>
+          <w:sz w:val="18"/>
         </w:rPr>
         <w:t>run_all('paper')</w:t>
-      </w:r>
-      <w:r>
-        <w:rPr>
-          <w:rFonts w:ascii="Liberation Mono" w:hAnsi="Liberation Mono" w:eastAsia="Arial"/>
-          <w:color w:val="000000"/>
-          <w:sz w:val="16"/>
-        </w:rPr>
         <w:br/>
         <w:t>run_all('simulate')</w:t>
-      </w:r>
-      <w:r>
-        <w:rPr>
-          <w:rFonts w:ascii="Liberation Mono" w:hAnsi="Liberation Mono" w:eastAsia="Arial"/>
-          <w:color w:val="000000"/>
-          <w:sz w:val="16"/>
-        </w:rPr>
         <w:br/>
         <w:t>run_all('video')</w:t>
       </w:r>
     </w:p>
     <w:p>
-      <w:pPr>
-        <w:widowControl/>
-      </w:pPr>
       <w:r>
-        <w:t>paper redraws the paper figure from saved trajectories. simulate recomputes all modes and exports figures. video creates the animation and requires ffmpeg for video assembly. The paper figure is written to regenerated/paper; complete trajectories, statistics and animation are stored in output.</w:t>
+        <w:t>paper redraws the paper figure from saved trajectories into simulation/regenerated/paper. simulate recomputes all modes and replaces files in simulation/output. video replaces animation outputs there and requires ffmpeg. Preserve simulation/output in a separate working copy before simulate or video. The updated renderers use Event Booking, Quick Start and SOS; existing archived outputs retain their original provenance.</w:t>
       </w:r>
     </w:p>
     <w:tbl>
@@ -2504,12 +2334,12 @@
         <w:tblLayout w:type="fixed"/>
         <w:tblLook w:firstColumn="1" w:firstRow="1" w:lastColumn="0" w:lastRow="0" w:noHBand="0" w:noVBand="1" w:val="04A0"/>
         <w:tblBorders>
-          <w:top w:val="single" w:sz="4" w:color="000000"/>
-          <w:left w:val="single" w:sz="4" w:color="000000"/>
-          <w:bottom w:val="single" w:sz="4" w:color="000000"/>
-          <w:right w:val="single" w:sz="4" w:color="000000"/>
-          <w:insideH w:val="single" w:sz="4" w:color="000000"/>
-          <w:insideV w:val="single" w:sz="4" w:color="000000"/>
+          <w:top w:val="single" w:sz="4" w:color="D9D9D9"/>
+          <w:left w:val="single" w:sz="4" w:color="D9D9D9"/>
+          <w:bottom w:val="single" w:sz="4" w:color="D9D9D9"/>
+          <w:right w:val="single" w:sz="4" w:color="D9D9D9"/>
+          <w:insideH w:val="single" w:sz="4" w:color="D9D9D9"/>
+          <w:insideV w:val="single" w:sz="4" w:color="D9D9D9"/>
         </w:tblBorders>
       </w:tblPr>
       <w:tblGrid>
@@ -2846,33 +2676,22 @@
     </w:tbl>
     <w:p>
       <w:pPr>
-        <w:spacing w:after="0" w:before="0" w:line="240" w:lineRule="auto"/>
+        <w:spacing w:after="20"/>
       </w:pPr>
-      <w:r>
-        <w:rPr>
-          <w:sz w:val="6"/>
-        </w:rPr>
-      </w:r>
     </w:p>
     <w:p>
-      <w:pPr>
-        <w:widowControl/>
-      </w:pPr>
       <w:r>
-        <w:t>Elevation comes from the Mapzen / Tilezen Skadi N22E114.hgt tile, with a 3601 × 3601 grid at 1 arc-second spacing. Routes and GPS history are synthetic simulation inputs generated with the fixed seed. Times start at simulated takeoff. Parameters, inputs and executed trajectories are in scenario_and_settings.json, the per-mode waypoint CSV files and the per-mode execution_trace.csv files.</w:t>
-      </w:r>
-    </w:p>
-    <w:p>
-      <w:pPr>
-        <w:widowControl/>
-      </w:pPr>
-      <w:r>
-        <w:t>The MATLAB run includes 30 assertions. A separate Python verification contains 53 checks covering terrain interpolation, 80 m ground clearance, speed limits, waypoint order, return and landing, and fully boxed axes.</w:t>
+        <w:t>Elevation comes from the Mapzen / Tilezen Skadi N22E114.hgt tile, with a 3601 × 3601 grid at 1 arc-second spacing and EGM96 elevations. Bilinear interpolation gives a 25 m plotting grid without increasing source resolution. Routes and GPS history are synthetic inputs generated with the fixed seed. Times start at simulated takeoff. Parameters, inputs and executed trajectories are in simulation/output/scenario_and_settings.json, the per-mode waypoint CSV files and the execution_trace.csv files. The ideal terrain-following model does not simulate PX4 dynamics or radio performance.</w:t>
       </w:r>
     </w:p>
     <w:p>
       <w:r>
-        <w:br w:type="page"/>
+        <w:t>Mode 2 timestamps use 1 m/s to construct the synthetic walking history; this is separate from the mobile booking estimate of 4 km/h. All 15 samples exist before dispatch. Mode 3 visits the centre plus 18 spiral endpoints, completes the entire route and then returns; reaching the target does not terminate the search early.</w:t>
+      </w:r>
+    </w:p>
+    <w:p>
+      <w:r>
+        <w:t>The archived MATLAB computation passed 30 assertions. A separate Python verification contains 53 checks covering terrain interpolation, 80 m ground clearance, speed limits, waypoint order, return and landing, and the saved figure-axis audit. Rechecking these outputs or redrawing the figure is separate from recomputing the MATLAB scenario.</w:t>
       </w:r>
     </w:p>
     <w:p>
@@ -2884,11 +2703,13 @@
       </w:r>
     </w:p>
     <w:p>
-      <w:pPr>
-        <w:widowControl/>
-      </w:pPr>
       <w:r>
         <w:t>Verification ran on 28 September 2026 using macOS arm64, Python 3.12.14 and Node.js 24.19.0. Detailed results are in records/software.log and records/verification_summary.json.</w:t>
+      </w:r>
+    </w:p>
+    <w:p>
+      <w:r>
+        <w:t>The 30 September rerun is recorded separately in records/verification_20260930/. It passed all 624 software tests below, three verification-output regression tests and 53 saved-simulation checks. The original protocol fixture from 9 September is now included at G/fixtures/capture_record_v2.json, so its six ground-station tests no longer depend on a file outside this repository. Existing verification logs retain their original dates.</w:t>
       </w:r>
     </w:p>
     <w:tbl>
@@ -2897,12 +2718,12 @@
         <w:tblLayout w:type="fixed"/>
         <w:tblLook w:firstColumn="1" w:firstRow="1" w:lastColumn="0" w:lastRow="0" w:noHBand="0" w:noVBand="1" w:val="04A0"/>
         <w:tblBorders>
-          <w:top w:val="single" w:sz="4" w:color="000000"/>
-          <w:left w:val="single" w:sz="4" w:color="000000"/>
-          <w:bottom w:val="single" w:sz="4" w:color="000000"/>
-          <w:right w:val="single" w:sz="4" w:color="000000"/>
-          <w:insideH w:val="single" w:sz="4" w:color="000000"/>
-          <w:insideV w:val="single" w:sz="4" w:color="000000"/>
+          <w:top w:val="single" w:sz="4" w:color="D9D9D9"/>
+          <w:left w:val="single" w:sz="4" w:color="D9D9D9"/>
+          <w:bottom w:val="single" w:sz="4" w:color="D9D9D9"/>
+          <w:right w:val="single" w:sz="4" w:color="D9D9D9"/>
+          <w:insideH w:val="single" w:sz="4" w:color="D9D9D9"/>
+          <w:insideV w:val="single" w:sz="4" w:color="D9D9D9"/>
         </w:tblBorders>
       </w:tblPr>
       <w:tblGrid>
@@ -3300,18 +3121,10 @@
     </w:tbl>
     <w:p>
       <w:pPr>
-        <w:spacing w:after="0" w:before="0" w:line="240" w:lineRule="auto"/>
+        <w:spacing w:after="20"/>
       </w:pPr>
-      <w:r>
-        <w:rPr>
-          <w:sz w:val="6"/>
-        </w:rPr>
-      </w:r>
     </w:p>
     <w:p>
-      <w:pPr>
-        <w:widowControl/>
-      </w:pPr>
       <w:r>
         <w:t>TypeScript type checking, ESLint, Python syntax, dependency-version checks, and compilation and execution of the C++ target-state tests also passed. New cases cover trip-time estimation, midnight rollover, recalculation after route edits, SOS contact steps, cancellation, stale requests, repeated scans and rejection of unverified events at dispatch preparation.</w:t>
       </w:r>
@@ -3319,16 +3132,12 @@
     <w:p>
       <w:pPr>
         <w:pStyle w:val="Heading2"/>
-        <w:widowControl/>
       </w:pPr>
       <w:r>
         <w:t>Local phone-record reception and forwarding</w:t>
       </w:r>
     </w:p>
     <w:p>
-      <w:pPr>
-        <w:widowControl/>
-      </w:pPr>
       <w:r>
         <w:t>A synthetic phone record containing an SOS location and GPS data is sent through local HTTP to the UAV receiver. After the receiver saves it, the test sends a matching mission-stage message to trigger forwarding. The ground station validates and saves the received data, then sends an acknowledgement. The UAV uses that acknowledgement to complete the transfer.</w:t>
       </w:r>
@@ -3339,12 +3148,12 @@
         <w:tblLayout w:type="fixed"/>
         <w:tblLook w:firstColumn="1" w:firstRow="1" w:lastColumn="0" w:lastRow="0" w:noHBand="0" w:noVBand="1" w:val="04A0"/>
         <w:tblBorders>
-          <w:top w:val="single" w:sz="4" w:color="000000"/>
-          <w:left w:val="single" w:sz="4" w:color="000000"/>
-          <w:bottom w:val="single" w:sz="4" w:color="000000"/>
-          <w:right w:val="single" w:sz="4" w:color="000000"/>
-          <w:insideH w:val="single" w:sz="4" w:color="000000"/>
-          <w:insideV w:val="single" w:sz="4" w:color="000000"/>
+          <w:top w:val="single" w:sz="4" w:color="D9D9D9"/>
+          <w:left w:val="single" w:sz="4" w:color="D9D9D9"/>
+          <w:bottom w:val="single" w:sz="4" w:color="D9D9D9"/>
+          <w:right w:val="single" w:sz="4" w:color="D9D9D9"/>
+          <w:insideH w:val="single" w:sz="4" w:color="D9D9D9"/>
+          <w:insideV w:val="single" w:sz="4" w:color="D9D9D9"/>
         </w:tblBorders>
       </w:tblPr>
       <w:tblGrid>
@@ -3570,33 +3379,22 @@
     </w:tbl>
     <w:p>
       <w:pPr>
-        <w:spacing w:after="0" w:before="0" w:line="240" w:lineRule="auto"/>
+        <w:spacing w:after="20"/>
       </w:pPr>
-      <w:r>
-        <w:rPr>
-          <w:sz w:val="6"/>
-        </w:rPr>
-      </w:r>
     </w:p>
     <w:p>
-      <w:pPr>
-        <w:widowControl/>
-      </w:pPr>
       <w:r>
         <w:t>The request_id, mission_id, record-content hash and envelope hash link these records for comparison. run_summary.json lists the result and test conditions. SHA256SUMS.txt contains the output-file checksums.</w:t>
       </w:r>
     </w:p>
     <w:p>
-      <w:pPr>
-        <w:widowControl/>
-      </w:pPr>
       <w:r>
         <w:t>These records describe the local software and broker test. Outdoor footage is listed in Section 8. The software tests also cover incorrect or missing acknowledgements, duplicate data and recovery after a restart; the test cases and results are retained in the source files and logs.</w:t>
       </w:r>
     </w:p>
     <w:p>
       <w:r>
-        <w:br w:type="page"/>
+        <w:t>The independent 30 September bench records are in experiments/phone_relay_20260930/. Both benches use synthetic uploads and a real local Mosquitto broker. They do not exercise physical phone association, live Firebase access or ROS flight control.</w:t>
       </w:r>
     </w:p>
     <w:p>
@@ -3610,7 +3408,6 @@
     <w:p>
       <w:pPr>
         <w:pStyle w:val="Heading2"/>
-        <w:widowControl/>
       </w:pPr>
       <w:r>
         <w:t>Outdoor evidence</w:t>
@@ -3622,12 +3419,12 @@
         <w:tblLayout w:type="fixed"/>
         <w:tblLook w:firstColumn="1" w:firstRow="1" w:lastColumn="0" w:lastRow="0" w:noHBand="0" w:noVBand="1" w:val="04A0"/>
         <w:tblBorders>
-          <w:top w:val="single" w:sz="4" w:color="000000"/>
-          <w:left w:val="single" w:sz="4" w:color="000000"/>
-          <w:bottom w:val="single" w:sz="4" w:color="000000"/>
-          <w:right w:val="single" w:sz="4" w:color="000000"/>
-          <w:insideH w:val="single" w:sz="4" w:color="000000"/>
-          <w:insideV w:val="single" w:sz="4" w:color="000000"/>
+          <w:top w:val="single" w:sz="4" w:color="D9D9D9"/>
+          <w:left w:val="single" w:sz="4" w:color="D9D9D9"/>
+          <w:bottom w:val="single" w:sz="4" w:color="D9D9D9"/>
+          <w:right w:val="single" w:sz="4" w:color="D9D9D9"/>
+          <w:insideH w:val="single" w:sz="4" w:color="D9D9D9"/>
+          <w:insideV w:val="single" w:sz="4" w:color="D9D9D9"/>
         </w:tblBorders>
       </w:tblPr>
       <w:tblGrid>
@@ -3896,18 +3693,10 @@
     </w:tbl>
     <w:p>
       <w:pPr>
-        <w:spacing w:after="0" w:before="0" w:line="240" w:lineRule="auto"/>
+        <w:spacing w:after="20"/>
       </w:pPr>
-      <w:r>
-        <w:rPr>
-          <w:sz w:val="6"/>
-        </w:rPr>
-      </w:r>
     </w:p>
     <w:p>
-      <w:pPr>
-        <w:widowControl/>
-      </w:pPr>
       <w:r>
         <w:t>The original video files are preserved byte for byte. Some demonstration footage has been sped up; time labels in those frames are not measurements of actual mission duration. The images show the hardware, site and search views. Numerical simulation trajectories and timestamps are stored in simulation/output.</w:t>
       </w:r>
@@ -3915,24 +3704,17 @@
     <w:p>
       <w:pPr>
         <w:pStyle w:val="Heading2"/>
-        <w:widowControl/>
       </w:pPr>
       <w:r>
         <w:t>Source provenance</w:t>
       </w:r>
     </w:p>
     <w:p>
-      <w:pPr>
-        <w:widowControl/>
-      </w:pPr>
       <w:r>
         <w:t>The mobile application, ground station and UAV software originate from the FYP projects and subsequent local revisions. Upstream repository links, remote commit identifiers, local input files and checksums are recorded in records/source_provenance.json. The current implementation is recorded in code/source_revision.json. Remote commits and local revisions are identified separately.</w:t>
       </w:r>
     </w:p>
     <w:p>
-      <w:pPr>
-        <w:widowControl/>
-      </w:pPr>
       <w:r>
         <w:t>The local input revision is WCNC-GPS-FRESHNESS-20260916. The current revision adds route-based trip-time estimation, operator verification before SOS event creation, and equal initial event priority across all three modes. Simulation source and data checksums are also recorded in simulation/verification/source_manifest.json.</w:t>
       </w:r>
@@ -3940,7 +3722,6 @@
     <w:p>
       <w:pPr>
         <w:pStyle w:val="Heading2"/>
-        <w:widowControl/>
       </w:pPr>
       <w:r>
         <w:t>Check archive integrity</w:t>
@@ -3949,21 +3730,18 @@
     <w:p>
       <w:pPr>
         <w:keepLines/>
-        <w:spacing w:before="60" w:after="140" w:line="252" w:lineRule="auto"/>
+        <w:spacing w:before="60" w:after="160"/>
       </w:pPr>
       <w:r>
         <w:rPr>
-          <w:rFonts w:ascii="Liberation Mono" w:hAnsi="Liberation Mono" w:eastAsia="Arial"/>
+          <w:rFonts w:ascii="Consolas" w:hAnsi="Consolas"/>
           <w:color w:val="000000"/>
-          <w:sz w:val="16"/>
+          <w:sz w:val="18"/>
         </w:rPr>
         <w:t>python scripts/check_archive.py</w:t>
       </w:r>
     </w:p>
     <w:p>
-      <w:pPr>
-        <w:widowControl/>
-      </w:pPr>
       <w:r>
         <w:t>This command reads records/file_manifest.json and checks each listed file's SHA-256 checksum and size. If source code, parameters or results are changed, save a new verification record. Preserve the original timestamps and identifiers of existing test outputs.</w:t>
       </w:r>
@@ -3971,18 +3749,99 @@
     <w:p>
       <w:pPr>
         <w:pStyle w:val="Heading2"/>
-        <w:widowControl/>
       </w:pPr>
       <w:r>
         <w:t>References</w:t>
       </w:r>
     </w:p>
     <w:p>
+      <w:r>
+        <w:t>Ordnance Survey's Map Reading guide provides the walking-time reference. Mapzen / Tilezen Skadi provides the elevation tile. The three original FYP GitHub repositories identify the upstream projects. Complete links are in docs/Sources.txt.</w:t>
+      </w:r>
+    </w:p>
+    <w:p>
       <w:pPr>
-        <w:widowControl/>
+        <w:pStyle w:val="Heading1"/>
       </w:pPr>
       <w:r>
-        <w:t>Ordnance Survey's Map Reading guide provides the walking-time reference. Mapzen / Tilezen Skadi provides the elevation tile. The three original FYP GitHub repositories identify the upstream projects. Complete links are in docs/Sources.txt.</w:t>
+        <w:t>9 Implementation and Evidence Index</w:t>
+      </w:r>
+    </w:p>
+    <w:p>
+      <w:r>
+        <w:t>This index follows the 30 September anonymous manuscript. M, G and U use the component abbreviations in Section 1. Paths identify executable source, tests or saved evidence; they do not imply that the current software revision has been deployed on hardware.</w:t>
+      </w:r>
+    </w:p>
+    <w:p>
+      <w:pPr>
+        <w:pStyle w:val="Heading2"/>
+      </w:pPr>
+      <w:r>
+        <w:t>User records and event creation</w:t>
+      </w:r>
+    </w:p>
+    <w:p>
+      <w:r>
+        <w:t>Event Booking is implemented in M/services/eventBookingRecord.ts and M/pages/EventBookingPage.tsx. M/__tests__/eventBookingRecord.test.ts checks the 4 km/h estimate, complete end timestamps and route edits. G/rescue_event_manager.py detects overdue records and manages the contact steps; G/test_rescue_event_manager.py checks the transitions.</w:t>
+      </w:r>
+    </w:p>
+    <w:p>
+      <w:r>
+        <w:t>Quick Start records samples in M/pages/QuickStartPage.tsx and M/services/quickStartSample.ts. G/quick_start_freshness.py uses the latest valid sample time. code/integration_tests/test_quick_start_freshness_contract.py exercises the mobile and ground-station contract, including 0.999 s, 1.000 s and 1.001 s boundary cases. Configure GS_T_LOCATION_UPDATE_SECONDS for deployment.</w:t>
+      </w:r>
+    </w:p>
+    <w:p>
+      <w:r>
+        <w:t>SOS upload and dialing are implemented in M/pages/SosPage.tsx and checked by M/__tests__/SosPage.test.tsx. G/rescue_event_manager.py enforces contact verification and explicit search confirmation. G/test_sos_verification.py checks premature confirmation, cancellation, duplicate handling and unverified legacy events. The SOS instruction change is recorded in records/sos_operator_verification_20260929.json.</w:t>
+      </w:r>
+    </w:p>
+    <w:p>
+      <w:pPr>
+        <w:pStyle w:val="Heading2"/>
+      </w:pPr>
+      <w:r>
+        <w:t>Route preparation and dispatch</w:t>
+      </w:r>
+    </w:p>
+    <w:p>
+      <w:r>
+        <w:t>G/ground_station.py and G/active_event_queue.py implement event selection, preparation, review and confirmed dispatch. G/sos_pattern.py generates the square spiral. G/test_ground_station_rescue_flow.py, G/test_active_event_queue.py and G/test_sos_pattern.py cover these behaviors. code/integration_tests/test_flight_execution_contract.py checks the mission contract across components. GS_T_WAIT_SECONDS controls the common waiting-time rule.</w:t>
+      </w:r>
+    </w:p>
+    <w:p>
+      <w:pPr>
+        <w:pStyle w:val="Heading2"/>
+      </w:pPr>
+      <w:r>
+        <w:t>Mission execution and phone records</w:t>
+      </w:r>
+    </w:p>
+    <w:p>
+      <w:r>
+        <w:t>U/catkin_ws/src/rescue_bridge/src/mqtt_bridge.py receives missions and publishes status; mission_commander.cpp in the same directory advances navigation goals. The test_*.py files there and U/catkin_ws/src/rescue_bridge/test/test_target_lifecycle.cpp test local logic. A ROS build requires the environment in docs/Flight_Environment_Setup.txt.</w:t>
+      </w:r>
+    </w:p>
+    <w:p>
+      <w:r>
+        <w:t>U/drone_system/receiver/phone_sos_receiver.py and G/rescue_record_protocol.py receive, persist, forward and acknowledge records. Their adjacent test files and code/integration_tests/test_phone_uav_groundstation.py check integrity, retries and mission association. experiments/phone_relay_20260928/ and experiments/phone_relay_20260930/ preserve concrete broker-test inputs and outputs.</w:t>
+      </w:r>
+    </w:p>
+    <w:p>
+      <w:pPr>
+        <w:pStyle w:val="Heading2"/>
+      </w:pPr>
+      <w:r>
+        <w:t>Simulation and outdoor evidence</w:t>
+      </w:r>
+    </w:p>
+    <w:p>
+      <w:r>
+        <w:t>simulation/run_three_mode_simulation.m constructs the fixed-seed scenario and full trajectories. simulation/output/ holds inputs, events, execution traces, mission_summary.csv and three_mode_study.mat. simulation/verify_outputs.py checks numeric results against the terrain tile and spiral algorithm. simulation/render_paper_terrain.m renders the manuscript's Figure 4 from saved data. records/figure4_mode_names_20260929.json records the title update without changing trajectories.</w:t>
+      </w:r>
+    </w:p>
+    <w:p>
+      <w:r>
+        <w:t>U/drone_system/launcher/cam_recorder.py saves onboard video; adjacent recording tests cover storage and failure handling. experiments/outdoor/ contains the original videos, hardware photograph and site frames supporting the manuscript's outdoor observations. Images support operator inspection and post-flight review; they do not demonstrate automatic person recognition. Figure 3 in the current manuscript is the hardware image and Figure 5 contains the outdoor observations.</w:t>
       </w:r>
     </w:p>
     <w:sectPr>
@@ -4478,7 +4337,8 @@
     <w:pPr>
       <w:keepNext/>
       <w:keepLines/>
-      <w:spacing w:before="0" w:after="120"/>
+      <w:pageBreakBefore w:val="0"/>
+      <w:spacing w:before="280" w:after="120"/>
       <w:outlineLvl w:val="0"/>
     </w:pPr>
     <w:rPr>
@@ -4502,7 +4362,8 @@
     <w:pPr>
       <w:keepNext/>
       <w:keepLines/>
-      <w:spacing w:before="140" w:after="120"/>
+      <w:pageBreakBefore w:val="0"/>
+      <w:spacing w:before="180" w:after="120"/>
       <w:outlineLvl w:val="1"/>
     </w:pPr>
     <w:rPr>
@@ -4785,9 +4646,6 @@
     <w:qFormat/>
     <w:rsid w:val="00FC693F"/>
     <w:pPr>
-      <w:pBdr>
-        <w:bottom w:val="single" w:sz="8" w:space="4" w:color="4F81BD" w:themeColor="accent1"/>
-      </w:pBdr>
       <w:spacing w:after="120" w:line="240" w:lineRule="auto" w:before="0"/>
       <w:contextualSpacing/>
     </w:pPr>
@@ -5379,9 +5237,6 @@
     <w:qFormat/>
     <w:rsid w:val="00FC693F"/>
     <w:pPr>
-      <w:pBdr>
-        <w:bottom w:val="single" w:sz="4" w:space="4" w:color="4F81BD" w:themeColor="accent1"/>
-      </w:pBdr>
       <w:spacing w:before="200" w:after="280"/>
       <w:ind w:left="936" w:right="936"/>
     </w:pPr>

</xml_diff>

<commit_message>
Align Android recording, mission dispatch and local verification
</commit_message>
<xml_diff>
--- a/docs/Technical_Guide.docx
+++ b/docs/Technical_Guide.docx
@@ -1048,7 +1048,7 @@
     </w:p>
     <w:p>
       <w:r>
-        <w:t>For device operation, fill M/services/db/firebaseConfig.ts with the project's client configuration and use the same Realtime Database URL as the ground station. Configure the native Android or iOS toolchain, platform Firebase files and map credentials separately. From M, npm start starts Metro; npm run android or npm run ios invokes the native platform build. The screenshot and compile-only helpers use stubs and do not produce a verified deployment. Local Jest tests do not establish a new installed application build.</w:t>
+        <w:t>The current mobile source supports Android only. For device operation, fill M/services/db/firebaseConfig.ts with the project's client configuration and use the same Realtime Database URL as the ground station. Configure the Android toolchain, native Firebase files and map credentials separately. From M, npm start starts Metro; npm run android invokes the Android build. The screenshot and compile-only helpers use synthetic configuration. Build and verification results are listed in Android_Only_Validation_20260930.md.</w:t>
       </w:r>
     </w:p>
     <w:p>
@@ -2318,14 +2318,14 @@
         </w:rPr>
         <w:t>run_all('paper')</w:t>
         <w:br/>
-        <w:t>run_all('simulate')</w:t>
+        <w:t>run_all('simulate', fullfile(pwd, '..', 'local-results', 'simulation-01'))</w:t>
         <w:br/>
-        <w:t>run_all('video')</w:t>
+        <w:t>run_all('video', fullfile(pwd, '..', 'local-results', 'video-01'))</w:t>
       </w:r>
     </w:p>
     <w:p>
       <w:r>
-        <w:t>paper redraws the paper figure from saved trajectories into simulation/regenerated/paper. simulate recomputes all modes and replaces files in simulation/output. video replaces animation outputs there and requires ffmpeg. Preserve simulation/output in a separate working copy before simulate or video. The updated renderers use Event Booking, Quick Start and SOS; existing archived outputs retain their original provenance.</w:t>
+        <w:t>paper redraws the paper figure from saved trajectories. Simulation and video regeneration require a new explicit output directory; archived outputs are protected. See simulation/run_all.m for supported modes and output arguments. Video generation requires ffmpeg. The updated renderers use Event Booking, Quick Start and SOS; existing archived outputs retain their original provenance.</w:t>
       </w:r>
     </w:p>
     <w:tbl>
@@ -3139,7 +3139,7 @@
     </w:p>
     <w:p>
       <w:r>
-        <w:t>A synthetic phone record containing an SOS location and GPS data is sent through local HTTP to the UAV receiver. After the receiver saves it, the test sends a matching mission-stage message to trigger forwarding. The ground station validates and saves the received data, then sends an acknowledgement. The UAV uses that acknowledgement to complete the transfer.</w:t>
+        <w:t>The relay bench sends a synthetic phone record containing an SOS location and GPS data through local HTTP to the UAV receiver. After the receiver saves it, the execution manager completes every waypoint and continuous hold, then persists the normal landing request before forwarding. The ground station validates and saves the received data, then sends an acknowledgement. The UAV uses that acknowledgement to complete the transfer.</w:t>
       </w:r>
     </w:p>
     <w:tbl>
@@ -3285,7 +3285,7 @@
                 <w:color w:val="000000"/>
                 <w:sz w:val="19"/>
               </w:rPr>
-              <w:t>Mission stage triggering forwarding and outgoing MQTT envelope</w:t>
+              <w:t>Completed execution authorizing forwarding and outgoing MQTT envelope</w:t>
             </w:r>
           </w:p>
         </w:tc>
@@ -3394,7 +3394,7 @@
     </w:p>
     <w:p>
       <w:r>
-        <w:t>The independent 30 September bench records are in experiments/phone_relay_20260930/. Both benches use synthetic uploads and a real local Mosquitto broker. They do not exercise physical phone association, live Firebase access or ROS flight control.</w:t>
+        <w:t>The independent 30 September bench records are in experiments/phone_relay_20260930/. Both benches use synthetic uploads and a real local Mosquitto broker.</w:t>
       </w:r>
     </w:p>
     <w:p>
@@ -3769,7 +3769,7 @@
     </w:p>
     <w:p>
       <w:r>
-        <w:t>This index follows the 30 September anonymous manuscript. M, G and U use the component abbreviations in Section 1. Paths identify executable source, tests or saved evidence; they do not imply that the current software revision has been deployed on hardware.</w:t>
+        <w:t>This index follows the 30 September anonymous manuscript. M, G and U use the component abbreviations in Section 1. Paths identify source files, tests and saved results.</w:t>
       </w:r>
     </w:p>
     <w:p>
@@ -3787,7 +3787,7 @@
     </w:p>
     <w:p>
       <w:r>
-        <w:t>Quick Start records samples in M/pages/QuickStartPage.tsx and M/services/quickStartSample.ts. G/quick_start_freshness.py uses the latest valid sample time. code/integration_tests/test_quick_start_freshness_contract.py exercises the mobile and ground-station contract, including 0.999 s, 1.000 s and 1.001 s boundary cases. Configure GS_T_LOCATION_UPDATE_SECONDS for deployment.</w:t>
+        <w:t>Quick Start uses the native TrackingService and TrackingStore in M/android/app/src/main/java/com/fypproject/tracking/, with M/services/persistentTracking.ts as the page bridge. G/quick_start_freshness.py uses the latest valid sample time. code/integration_tests/test_quick_start_freshness_contract.py exercises the mobile and ground-station contract, including 0.999 s, 1.000 s and 1.001 s boundary cases. Configure GS_T_LOCATION_UPDATE_SECONDS for deployment.</w:t>
       </w:r>
     </w:p>
     <w:p>

</xml_diff>

<commit_message>
Organize component sources and give diagrams white backgrounds
</commit_message>
<xml_diff>
--- a/docs/Technical_Guide.docx
+++ b/docs/Technical_Guide.docx
@@ -20,7 +20,7 @@
         <w:rPr/>
         <w:t xml:space="preserve">This guide describes setup, system behavior and test materials. See </w:t>
       </w:r>
-      <w:hyperlink r:id="rId11">
+      <w:hyperlink r:id="rId22">
         <w:r>
           <w:rPr>
             <w:color w:val="000000"/>
@@ -32,7 +32,7 @@
         <w:rPr/>
         <w:t xml:space="preserve"> and </w:t>
       </w:r>
-      <w:hyperlink r:id="rId12">
+      <w:hyperlink r:id="rId23">
         <w:r>
           <w:rPr>
             <w:color w:val="000000"/>
@@ -44,7 +44,7 @@
         <w:rPr/>
         <w:t xml:space="preserve"> for implementation and validation summaries; the corresponding </w:t>
       </w:r>
-      <w:hyperlink r:id="rId13">
+      <w:hyperlink r:id="rId24">
         <w:r>
           <w:rPr>
             <w:color w:val="000000"/>
@@ -56,7 +56,7 @@
         <w:rPr/>
         <w:t xml:space="preserve"> and </w:t>
       </w:r>
-      <w:hyperlink r:id="rId14">
+      <w:hyperlink r:id="rId25">
         <w:r>
           <w:rPr>
             <w:color w:val="000000"/>
@@ -85,7 +85,7 @@
     <w:p>
       <w:r>
         <w:rPr/>
-        <w:t>Mountain Search UAV System | Technical Guide | 30 September 2026</w:t>
+        <w:t>Mountain Search UAV System | Technical Guide | 1 October 2026</w:t>
         <w:br/>
         <w:t>Implementation baseline: UAV-SEARCH-20260928</w:t>
       </w:r>
@@ -223,7 +223,55 @@
                 <w:b w:val="0"/>
                 <w:sz w:val="19"/>
               </w:rPr>
-              <w:t>Three software components, integration tests and configuration checks</w:t>
+              <w:t>Mobile application, ground station and onboard UAV software</w:t>
+            </w:r>
+          </w:p>
+        </w:tc>
+      </w:tr>
+      <w:tr>
+        <w:tc>
+          <w:tcPr>
+            <w:tcW w:type="dxa" w:w="3528"/>
+            <w:tcMar>
+              <w:top w:w="70" w:type="dxa"/>
+              <w:left w:w="70" w:type="dxa"/>
+              <w:bottom w:w="70" w:type="dxa"/>
+              <w:right w:w="70" w:type="dxa"/>
+            </w:tcMar>
+          </w:tcPr>
+          <w:p>
+            <w:pPr>
+              <w:spacing w:after="40" w:before="40"/>
+            </w:pPr>
+            <w:r>
+              <w:rPr>
+                <w:b w:val="0"/>
+                <w:sz w:val="19"/>
+              </w:rPr>
+              <w:t>verification/</w:t>
+            </w:r>
+          </w:p>
+        </w:tc>
+        <w:tc>
+          <w:tcPr>
+            <w:tcW w:type="dxa" w:w="6624"/>
+            <w:tcMar>
+              <w:top w:w="70" w:type="dxa"/>
+              <w:left w:w="70" w:type="dxa"/>
+              <w:bottom w:w="70" w:type="dxa"/>
+              <w:right w:w="70" w:type="dxa"/>
+            </w:tcMar>
+          </w:tcPr>
+          <w:p>
+            <w:pPr>
+              <w:spacing w:after="40" w:before="40"/>
+            </w:pPr>
+            <w:r>
+              <w:rPr>
+                <w:b w:val="0"/>
+                <w:sz w:val="19"/>
+              </w:rPr>
+              <w:t>Automated checks, validation reports and saved run records</w:t>
             </w:r>
           </w:p>
         </w:tc>
@@ -296,7 +344,7 @@
                 <w:b w:val="0"/>
                 <w:sz w:val="19"/>
               </w:rPr>
-              <w:t>experiments/phone_relay_20260928/</w:t>
+              <w:t>verification/records/phone_relay/</w:t>
             </w:r>
           </w:p>
         </w:tc>
@@ -344,7 +392,7 @@
                 <w:b w:val="0"/>
                 <w:sz w:val="19"/>
               </w:rPr>
-              <w:t>experiments/outdoor/</w:t>
+              <w:t>docs/assets/outdoor/</w:t>
             </w:r>
           </w:p>
         </w:tc>
@@ -392,7 +440,7 @@
                 <w:b w:val="0"/>
                 <w:sz w:val="19"/>
               </w:rPr>
-              <w:t>records/</w:t>
+              <w:t>verification/records/</w:t>
             </w:r>
           </w:p>
         </w:tc>
@@ -580,7 +628,7 @@
     <w:p>
       <w:r>
         <w:rPr/>
-        <w:t>Application and protocol version numbers are retained. The implementation baseline is recorded in code/source_revision.json; Git history identifies later changes. The software retains its English and Chinese interface options. Section 9 maps the manuscript's functions to implementation and evidence.</w:t>
+        <w:t>Application and protocol version numbers are retained. The implementation baseline is recorded in verification/source_revision.json; Git history identifies later changes. The software retains its English and Chinese interface options. Section 9 maps the manuscript's functions to implementation and evidence.</w:t>
       </w:r>
     </w:p>
     <w:p>
@@ -629,9 +677,9 @@
         <w:br/>
         <w:t>source .venv/bin/activate</w:t>
         <w:br/>
-        <w:t>python -m pip install -r requirements-verification.txt</w:t>
+        <w:t>python -m pip install -r verification/requirements.txt</w:t>
         <w:br/>
-        <w:t>python scripts/prepare_local.py</w:t>
+        <w:t>python verification/tools/prepare_local.py</w:t>
       </w:r>
     </w:p>
     <w:p>
@@ -687,7 +735,7 @@
           <w:rFonts w:ascii="Consolas" w:hAnsi="Consolas"/>
           <w:sz w:val="18"/>
         </w:rPr>
-        <w:t>python scripts/verify.py --output local-results/verification-01</w:t>
+        <w:t>python verification/run.py --output local-results/verification-01</w:t>
       </w:r>
     </w:p>
     <w:p>
@@ -699,7 +747,7 @@
     <w:p>
       <w:r>
         <w:rPr/>
-        <w:t>prepare_local.py creates M/services/db/firebaseConfig.ts from the example only when the local file is absent. Its placeholder values configure the mocked cloud connections used by the test runner. A direct call to python simulation/verify_outputs.py prints its findings without writing a report. Add --output followed by a new JSON path to save a report; an existing report is rejected.</w:t>
+        <w:t>prepare_local.py creates M/src/services/db/firebaseConfig.ts from the example only when the local file is absent. Its placeholder values configure the mocked cloud connections used by the test runner. A direct call to python simulation/verify_outputs.py prints its findings without writing a report. Add --output followed by a new JSON path to save a report; an existing report is rejected.</w:t>
       </w:r>
     </w:p>
     <w:p>
@@ -731,7 +779,7 @@
           <w:rFonts w:ascii="Consolas" w:hAnsi="Consolas"/>
           <w:sz w:val="18"/>
         </w:rPr>
-        <w:t>python code/integration_tests/run_phone_uav_gs_bench.py \</w:t>
+        <w:t>python verification/integration/run_phone_uav_gs_bench.py \</w:t>
         <w:br/>
         <w:t xml:space="preserve">  --output local-results/phone-relay-01</w:t>
       </w:r>
@@ -1248,7 +1296,7 @@
     <w:p>
       <w:r>
         <w:rPr/>
-        <w:t xml:space="preserve">Implementation: M/services/eventBookingRecord.ts. Booking interface: M/pages/EventBookingPage.tsx. Tests: </w:t>
+        <w:t xml:space="preserve">Implementation: M/src/services/eventBookingRecord.ts. Booking interface: M/src/pages/EventBookingPage.tsx. Tests: </w:t>
       </w:r>
       <w:r>
         <w:rPr>
@@ -1284,9 +1332,9 @@
     <w:p>
       <w:r>
         <w:rPr/>
-        <w:t xml:space="preserve">The current mobile source supports Android only. For device operation, fill M/services/db/firebaseConfig.ts with the project's client configuration and use the same Realtime Database URL as the ground station. Configure the Android toolchain, native Firebase files and map credentials separately. From M, npm start starts Metro; npm run android invokes the Android build. The Android compile-only helper uses synthetic configuration. Build and verification results are listed in </w:t>
+        <w:t xml:space="preserve">The current mobile source supports Android only. For device operation, fill M/src/services/db/firebaseConfig.ts with the project's client configuration and use the same Realtime Database URL as the ground station. Configure the Android toolchain, native Firebase files and map credentials separately. From M, npm start starts Metro; npm run android invokes the Android build. The Android compile-only helper uses synthetic configuration. Build and verification results are listed in </w:t>
       </w:r>
-      <w:hyperlink r:id="rId12">
+      <w:hyperlink r:id="rId23">
         <w:r>
           <w:rPr>
             <w:color w:val="000000"/>
@@ -1777,7 +1825,7 @@
                 <w:b w:val="0"/>
                 <w:sz w:val="19"/>
               </w:rPr>
-              <w:t>Shared service address and port; see G/runtime.env.example</w:t>
+              <w:t>Shared service address and port; see G/config/runtime.env.example</w:t>
             </w:r>
           </w:p>
         </w:tc>
@@ -1791,13 +1839,13 @@
     <w:p>
       <w:r>
         <w:rPr/>
-        <w:t>Use G/runtime.env.example as the template. Supply and export the actual values, then run python ground_station.py from G. Both threshold fields are blank in the template. The 1-second GPS threshold in the tests checks time-boundary behavior.</w:t>
+        <w:t>Use G/config/runtime.env.example as the template. Supply and export the actual values, then run python main.py from G. Both threshold fields are blank in the template. The 1-second GPS threshold in the tests checks time-boundary behavior.</w:t>
       </w:r>
     </w:p>
     <w:p>
       <w:r>
         <w:rPr/>
-        <w:t>Copy the template to G/runtime.env and fill it locally before running the following commands from the archive root. The application reads exported environment variables; it does not automatically load runtime.env.</w:t>
+        <w:t>Copy the template to G/config/runtime.env and fill it locally before running the following commands from the archive root. The application reads exported environment variables; it does not automatically load runtime.env.</w:t>
       </w:r>
     </w:p>
     <w:p>
@@ -1812,15 +1860,15 @@
         </w:rPr>
         <w:t>set -a</w:t>
         <w:br/>
-        <w:t>. ./code/ground_station/runtime.env</w:t>
+        <w:t>. ./code/ground_station/config/runtime.env</w:t>
         <w:br/>
         <w:t>set +a</w:t>
         <w:br/>
-        <w:t>python code/deployment_preflight.py</w:t>
+        <w:t>python verification/tools/deployment_preflight.py</w:t>
         <w:br/>
         <w:t>cd code/ground_station</w:t>
         <w:br/>
-        <w:t>python ground_station.py</w:t>
+        <w:t>python main.py</w:t>
       </w:r>
     </w:p>
     <w:p>
@@ -1832,7 +1880,7 @@
     <w:p>
       <w:r>
         <w:rPr/>
-        <w:t>Verification logic: G/rescue_event_manager.py. Persistence and mission preparation: G/rescue_repository.py, G/active_event_queue.py and G/ground_station.py.</w:t>
+        <w:t>Verification logic: G/src/rescue_event_manager.py. Persistence and mission preparation: G/src/rescue_repository.py, G/src/active_event_queue.py and G/src/ground_station.py.</w:t>
       </w:r>
     </w:p>
     <w:p>
@@ -3219,7 +3267,7 @@
         <w:rPr/>
         <w:t xml:space="preserve">The </w:t>
       </w:r>
-      <w:hyperlink r:id="rId16">
+      <w:hyperlink r:id="rId26">
         <w:r>
           <w:rPr>
             <w:color w:val="000000"/>
@@ -3229,19 +3277,19 @@
       </w:hyperlink>
       <w:r>
         <w:rPr/>
-        <w:t xml:space="preserve"> lists the Android release checks. The software-test table below describes the saved run in records/.</w:t>
+        <w:t xml:space="preserve"> lists the Android release checks. The software-test table below describes the saved run in verification/records/.</w:t>
       </w:r>
     </w:p>
     <w:p>
       <w:r>
         <w:rPr/>
-        <w:t>Verification ran on 28 September 2026 using macOS arm64, Python 3.12.14 and Node.js 24.19.0. Detailed results are in records/software.log and records/verification_summary.json.</w:t>
+        <w:t>Verification ran on 28 September 2026 using macOS arm64, Python 3.12.14 and Node.js 24.19.0. Detailed results are in verification/records/software.log and verification/records/verification_summary.json.</w:t>
       </w:r>
     </w:p>
     <w:p>
       <w:r>
         <w:rPr/>
-        <w:t>The 30 September rerun is recorded separately in records/verification_20260930/. Selected component results are listed below. The run also passed three verification-output regression tests and 53 saved-simulation checks. The original protocol fixture from 9 September is now included at G/fixtures/capture_record_v2.json, so its six ground-station tests no longer depend on a file outside this repository. The archived software logs contain selected output for retained components and keep the original run dates.</w:t>
+        <w:t>The 30 September rerun is recorded separately in verification/records/verification_20260930/. Selected component results are listed below. The run also passed three verification-output regression tests and 53 saved-simulation checks. The original protocol fixture from 9 September is now included at G/tests/fixtures/capture_record_v2.json, so its six ground-station tests no longer depend on a file outside this repository. The archived software logs contain selected output for retained components and keep the original run dates.</w:t>
       </w:r>
     </w:p>
     <w:tbl>
@@ -3633,7 +3681,7 @@
         <w:rPr/>
         <w:t xml:space="preserve">The </w:t>
       </w:r>
-      <w:hyperlink r:id="rId17">
+      <w:hyperlink r:id="rId27">
         <w:r>
           <w:rPr>
             <w:color w:val="000000"/>
@@ -3930,7 +3978,7 @@
     <w:p>
       <w:r>
         <w:rPr/>
-        <w:t>The 30 September relay records are in experiments/phone_relay_20260930/. The relay runs use synthetic uploads and a Mosquitto broker.</w:t>
+        <w:t>The 30 September relay records are in verification/records/phone_relay/20260930/. The relay runs use synthetic uploads and a Mosquitto broker.</w:t>
       </w:r>
     </w:p>
     <w:p>
@@ -4256,7 +4304,7 @@
                 <w:b/>
                 <w:sz w:val="19"/>
               </w:rPr>
-              <w:t>File in experiments/outdoor/</w:t>
+              <w:t>File in docs/assets/outdoor/</w:t>
             </w:r>
           </w:p>
         </w:tc>
@@ -4553,7 +4601,7 @@
     <w:p>
       <w:r>
         <w:rPr/>
-        <w:t>The mobile application, ground station and UAV software originate from the FYP projects and subsequent local revisions. Upstream repository links, remote commit identifiers, local input files and checksums are recorded in records/source_provenance.json. The current implementation is recorded in code/source_revision.json. Remote commits and local revisions are identified separately.</w:t>
+        <w:t>The mobile application, ground station and UAV software originate from the FYP projects and subsequent local revisions. Upstream repository links, remote commit identifiers, local input files and checksums are recorded in verification/records/source_provenance.json. The current implementation is recorded in verification/source_revision.json. Remote commits and local revisions are identified separately.</w:t>
       </w:r>
     </w:p>
     <w:p>
@@ -4585,13 +4633,13 @@
           <w:rFonts w:ascii="Consolas" w:hAnsi="Consolas"/>
           <w:sz w:val="18"/>
         </w:rPr>
-        <w:t>python scripts/check_archive.py</w:t>
+        <w:t>python verification/tools/check_archive.py</w:t>
       </w:r>
     </w:p>
     <w:p>
       <w:r>
         <w:rPr/>
-        <w:t>This command reads records/file_manifest.json and checks each listed file's SHA-256 checksum and size. If source code, parameters or results are changed, save a new verification record. Preserve the original timestamps and identifiers of existing test outputs.</w:t>
+        <w:t>This command reads verification/records/file_manifest.json and checks each listed file's SHA-256 checksum and size. If source code, parameters or results are changed, save a new verification record. Preserve the original timestamps and identifiers of existing test outputs.</w:t>
       </w:r>
     </w:p>
     <w:p>
@@ -4648,7 +4696,7 @@
     <w:p>
       <w:r>
         <w:rPr/>
-        <w:t xml:space="preserve">Event Booking is implemented in M/services/eventBookingRecord.ts and M/pages/EventBookingPage.tsx. </w:t>
+        <w:t xml:space="preserve">Event Booking is implemented in M/src/services/eventBookingRecord.ts and M/src/pages/EventBookingPage.tsx. </w:t>
       </w:r>
       <w:r>
         <w:rPr>
@@ -4659,19 +4707,19 @@
       </w:r>
       <w:r>
         <w:rPr/>
-        <w:t xml:space="preserve"> checks the 4 km/h estimate, complete end timestamps and route edits. G/rescue_event_manager.py detects overdue records and manages the contact steps; G/test_rescue_event_manager.py checks the transitions.</w:t>
+        <w:t xml:space="preserve"> checks the 4 km/h estimate, complete end timestamps and route edits. G/src/rescue_event_manager.py detects overdue records and manages the contact steps; G/tests/test_rescue_event_manager.py checks the transitions.</w:t>
       </w:r>
     </w:p>
     <w:p>
       <w:r>
         <w:rPr/>
-        <w:t>Quick Start uses M/pages/AndroidQuickStartPage.tsx and M/services/persistentTracking.ts. The native TrackingService, TrackingStore and TrackingCore in M/android/app/src/main/java/com/fypproject/tracking/ collect and persist samples. G/quick_start_freshness.py uses the latest valid sample time. code/integration_tests/test_quick_start_freshness_contract.py compiles the production Kotlin gate and exercises the mobile and ground-station contract, including 0.999 s, 1.000 s and 1.001 s boundary cases. Configure GS_T_LOCATION_UPDATE_SECONDS for deployment.</w:t>
+        <w:t>Quick Start uses M/src/pages/AndroidQuickStartPage.tsx and M/src/services/persistentTracking.ts. The native TrackingService, TrackingStore and TrackingCore in M/android/app/src/main/java/com/fypproject/tracking/ collect and persist samples. G/src/quick_start_freshness.py uses the latest valid sample time. verification/integration/test_quick_start_freshness_contract.py compiles the production Kotlin gate and exercises the mobile and ground-station contract, including 0.999 s, 1.000 s and 1.001 s boundary cases. Configure GS_T_LOCATION_UPDATE_SECONDS for deployment.</w:t>
       </w:r>
     </w:p>
     <w:p>
       <w:r>
         <w:rPr/>
-        <w:t xml:space="preserve">SOS upload and dialing are implemented in M/pages/SosPage.tsx and checked by </w:t>
+        <w:t xml:space="preserve">SOS upload and dialing are implemented in M/src/pages/SosPage.tsx and checked by </w:t>
       </w:r>
       <w:r>
         <w:rPr>
@@ -4682,7 +4730,7 @@
       </w:r>
       <w:r>
         <w:rPr/>
-        <w:t>. G/rescue_event_manager.py enforces contact verification and explicit search confirmation. G/test_sos_verification.py checks premature confirmation, cancellation, duplicate handling and unverified legacy events. The SOS instruction change is recorded in records/sos_operator_verification_20260929.json.</w:t>
+        <w:t>. G/src/rescue_event_manager.py enforces contact verification and explicit search confirmation. G/tests/test_sos_verification.py checks premature confirmation, cancellation, duplicate handling and unverified legacy events. The SOS instruction change is recorded in verification/records/sos_operator_verification_20260929.json.</w:t>
       </w:r>
     </w:p>
     <w:p>
@@ -4701,7 +4749,7 @@
     <w:p>
       <w:r>
         <w:rPr/>
-        <w:t>G/ground_station.py and G/active_event_queue.py implement event selection, preparation, review and confirmed dispatch. G/sos_pattern.py generates the square spiral. G/test_ground_station_rescue_flow.py, G/test_active_event_queue.py and G/test_sos_pattern.py cover these behaviors. code/integration_tests/test_flight_execution_contract.py checks the mission contract across components. GS_T_WAIT_SECONDS controls the common waiting-time rule.</w:t>
+        <w:t>G/src/ground_station.py and G/src/active_event_queue.py implement event selection, preparation, review and confirmed dispatch. G/src/sos_pattern.py generates the square spiral. G/tests/test_ground_station_rescue_flow.py, G/tests/test_active_event_queue.py and G/tests/test_sos_pattern.py cover these behaviors. verification/integration/test_flight_execution_contract.py checks the mission contract across components. GS_T_WAIT_SECONDS controls the common waiting-time rule.</w:t>
       </w:r>
     </w:p>
     <w:p>
@@ -4726,7 +4774,7 @@
     <w:p>
       <w:r>
         <w:rPr/>
-        <w:t>U/drone_system/receiver/phone_sos_receiver.py and G/rescue_record_protocol.py receive, persist, forward and acknowledge records. Their adjacent test files and code/integration_tests/test_phone_uav_groundstation.py check integrity, retries and mission association. experiments/phone_relay_20260928/ and experiments/phone_relay_20260930/ preserve concrete broker-test inputs and outputs.</w:t>
+        <w:t>U/drone_system/receiver/phone_sos_receiver.py and G/src/rescue_record_protocol.py receive, persist, forward and acknowledge records. The receiver tests, ground-station tests in G/tests/ and verification/integration/test_phone_uav_groundstation.py check integrity, retries and mission association. verification/records/phone_relay/20260928/ and verification/records/phone_relay/20260930/ preserve concrete broker-test inputs and outputs.</w:t>
       </w:r>
     </w:p>
     <w:p>
@@ -4745,13 +4793,13 @@
     <w:p>
       <w:r>
         <w:rPr/>
-        <w:t>simulation/run_three_mode_simulation.m constructs the fixed-seed scenario and full trajectories. simulation/output/ holds inputs, events, execution traces, mission_summary.csv and three_mode_study.mat. simulation/verify_outputs.py checks numeric results against the terrain tile and spiral algorithm. simulation/render_paper_terrain.m renders the manuscript's Figure 4 from saved data. records/figure4_mode_names_20260929.json records the title update without changing trajectories.</w:t>
+        <w:t>simulation/run_three_mode_simulation.m constructs the fixed-seed scenario and full trajectories. simulation/output/ holds inputs, events, execution traces, mission_summary.csv and three_mode_study.mat. simulation/verify_outputs.py checks numeric results against the terrain tile and spiral algorithm. simulation/render_paper_terrain.m renders the manuscript's Figure 4 from saved data. verification/records/figure4_mode_names_20260929.json records the title update without changing trajectories.</w:t>
       </w:r>
     </w:p>
     <w:p>
       <w:r>
         <w:rPr/>
-        <w:t>U/drone_system/launcher/cam_recorder.py saves onboard video; adjacent recording tests cover storage and failure handling. experiments/outdoor/ contains the original videos, hardware photograph and site frames supporting the manuscript's outdoor observations. Images support operator inspection and post-flight review. Figure 3 in the current manuscript is the hardware image and Figure 5 contains the outdoor observations.</w:t>
+        <w:t>U/drone_system/launcher/cam_recorder.py saves onboard video; adjacent recording tests cover storage and failure handling. docs/assets/outdoor/ contains the original videos, hardware photograph and site frames supporting the manuscript's outdoor observations. Images support operator inspection and post-flight review. Figure 3 in the current manuscript is the hardware image and Figure 5 contains the outdoor observations.</w:t>
       </w:r>
     </w:p>
     <w:sectPr>

</xml_diff>

<commit_message>
Keep internal verification materials outside the published project
</commit_message>
<xml_diff>
--- a/docs/Technical_Guide.docx
+++ b/docs/Technical_Guide.docx
@@ -18,55 +18,7 @@
     <w:p>
       <w:r>
         <w:rPr/>
-        <w:t xml:space="preserve">This guide describes setup, system behavior and test materials. See </w:t>
-      </w:r>
-      <w:hyperlink r:id="rId22">
-        <w:r>
-          <w:rPr>
-            <w:color w:val="000000"/>
-          </w:rPr>
-          <w:t>paper alignment</w:t>
-        </w:r>
-      </w:hyperlink>
-      <w:r>
-        <w:rPr/>
-        <w:t xml:space="preserve"> and </w:t>
-      </w:r>
-      <w:hyperlink r:id="rId23">
-        <w:r>
-          <w:rPr>
-            <w:color w:val="000000"/>
-          </w:rPr>
-          <w:t>Android validation</w:t>
-        </w:r>
-      </w:hyperlink>
-      <w:r>
-        <w:rPr/>
-        <w:t xml:space="preserve"> for implementation and validation summaries; the corresponding </w:t>
-      </w:r>
-      <w:hyperlink r:id="rId24">
-        <w:r>
-          <w:rPr>
-            <w:color w:val="000000"/>
-          </w:rPr>
-          <w:t>paper-alignment JSON</w:t>
-        </w:r>
-      </w:hyperlink>
-      <w:r>
-        <w:rPr/>
-        <w:t xml:space="preserve"> and </w:t>
-      </w:r>
-      <w:hyperlink r:id="rId25">
-        <w:r>
-          <w:rPr>
-            <w:color w:val="000000"/>
-          </w:rPr>
-          <w:t>Android JSON</w:t>
-        </w:r>
-      </w:hyperlink>
-      <w:r>
-        <w:rPr/>
-        <w:t xml:space="preserve"> contain result counts and source snapshot identifiers.</w:t>
+        <w:t>This guide explains how to set up and operate the Android mobile application, Windows ground station and onboard UAV software. It also describes the three-mode MATLAB simulation, saved results and original system imagery.</w:t>
       </w:r>
     </w:p>
     <w:p>
@@ -79,7 +31,7 @@
           <w:b/>
           <w:color w:val="000000"/>
         </w:rPr>
-        <w:t>1  Archive Contents and Version</w:t>
+        <w:t>1  Project Contents</w:t>
       </w:r>
     </w:p>
     <w:p>
@@ -93,7 +45,7 @@
     <w:p>
       <w:r>
         <w:rPr/>
-        <w:t>This archive contains the mobile application, ground station and UAV source code, together with MATLAB simulations of the three search modes, software verification records and outdoor footage. All paths in this guide are relative to the archive root.</w:t>
+        <w:t>This archive contains the mobile application, ground station and UAV source code, together with MATLAB simulations of the three search modes and outdoor footage. All paths in this guide are relative to the archive root.</w:t>
       </w:r>
     </w:p>
     <w:p>
@@ -248,54 +200,6 @@
                 <w:b w:val="0"/>
                 <w:sz w:val="19"/>
               </w:rPr>
-              <w:t>verification/</w:t>
-            </w:r>
-          </w:p>
-        </w:tc>
-        <w:tc>
-          <w:tcPr>
-            <w:tcW w:type="dxa" w:w="6624"/>
-            <w:tcMar>
-              <w:top w:w="70" w:type="dxa"/>
-              <w:left w:w="70" w:type="dxa"/>
-              <w:bottom w:w="70" w:type="dxa"/>
-              <w:right w:w="70" w:type="dxa"/>
-            </w:tcMar>
-          </w:tcPr>
-          <w:p>
-            <w:pPr>
-              <w:spacing w:after="40" w:before="40"/>
-            </w:pPr>
-            <w:r>
-              <w:rPr>
-                <w:b w:val="0"/>
-                <w:sz w:val="19"/>
-              </w:rPr>
-              <w:t>Automated checks, validation reports and saved run records</w:t>
-            </w:r>
-          </w:p>
-        </w:tc>
-      </w:tr>
-      <w:tr>
-        <w:tc>
-          <w:tcPr>
-            <w:tcW w:type="dxa" w:w="3528"/>
-            <w:tcMar>
-              <w:top w:w="70" w:type="dxa"/>
-              <w:left w:w="70" w:type="dxa"/>
-              <w:bottom w:w="70" w:type="dxa"/>
-              <w:right w:w="70" w:type="dxa"/>
-            </w:tcMar>
-          </w:tcPr>
-          <w:p>
-            <w:pPr>
-              <w:spacing w:after="40" w:before="40"/>
-            </w:pPr>
-            <w:r>
-              <w:rPr>
-                <w:b w:val="0"/>
-                <w:sz w:val="19"/>
-              </w:rPr>
               <w:t>simulation/</w:t>
             </w:r>
           </w:p>
@@ -344,54 +248,6 @@
                 <w:b w:val="0"/>
                 <w:sz w:val="19"/>
               </w:rPr>
-              <w:t>verification/records/phone_relay/</w:t>
-            </w:r>
-          </w:p>
-        </w:tc>
-        <w:tc>
-          <w:tcPr>
-            <w:tcW w:type="dxa" w:w="6624"/>
-            <w:tcMar>
-              <w:top w:w="70" w:type="dxa"/>
-              <w:left w:w="70" w:type="dxa"/>
-              <w:bottom w:w="70" w:type="dxa"/>
-              <w:right w:w="70" w:type="dxa"/>
-            </w:tcMar>
-          </w:tcPr>
-          <w:p>
-            <w:pPr>
-              <w:spacing w:after="40" w:before="40"/>
-            </w:pPr>
-            <w:r>
-              <w:rPr>
-                <w:b w:val="0"/>
-                <w:sz w:val="19"/>
-              </w:rPr>
-              <w:t>Inputs and results from the local phone-record relay test</w:t>
-            </w:r>
-          </w:p>
-        </w:tc>
-      </w:tr>
-      <w:tr>
-        <w:tc>
-          <w:tcPr>
-            <w:tcW w:type="dxa" w:w="3528"/>
-            <w:tcMar>
-              <w:top w:w="70" w:type="dxa"/>
-              <w:left w:w="70" w:type="dxa"/>
-              <w:bottom w:w="70" w:type="dxa"/>
-              <w:right w:w="70" w:type="dxa"/>
-            </w:tcMar>
-          </w:tcPr>
-          <w:p>
-            <w:pPr>
-              <w:spacing w:after="40" w:before="40"/>
-            </w:pPr>
-            <w:r>
-              <w:rPr>
-                <w:b w:val="0"/>
-                <w:sz w:val="19"/>
-              </w:rPr>
               <w:t>docs/assets/outdoor/</w:t>
             </w:r>
           </w:p>
@@ -416,54 +272,6 @@
                 <w:sz w:val="19"/>
               </w:rPr>
               <w:t>Original outdoor footage, ground-station footage and images</w:t>
-            </w:r>
-          </w:p>
-        </w:tc>
-      </w:tr>
-      <w:tr>
-        <w:tc>
-          <w:tcPr>
-            <w:tcW w:type="dxa" w:w="3528"/>
-            <w:tcMar>
-              <w:top w:w="70" w:type="dxa"/>
-              <w:left w:w="70" w:type="dxa"/>
-              <w:bottom w:w="70" w:type="dxa"/>
-              <w:right w:w="70" w:type="dxa"/>
-            </w:tcMar>
-          </w:tcPr>
-          <w:p>
-            <w:pPr>
-              <w:spacing w:after="40" w:before="40"/>
-            </w:pPr>
-            <w:r>
-              <w:rPr>
-                <w:b w:val="0"/>
-                <w:sz w:val="19"/>
-              </w:rPr>
-              <w:t>verification/records/</w:t>
-            </w:r>
-          </w:p>
-        </w:tc>
-        <w:tc>
-          <w:tcPr>
-            <w:tcW w:type="dxa" w:w="6624"/>
-            <w:tcMar>
-              <w:top w:w="70" w:type="dxa"/>
-              <w:left w:w="70" w:type="dxa"/>
-              <w:bottom w:w="70" w:type="dxa"/>
-              <w:right w:w="70" w:type="dxa"/>
-            </w:tcMar>
-          </w:tcPr>
-          <w:p>
-            <w:pPr>
-              <w:spacing w:after="40" w:before="40"/>
-            </w:pPr>
-            <w:r>
-              <w:rPr>
-                <w:b w:val="0"/>
-                <w:sz w:val="19"/>
-              </w:rPr>
-              <w:t>Verification logs, source provenance and file checksums</w:t>
             </w:r>
           </w:p>
         </w:tc>
@@ -628,7 +436,7 @@
     <w:p>
       <w:r>
         <w:rPr/>
-        <w:t>Application and protocol version numbers are retained. The implementation baseline is recorded in verification/source_revision.json; Git history identifies later changes. The software retains its English and Chinese interface options. Section 9 maps the manuscript's functions to implementation and evidence.</w:t>
+        <w:t>The software retains its English and Chinese interface options. Section 8 maps the system functions to their implementation files.</w:t>
       </w:r>
     </w:p>
     <w:p>
@@ -641,13 +449,13 @@
           <w:b/>
           <w:color w:val="000000"/>
         </w:rPr>
-        <w:t>2  Local Setup and Verification</w:t>
+        <w:t>2  Component Setup</w:t>
       </w:r>
     </w:p>
     <w:p>
       <w:r>
         <w:rPr/>
-        <w:t>Use Python 3.12 with Tk support, Node.js 24 and a C++14 compiler for local verification. MATLAB R2025b was used for the archived simulation; MATLAB is not required to check the saved numeric outputs. Run the following commands from the archive root.</w:t>
+        <w:t>Use Node.js 24 and the Android SDK/JDK for the mobile application, Python 3.12 with Tk support on Windows for the ground station, and Ubuntu 20.04 with ROS Noetic for the UAV. MATLAB R2025b was used for the saved simulation.</w:t>
       </w:r>
     </w:p>
     <w:p>
@@ -660,7 +468,44 @@
           <w:b/>
           <w:color w:val="000000"/>
         </w:rPr>
-        <w:t>Create the Python environment</w:t>
+        <w:t>Android application</w:t>
+      </w:r>
+    </w:p>
+    <w:p>
+      <w:r>
+        <w:rPr/>
+        <w:t xml:space="preserve">From code/mobile_application, install the locked dependencies with npm ci. Copy src/services/db/firebaseConfig.example.ts to src/services/db/firebaseConfig.ts and fill the deployment values. Supply the native Android service configuration and map credentials. Start Metro with npm start and run npm run android in another terminal. The </w:t>
+      </w:r>
+      <w:hyperlink r:id="rId11">
+        <w:r>
+          <w:rPr>
+            <w:color w:val="000000"/>
+          </w:rPr>
+          <w:t>mobile guide</w:t>
+        </w:r>
+      </w:hyperlink>
+      <w:r>
+        <w:rPr/>
+        <w:t xml:space="preserve"> describes the project structure and setup.</w:t>
+      </w:r>
+    </w:p>
+    <w:p>
+      <w:pPr>
+        <w:pStyle w:val="Heading2"/>
+        <w:keepNext/>
+      </w:pPr>
+      <w:r>
+        <w:rPr>
+          <w:b/>
+          <w:color w:val="000000"/>
+        </w:rPr>
+        <w:t>Windows ground station</w:t>
+      </w:r>
+    </w:p>
+    <w:p>
+      <w:r>
+        <w:rPr/>
+        <w:t>From the repository root in PowerShell, create and activate a Python environment:</w:t>
       </w:r>
     </w:p>
     <w:p>
@@ -673,13 +518,17 @@
           <w:rFonts w:ascii="Consolas" w:hAnsi="Consolas"/>
           <w:sz w:val="18"/>
         </w:rPr>
-        <w:t>python3.12 -m venv .venv</w:t>
+        <w:t>py -3.12 -m venv .venv</w:t>
         <w:br/>
-        <w:t>source .venv/bin/activate</w:t>
+        <w:t>.\.venv\Scripts\Activate.ps1</w:t>
         <w:br/>
-        <w:t>python -m pip install -r verification/requirements.txt</w:t>
-        <w:br/>
-        <w:t>python verification/tools/prepare_local.py</w:t>
+        <w:t>python -m pip install -r code\ground_station\requirements.txt</w:t>
+      </w:r>
+    </w:p>
+    <w:p>
+      <w:r>
+        <w:rPr/>
+        <w:t>Fill code/ground_station/config/runtime.env using the adjacent example, then export its settings before launching the application. Section 4 gives the runtime settings and launch commands. To produce the executable, install code/ground_station/packaging/requirements-build.txt and run code/ground_station/packaging/build_windows_release.ps1.</w:t>
       </w:r>
     </w:p>
     <w:p>
@@ -692,108 +541,25 @@
           <w:b/>
           <w:color w:val="000000"/>
         </w:rPr>
-        <w:t>Install mobile dependencies</w:t>
-      </w:r>
-    </w:p>
-    <w:p>
-      <w:pPr>
-        <w:pStyle w:val="NoSpacing"/>
-        <w:spacing w:before="40" w:after="100"/>
-      </w:pPr>
-      <w:r>
-        <w:rPr>
-          <w:rFonts w:ascii="Consolas" w:hAnsi="Consolas"/>
-          <w:sz w:val="18"/>
-        </w:rPr>
-        <w:t>cd code/mobile_application</w:t>
-        <w:br/>
-        <w:t>npm ci</w:t>
-        <w:br/>
-        <w:t>cd ../..</w:t>
-      </w:r>
-    </w:p>
-    <w:p>
-      <w:pPr>
-        <w:pStyle w:val="Heading2"/>
-        <w:keepNext/>
-      </w:pPr>
-      <w:r>
-        <w:rPr>
-          <w:b/>
-          <w:color w:val="000000"/>
-        </w:rPr>
-        <w:t>Run the complete verification sequence</w:t>
-      </w:r>
-    </w:p>
-    <w:p>
-      <w:pPr>
-        <w:pStyle w:val="NoSpacing"/>
-        <w:spacing w:before="40" w:after="100"/>
-      </w:pPr>
-      <w:r>
-        <w:rPr>
-          <w:rFonts w:ascii="Consolas" w:hAnsi="Consolas"/>
-          <w:sz w:val="18"/>
-        </w:rPr>
-        <w:t>python verification/run.py --output local-results/verification-01</w:t>
+        <w:t>Onboard software and simulation</w:t>
       </w:r>
     </w:p>
     <w:p>
       <w:r>
         <w:rPr/>
-        <w:t>Use a new output directory for each run. The sequence checks output preservation, lint rules, TypeScript types, version alignment, mobile tests, Python syntax, ground-station and UAV tests, C++ target-state handling and cross-component protocols. It then checks the saved MATLAB trajectories and figure axes. Results and logs, including simulation_checks.json, are written inside the selected directory. An all_passed value of true in summary.json means that all listed checks passed. Archived results are preserved.</w:t>
+        <w:t xml:space="preserve">Follow </w:t>
       </w:r>
-    </w:p>
-    <w:p>
+      <w:hyperlink r:id="rId12">
+        <w:r>
+          <w:rPr>
+            <w:color w:val="000000"/>
+          </w:rPr>
+          <w:t>Flight environment setup</w:t>
+        </w:r>
+      </w:hyperlink>
       <w:r>
         <w:rPr/>
-        <w:t>prepare_local.py creates M/src/services/db/firebaseConfig.ts from the example only when the local file is absent. Its placeholder values configure the mocked cloud connections used by the test runner. A direct call to python simulation/verify_outputs.py prints its findings without writing a report. Add --output followed by a new JSON path to save a report; an existing report is rejected.</w:t>
-      </w:r>
-    </w:p>
-    <w:p>
-      <w:pPr>
-        <w:pStyle w:val="Heading2"/>
-        <w:keepNext/>
-      </w:pPr>
-      <w:r>
-        <w:rPr>
-          <w:b/>
-          <w:color w:val="000000"/>
-        </w:rPr>
-        <w:t>Repeat the local relay test</w:t>
-      </w:r>
-    </w:p>
-    <w:p>
-      <w:r>
-        <w:rPr/>
-        <w:t>Install Mosquitto and make the mosquitto executable available on the command path. The test starts a temporary broker that listens only on the local loopback address and stops it when the test finishes.</w:t>
-      </w:r>
-    </w:p>
-    <w:p>
-      <w:pPr>
-        <w:pStyle w:val="NoSpacing"/>
-        <w:spacing w:before="40" w:after="100"/>
-      </w:pPr>
-      <w:r>
-        <w:rPr>
-          <w:rFonts w:ascii="Consolas" w:hAnsi="Consolas"/>
-          <w:sz w:val="18"/>
-        </w:rPr>
-        <w:t>python verification/integration/run_phone_uav_gs_bench.py \</w:t>
-        <w:br/>
-        <w:t xml:space="preserve">  --output local-results/phone-relay-01</w:t>
-      </w:r>
-    </w:p>
-    <w:p>
-      <w:r>
-        <w:rPr/>
-        <w:t>The test sends a synthetic phone record through a local HTTP interface and uses a running Mosquitto broker for relay and acknowledgement. Its output includes nine key records, the broker log and file checksums.</w:t>
-      </w:r>
-    </w:p>
-    <w:p>
-      <w:r>
-        <w:rPr/>
-        <w:t>On Windows, activate Python with .venv\Scripts\Activate.ps1 in PowerShell. The complete shell-based verification entry point requires Git Bash or a compatible shell. Configure ROS programs on Ubuntu as described in Section 5.</w:t>
+        <w:t xml:space="preserve"> for the external flight workspace and ROS dependencies. Build the flight workspace before rescue_bridge. Section 5 describes the installed components; Section 6 gives the MATLAB entry points and scenario parameters.</w:t>
       </w:r>
     </w:p>
     <w:p>
@@ -1296,18 +1062,7 @@
     <w:p>
       <w:r>
         <w:rPr/>
-        <w:t xml:space="preserve">Implementation: M/src/services/eventBookingRecord.ts. Booking interface: M/src/pages/EventBookingPage.tsx. Tests: </w:t>
-      </w:r>
-      <w:r>
-        <w:rPr>
-          <w:rFonts w:ascii="Consolas" w:hAnsi="Consolas"/>
-          <w:sz w:val="18"/>
-        </w:rPr>
-        <w:t>M/__tests__/eventBookingRecord.test.ts</w:t>
-      </w:r>
-      <w:r>
-        <w:rPr/>
-        <w:t>.</w:t>
+        <w:t>Implementation: M/src/services/eventBookingRecord.ts. Booking interface: M/src/pages/EventBookingPage.tsx.</w:t>
       </w:r>
     </w:p>
     <w:p>
@@ -1332,19 +1087,7 @@
     <w:p>
       <w:r>
         <w:rPr/>
-        <w:t xml:space="preserve">The current mobile source supports Android only. For device operation, fill M/src/services/db/firebaseConfig.ts with the project's client configuration and use the same Realtime Database URL as the ground station. Configure the Android toolchain, native Firebase files and map credentials separately. From M, npm start starts Metro; npm run android invokes the Android build. The Android compile-only helper uses synthetic configuration. Build and verification results are listed in </w:t>
-      </w:r>
-      <w:hyperlink r:id="rId23">
-        <w:r>
-          <w:rPr>
-            <w:color w:val="000000"/>
-          </w:rPr>
-          <w:t>Android validation</w:t>
-        </w:r>
-      </w:hyperlink>
-      <w:r>
-        <w:rPr/>
-        <w:t>.</w:t>
+        <w:t>The current mobile source supports Android only. For device operation, fill M/src/services/db/firebaseConfig.ts with the project's client configuration and use the same Realtime Database URL as the ground station. Configure the Android toolchain, native Firebase files and map credentials separately. From M, npm start starts Metro; npm run android invokes the Android build.</w:t>
       </w:r>
     </w:p>
     <w:p>
@@ -1839,13 +1582,13 @@
     <w:p>
       <w:r>
         <w:rPr/>
-        <w:t>Use G/config/runtime.env.example as the template. Supply and export the actual values, then run python main.py from G. Both threshold fields are blank in the template. The 1-second GPS threshold in the tests checks time-boundary behavior.</w:t>
+        <w:t>Use G/config/runtime.env.example as the template. Supply and export the actual values, then run python main.py from G. Both threshold fields are blank in the template.</w:t>
       </w:r>
     </w:p>
     <w:p>
       <w:r>
         <w:rPr/>
-        <w:t>Copy the template to G/config/runtime.env and fill it locally before running the following commands from the archive root. The application reads exported environment variables; it does not automatically load runtime.env.</w:t>
+        <w:t>Copy the template to G/config/runtime.env and fill it locally. The application reads exported environment variables. From the repository root in PowerShell:</w:t>
       </w:r>
     </w:p>
     <w:p>
@@ -1858,15 +1601,17 @@
           <w:rFonts w:ascii="Consolas" w:hAnsi="Consolas"/>
           <w:sz w:val="18"/>
         </w:rPr>
-        <w:t>set -a</w:t>
+        <w:t>Get-Content code\ground_station\config\runtime.env | ForEach-Object {</w:t>
         <w:br/>
-        <w:t>. ./code/ground_station/config/runtime.env</w:t>
+        <w:t xml:space="preserve">    if ($_ -match '^\s*([^#=\s]+)=(.*)$') {</w:t>
         <w:br/>
-        <w:t>set +a</w:t>
+        <w:t xml:space="preserve">        [Environment]::SetEnvironmentVariable($matches[1], $matches[2].Trim(), 'Process')</w:t>
         <w:br/>
-        <w:t>python verification/tools/deployment_preflight.py</w:t>
+        <w:t xml:space="preserve">    }</w:t>
         <w:br/>
-        <w:t>cd code/ground_station</w:t>
+        <w:t>}</w:t>
+        <w:br/>
+        <w:t>Set-Location code\ground_station</w:t>
         <w:br/>
         <w:t>python main.py</w:t>
       </w:r>
@@ -1874,7 +1619,7 @@
     <w:p>
       <w:r>
         <w:rPr/>
-        <w:t>The preflight command checks local configuration consistency without contacting Firebase or validating an installed phone application. Both the ground station and UAV must reach the configured broker over the deployment network; localhost is only suitable when that process shares the broker's host.</w:t>
+        <w:t>Both the ground station and UAV must reach the configured broker over the deployment network. Use the same database URL in the mobile and ground-station configuration.</w:t>
       </w:r>
     </w:p>
     <w:p>
@@ -2254,7 +1999,7 @@
     <w:p>
       <w:r>
         <w:rPr/>
-        <w:t>The flight stack uses Fast-Drone-250 from the original Drone repository at the commit below. Its 979 regular files were compared with the original local copy and matched. The external dependency retains its own licenses and documentation.</w:t>
+        <w:t>The flight stack uses Fast-Drone-250 from the original Drone repository at the commit below. The external dependency retains its own licenses and documentation.</w:t>
       </w:r>
     </w:p>
     <w:p>
@@ -2275,7 +2020,7 @@
         <w:rPr/>
         <w:t xml:space="preserve">Download and placement commands are in </w:t>
       </w:r>
-      <w:hyperlink r:id="rId15">
+      <w:hyperlink r:id="rId12">
         <w:r>
           <w:rPr>
             <w:color w:val="000000"/>
@@ -3244,12 +2989,6 @@
       </w:r>
     </w:p>
     <w:p>
-      <w:r>
-        <w:rPr/>
-        <w:t>The archived MATLAB computation passed 30 assertions. A separate Python verification contains 53 checks covering terrain interpolation, 80 m ground clearance, speed limits, waypoint order, return and landing, and the saved figure-axis audit. Rechecking these outputs or redrawing the figure is separate from recomputing the MATLAB scenario.</w:t>
-      </w:r>
-    </w:p>
-    <w:p>
       <w:pPr>
         <w:pStyle w:val="Heading1"/>
         <w:keepNext/>
@@ -3259,739 +2998,7 @@
           <w:b/>
           <w:color w:val="000000"/>
         </w:rPr>
-        <w:t>7  Software Verification and Relay Records</w:t>
-      </w:r>
-    </w:p>
-    <w:p>
-      <w:r>
-        <w:rPr/>
-        <w:t xml:space="preserve">The </w:t>
-      </w:r>
-      <w:hyperlink r:id="rId26">
-        <w:r>
-          <w:rPr>
-            <w:color w:val="000000"/>
-          </w:rPr>
-          <w:t>Android validation summary</w:t>
-        </w:r>
-      </w:hyperlink>
-      <w:r>
-        <w:rPr/>
-        <w:t xml:space="preserve"> lists the Android release checks. The software-test table below describes the saved run in verification/records/.</w:t>
-      </w:r>
-    </w:p>
-    <w:p>
-      <w:r>
-        <w:rPr/>
-        <w:t>Verification ran on 28 September 2026 using macOS arm64, Python 3.12.14 and Node.js 24.19.0. Detailed results are in verification/records/software.log and verification/records/verification_summary.json.</w:t>
-      </w:r>
-    </w:p>
-    <w:p>
-      <w:r>
-        <w:rPr/>
-        <w:t>The 30 September rerun is recorded separately in verification/records/verification_20260930/. Selected component results are listed below. The run also passed three verification-output regression tests and 53 saved-simulation checks. The original protocol fixture from 9 September is now included at G/tests/fixtures/capture_record_v2.json, so its six ground-station tests no longer depend on a file outside this repository. The archived software logs contain selected output for retained components and keep the original run dates.</w:t>
-      </w:r>
-    </w:p>
-    <w:tbl>
-      <w:tblPr>
-        <w:tblW w:type="auto" w:w="0"/>
-        <w:tblLayout w:type="fixed"/>
-        <w:tblLook w:firstColumn="1" w:firstRow="1" w:lastColumn="0" w:lastRow="0" w:noHBand="0" w:noVBand="1" w:val="04A0"/>
-        <w:tblBorders>
-          <w:top w:val="single" w:sz="4" w:color="D9D9D9"/>
-          <w:left w:val="single" w:sz="4" w:color="D9D9D9"/>
-          <w:bottom w:val="single" w:sz="4" w:color="D9D9D9"/>
-          <w:right w:val="single" w:sz="4" w:color="D9D9D9"/>
-          <w:insideH w:val="single" w:sz="4" w:color="D9D9D9"/>
-          <w:insideV w:val="single" w:sz="4" w:color="D9D9D9"/>
-        </w:tblBorders>
-      </w:tblPr>
-      <w:tblGrid>
-        <w:gridCol w:w="3528"/>
-        <w:gridCol w:w="6624"/>
-      </w:tblGrid>
-      <w:tr>
-        <w:trPr>
-          <w:tblHeader/>
-        </w:trPr>
-        <w:tc>
-          <w:tcPr>
-            <w:tcW w:type="dxa" w:w="3528"/>
-            <w:tcMar>
-              <w:top w:w="70" w:type="dxa"/>
-              <w:left w:w="70" w:type="dxa"/>
-              <w:bottom w:w="70" w:type="dxa"/>
-              <w:right w:w="70" w:type="dxa"/>
-            </w:tcMar>
-            <w:shd w:fill="F2F2F2"/>
-          </w:tcPr>
-          <w:p>
-            <w:pPr>
-              <w:spacing w:after="40" w:before="40"/>
-            </w:pPr>
-            <w:r>
-              <w:rPr>
-                <w:b/>
-                <w:sz w:val="19"/>
-              </w:rPr>
-              <w:t>Test group</w:t>
-            </w:r>
-          </w:p>
-        </w:tc>
-        <w:tc>
-          <w:tcPr>
-            <w:tcW w:type="dxa" w:w="6624"/>
-            <w:tcMar>
-              <w:top w:w="70" w:type="dxa"/>
-              <w:left w:w="70" w:type="dxa"/>
-              <w:bottom w:w="70" w:type="dxa"/>
-              <w:right w:w="70" w:type="dxa"/>
-            </w:tcMar>
-            <w:shd w:fill="F2F2F2"/>
-          </w:tcPr>
-          <w:p>
-            <w:pPr>
-              <w:spacing w:after="40" w:before="40"/>
-            </w:pPr>
-            <w:r>
-              <w:rPr>
-                <w:b/>
-                <w:sz w:val="19"/>
-              </w:rPr>
-              <w:t>Tests passed</w:t>
-            </w:r>
-          </w:p>
-        </w:tc>
-      </w:tr>
-      <w:tr>
-        <w:tc>
-          <w:tcPr>
-            <w:tcW w:type="dxa" w:w="3528"/>
-            <w:tcMar>
-              <w:top w:w="70" w:type="dxa"/>
-              <w:left w:w="70" w:type="dxa"/>
-              <w:bottom w:w="70" w:type="dxa"/>
-              <w:right w:w="70" w:type="dxa"/>
-            </w:tcMar>
-          </w:tcPr>
-          <w:p>
-            <w:pPr>
-              <w:spacing w:after="40" w:before="40"/>
-            </w:pPr>
-            <w:r>
-              <w:rPr>
-                <w:b w:val="0"/>
-                <w:sz w:val="19"/>
-              </w:rPr>
-              <w:t>Mobile application: Jest</w:t>
-            </w:r>
-          </w:p>
-        </w:tc>
-        <w:tc>
-          <w:tcPr>
-            <w:tcW w:type="dxa" w:w="6624"/>
-            <w:tcMar>
-              <w:top w:w="70" w:type="dxa"/>
-              <w:left w:w="70" w:type="dxa"/>
-              <w:bottom w:w="70" w:type="dxa"/>
-              <w:right w:w="70" w:type="dxa"/>
-            </w:tcMar>
-          </w:tcPr>
-          <w:p>
-            <w:pPr>
-              <w:spacing w:after="40" w:before="40"/>
-            </w:pPr>
-            <w:r>
-              <w:rPr>
-                <w:b w:val="0"/>
-                <w:sz w:val="19"/>
-              </w:rPr>
-              <w:t>229</w:t>
-            </w:r>
-          </w:p>
-        </w:tc>
-      </w:tr>
-      <w:tr>
-        <w:tc>
-          <w:tcPr>
-            <w:tcW w:type="dxa" w:w="3528"/>
-            <w:tcMar>
-              <w:top w:w="70" w:type="dxa"/>
-              <w:left w:w="70" w:type="dxa"/>
-              <w:bottom w:w="70" w:type="dxa"/>
-              <w:right w:w="70" w:type="dxa"/>
-            </w:tcMar>
-          </w:tcPr>
-          <w:p>
-            <w:pPr>
-              <w:spacing w:after="40" w:before="40"/>
-            </w:pPr>
-            <w:r>
-              <w:rPr>
-                <w:b w:val="0"/>
-                <w:sz w:val="19"/>
-              </w:rPr>
-              <w:t>Ground station</w:t>
-            </w:r>
-          </w:p>
-        </w:tc>
-        <w:tc>
-          <w:tcPr>
-            <w:tcW w:type="dxa" w:w="6624"/>
-            <w:tcMar>
-              <w:top w:w="70" w:type="dxa"/>
-              <w:left w:w="70" w:type="dxa"/>
-              <w:bottom w:w="70" w:type="dxa"/>
-              <w:right w:w="70" w:type="dxa"/>
-            </w:tcMar>
-          </w:tcPr>
-          <w:p>
-            <w:pPr>
-              <w:spacing w:after="40" w:before="40"/>
-            </w:pPr>
-            <w:r>
-              <w:rPr>
-                <w:b w:val="0"/>
-                <w:sz w:val="19"/>
-              </w:rPr>
-              <w:t>233</w:t>
-            </w:r>
-          </w:p>
-        </w:tc>
-      </w:tr>
-      <w:tr>
-        <w:tc>
-          <w:tcPr>
-            <w:tcW w:type="dxa" w:w="3528"/>
-            <w:tcMar>
-              <w:top w:w="70" w:type="dxa"/>
-              <w:left w:w="70" w:type="dxa"/>
-              <w:bottom w:w="70" w:type="dxa"/>
-              <w:right w:w="70" w:type="dxa"/>
-            </w:tcMar>
-          </w:tcPr>
-          <w:p>
-            <w:pPr>
-              <w:spacing w:after="40" w:before="40"/>
-            </w:pPr>
-            <w:r>
-              <w:rPr>
-                <w:b w:val="0"/>
-                <w:sz w:val="19"/>
-              </w:rPr>
-              <w:t>UAV phone-record receiver</w:t>
-            </w:r>
-          </w:p>
-        </w:tc>
-        <w:tc>
-          <w:tcPr>
-            <w:tcW w:type="dxa" w:w="6624"/>
-            <w:tcMar>
-              <w:top w:w="70" w:type="dxa"/>
-              <w:left w:w="70" w:type="dxa"/>
-              <w:bottom w:w="70" w:type="dxa"/>
-              <w:right w:w="70" w:type="dxa"/>
-            </w:tcMar>
-          </w:tcPr>
-          <w:p>
-            <w:pPr>
-              <w:spacing w:after="40" w:before="40"/>
-            </w:pPr>
-            <w:r>
-              <w:rPr>
-                <w:b w:val="0"/>
-                <w:sz w:val="19"/>
-              </w:rPr>
-              <w:t>44</w:t>
-            </w:r>
-          </w:p>
-        </w:tc>
-      </w:tr>
-      <w:tr>
-        <w:tc>
-          <w:tcPr>
-            <w:tcW w:type="dxa" w:w="3528"/>
-            <w:tcMar>
-              <w:top w:w="70" w:type="dxa"/>
-              <w:left w:w="70" w:type="dxa"/>
-              <w:bottom w:w="70" w:type="dxa"/>
-              <w:right w:w="70" w:type="dxa"/>
-            </w:tcMar>
-          </w:tcPr>
-          <w:p>
-            <w:pPr>
-              <w:spacing w:after="40" w:before="40"/>
-            </w:pPr>
-            <w:r>
-              <w:rPr>
-                <w:b w:val="0"/>
-                <w:sz w:val="19"/>
-              </w:rPr>
-              <w:t>UAV mission bridge</w:t>
-            </w:r>
-          </w:p>
-        </w:tc>
-        <w:tc>
-          <w:tcPr>
-            <w:tcW w:type="dxa" w:w="6624"/>
-            <w:tcMar>
-              <w:top w:w="70" w:type="dxa"/>
-              <w:left w:w="70" w:type="dxa"/>
-              <w:bottom w:w="70" w:type="dxa"/>
-              <w:right w:w="70" w:type="dxa"/>
-            </w:tcMar>
-          </w:tcPr>
-          <w:p>
-            <w:pPr>
-              <w:spacing w:after="40" w:before="40"/>
-            </w:pPr>
-            <w:r>
-              <w:rPr>
-                <w:b w:val="0"/>
-                <w:sz w:val="19"/>
-              </w:rPr>
-              <w:t>44</w:t>
-            </w:r>
-          </w:p>
-        </w:tc>
-      </w:tr>
-      <w:tr>
-        <w:tc>
-          <w:tcPr>
-            <w:tcW w:type="dxa" w:w="3528"/>
-            <w:tcMar>
-              <w:top w:w="70" w:type="dxa"/>
-              <w:left w:w="70" w:type="dxa"/>
-              <w:bottom w:w="70" w:type="dxa"/>
-              <w:right w:w="70" w:type="dxa"/>
-            </w:tcMar>
-          </w:tcPr>
-          <w:p>
-            <w:pPr>
-              <w:spacing w:after="40" w:before="40"/>
-            </w:pPr>
-            <w:r>
-              <w:rPr>
-                <w:b w:val="0"/>
-                <w:sz w:val="19"/>
-              </w:rPr>
-              <w:t>Video recorder and recording state</w:t>
-            </w:r>
-          </w:p>
-        </w:tc>
-        <w:tc>
-          <w:tcPr>
-            <w:tcW w:type="dxa" w:w="6624"/>
-            <w:tcMar>
-              <w:top w:w="70" w:type="dxa"/>
-              <w:left w:w="70" w:type="dxa"/>
-              <w:bottom w:w="70" w:type="dxa"/>
-              <w:right w:w="70" w:type="dxa"/>
-            </w:tcMar>
-          </w:tcPr>
-          <w:p>
-            <w:pPr>
-              <w:spacing w:after="40" w:before="40"/>
-            </w:pPr>
-            <w:r>
-              <w:rPr>
-                <w:b w:val="0"/>
-                <w:sz w:val="19"/>
-              </w:rPr>
-              <w:t>12</w:t>
-            </w:r>
-          </w:p>
-        </w:tc>
-      </w:tr>
-      <w:tr>
-        <w:tc>
-          <w:tcPr>
-            <w:tcW w:type="dxa" w:w="3528"/>
-            <w:tcMar>
-              <w:top w:w="70" w:type="dxa"/>
-              <w:left w:w="70" w:type="dxa"/>
-              <w:bottom w:w="70" w:type="dxa"/>
-              <w:right w:w="70" w:type="dxa"/>
-            </w:tcMar>
-          </w:tcPr>
-          <w:p>
-            <w:pPr>
-              <w:spacing w:after="40" w:before="40"/>
-            </w:pPr>
-            <w:r>
-              <w:rPr>
-                <w:b w:val="0"/>
-                <w:sz w:val="19"/>
-              </w:rPr>
-              <w:t>Cross-component protocols and state transitions</w:t>
-            </w:r>
-          </w:p>
-        </w:tc>
-        <w:tc>
-          <w:tcPr>
-            <w:tcW w:type="dxa" w:w="6624"/>
-            <w:tcMar>
-              <w:top w:w="70" w:type="dxa"/>
-              <w:left w:w="70" w:type="dxa"/>
-              <w:bottom w:w="70" w:type="dxa"/>
-              <w:right w:w="70" w:type="dxa"/>
-            </w:tcMar>
-          </w:tcPr>
-          <w:p>
-            <w:pPr>
-              <w:spacing w:after="40" w:before="40"/>
-            </w:pPr>
-            <w:r>
-              <w:rPr>
-                <w:b w:val="0"/>
-                <w:sz w:val="19"/>
-              </w:rPr>
-              <w:t>61</w:t>
-            </w:r>
-          </w:p>
-        </w:tc>
-      </w:tr>
-    </w:tbl>
-    <w:p>
-      <w:pPr>
-        <w:spacing w:after="40" w:before="0" w:line="40" w:lineRule="exact"/>
-      </w:pPr>
-    </w:p>
-    <w:p>
-      <w:r>
-        <w:rPr/>
-        <w:t>TypeScript type checking, ESLint, Python syntax, dependency-version checks, and compilation and execution of the C++ target-state tests also passed. New cases cover trip-time estimation, midnight rollover, recalculation after route edits, SOS contact steps, cancellation, stale requests, repeated scans and rejection of unverified events at dispatch preparation.</w:t>
-      </w:r>
-    </w:p>
-    <w:p>
-      <w:pPr>
-        <w:pStyle w:val="Heading2"/>
-        <w:keepNext/>
-      </w:pPr>
-      <w:r>
-        <w:rPr>
-          <w:b/>
-          <w:color w:val="000000"/>
-        </w:rPr>
-        <w:t>Local phone-record reception and forwarding</w:t>
-      </w:r>
-    </w:p>
-    <w:p>
-      <w:r>
-        <w:rPr/>
-        <w:t xml:space="preserve">The </w:t>
-      </w:r>
-      <w:hyperlink r:id="rId27">
-        <w:r>
-          <w:rPr>
-            <w:color w:val="000000"/>
-          </w:rPr>
-          <w:t>relay bench</w:t>
-        </w:r>
-      </w:hyperlink>
-      <w:r>
-        <w:rPr/>
-        <w:t xml:space="preserve"> sends a synthetic phone record containing an SOS location and GPS data through local HTTP to the UAV receiver. After the receiver saves it, the execution manager completes every waypoint and continuous hold, then persists the normal landing request before forwarding. The ground station validates and saves the received data, then sends an acknowledgement. The UAV uses that acknowledgement to complete the transfer.</w:t>
-      </w:r>
-    </w:p>
-    <w:tbl>
-      <w:tblPr>
-        <w:tblW w:type="auto" w:w="0"/>
-        <w:tblLayout w:type="fixed"/>
-        <w:tblLook w:firstColumn="1" w:firstRow="1" w:lastColumn="0" w:lastRow="0" w:noHBand="0" w:noVBand="1" w:val="04A0"/>
-        <w:tblBorders>
-          <w:top w:val="single" w:sz="4" w:color="D9D9D9"/>
-          <w:left w:val="single" w:sz="4" w:color="D9D9D9"/>
-          <w:bottom w:val="single" w:sz="4" w:color="D9D9D9"/>
-          <w:right w:val="single" w:sz="4" w:color="D9D9D9"/>
-          <w:insideH w:val="single" w:sz="4" w:color="D9D9D9"/>
-          <w:insideV w:val="single" w:sz="4" w:color="D9D9D9"/>
-        </w:tblBorders>
-      </w:tblPr>
-      <w:tblGrid>
-        <w:gridCol w:w="3528"/>
-        <w:gridCol w:w="6624"/>
-      </w:tblGrid>
-      <w:tr>
-        <w:trPr>
-          <w:tblHeader/>
-        </w:trPr>
-        <w:tc>
-          <w:tcPr>
-            <w:tcW w:type="dxa" w:w="3528"/>
-            <w:tcMar>
-              <w:top w:w="70" w:type="dxa"/>
-              <w:left w:w="70" w:type="dxa"/>
-              <w:bottom w:w="70" w:type="dxa"/>
-              <w:right w:w="70" w:type="dxa"/>
-            </w:tcMar>
-            <w:shd w:fill="F2F2F2"/>
-          </w:tcPr>
-          <w:p>
-            <w:pPr>
-              <w:spacing w:after="40" w:before="40"/>
-            </w:pPr>
-            <w:r>
-              <w:rPr>
-                <w:b/>
-                <w:sz w:val="19"/>
-              </w:rPr>
-              <w:t>Record numbers</w:t>
-            </w:r>
-          </w:p>
-        </w:tc>
-        <w:tc>
-          <w:tcPr>
-            <w:tcW w:type="dxa" w:w="6624"/>
-            <w:tcMar>
-              <w:top w:w="70" w:type="dxa"/>
-              <w:left w:w="70" w:type="dxa"/>
-              <w:bottom w:w="70" w:type="dxa"/>
-              <w:right w:w="70" w:type="dxa"/>
-            </w:tcMar>
-            <w:shd w:fill="F2F2F2"/>
-          </w:tcPr>
-          <w:p>
-            <w:pPr>
-              <w:spacing w:after="40" w:before="40"/>
-            </w:pPr>
-            <w:r>
-              <w:rPr>
-                <w:b/>
-                <w:sz w:val="19"/>
-              </w:rPr>
-              <w:t>Saved contents</w:t>
-            </w:r>
-          </w:p>
-        </w:tc>
-      </w:tr>
-      <w:tr>
-        <w:tc>
-          <w:tcPr>
-            <w:tcW w:type="dxa" w:w="3528"/>
-            <w:tcMar>
-              <w:top w:w="70" w:type="dxa"/>
-              <w:left w:w="70" w:type="dxa"/>
-              <w:bottom w:w="70" w:type="dxa"/>
-              <w:right w:w="70" w:type="dxa"/>
-            </w:tcMar>
-          </w:tcPr>
-          <w:p>
-            <w:pPr>
-              <w:spacing w:after="40" w:before="40"/>
-            </w:pPr>
-            <w:r>
-              <w:rPr>
-                <w:b w:val="0"/>
-                <w:sz w:val="19"/>
-              </w:rPr>
-              <w:t>01–03</w:t>
-            </w:r>
-          </w:p>
-        </w:tc>
-        <w:tc>
-          <w:tcPr>
-            <w:tcW w:type="dxa" w:w="6624"/>
-            <w:tcMar>
-              <w:top w:w="70" w:type="dxa"/>
-              <w:left w:w="70" w:type="dxa"/>
-              <w:bottom w:w="70" w:type="dxa"/>
-              <w:right w:w="70" w:type="dxa"/>
-            </w:tcMar>
-          </w:tcPr>
-          <w:p>
-            <w:pPr>
-              <w:spacing w:after="40" w:before="40"/>
-            </w:pPr>
-            <w:r>
-              <w:rPr>
-                <w:b w:val="0"/>
-                <w:sz w:val="19"/>
-              </w:rPr>
-              <w:t>Phone request, HTTP receipt and record saved by the UAV</w:t>
-            </w:r>
-          </w:p>
-        </w:tc>
-      </w:tr>
-      <w:tr>
-        <w:tc>
-          <w:tcPr>
-            <w:tcW w:type="dxa" w:w="3528"/>
-            <w:tcMar>
-              <w:top w:w="70" w:type="dxa"/>
-              <w:left w:w="70" w:type="dxa"/>
-              <w:bottom w:w="70" w:type="dxa"/>
-              <w:right w:w="70" w:type="dxa"/>
-            </w:tcMar>
-          </w:tcPr>
-          <w:p>
-            <w:pPr>
-              <w:spacing w:after="40" w:before="40"/>
-            </w:pPr>
-            <w:r>
-              <w:rPr>
-                <w:b w:val="0"/>
-                <w:sz w:val="19"/>
-              </w:rPr>
-              <w:t>04–05</w:t>
-            </w:r>
-          </w:p>
-        </w:tc>
-        <w:tc>
-          <w:tcPr>
-            <w:tcW w:type="dxa" w:w="6624"/>
-            <w:tcMar>
-              <w:top w:w="70" w:type="dxa"/>
-              <w:left w:w="70" w:type="dxa"/>
-              <w:bottom w:w="70" w:type="dxa"/>
-              <w:right w:w="70" w:type="dxa"/>
-            </w:tcMar>
-          </w:tcPr>
-          <w:p>
-            <w:pPr>
-              <w:spacing w:after="40" w:before="40"/>
-            </w:pPr>
-            <w:r>
-              <w:rPr>
-                <w:b w:val="0"/>
-                <w:sz w:val="19"/>
-              </w:rPr>
-              <w:t>Completed execution authorizing forwarding and outgoing record envelope</w:t>
-            </w:r>
-          </w:p>
-        </w:tc>
-      </w:tr>
-      <w:tr>
-        <w:tc>
-          <w:tcPr>
-            <w:tcW w:type="dxa" w:w="3528"/>
-            <w:tcMar>
-              <w:top w:w="70" w:type="dxa"/>
-              <w:left w:w="70" w:type="dxa"/>
-              <w:bottom w:w="70" w:type="dxa"/>
-              <w:right w:w="70" w:type="dxa"/>
-            </w:tcMar>
-          </w:tcPr>
-          <w:p>
-            <w:pPr>
-              <w:spacing w:after="40" w:before="40"/>
-            </w:pPr>
-            <w:r>
-              <w:rPr>
-                <w:b w:val="0"/>
-                <w:sz w:val="19"/>
-              </w:rPr>
-              <w:t>06–07</w:t>
-            </w:r>
-          </w:p>
-        </w:tc>
-        <w:tc>
-          <w:tcPr>
-            <w:tcW w:type="dxa" w:w="6624"/>
-            <w:tcMar>
-              <w:top w:w="70" w:type="dxa"/>
-              <w:left w:w="70" w:type="dxa"/>
-              <w:bottom w:w="70" w:type="dxa"/>
-              <w:right w:w="70" w:type="dxa"/>
-            </w:tcMar>
-          </w:tcPr>
-          <w:p>
-            <w:pPr>
-              <w:spacing w:after="40" w:before="40"/>
-            </w:pPr>
-            <w:r>
-              <w:rPr>
-                <w:b w:val="0"/>
-                <w:sz w:val="19"/>
-              </w:rPr>
-              <w:t>Phone record and envelope saved by the ground station</w:t>
-            </w:r>
-          </w:p>
-        </w:tc>
-      </w:tr>
-      <w:tr>
-        <w:tc>
-          <w:tcPr>
-            <w:tcW w:type="dxa" w:w="3528"/>
-            <w:tcMar>
-              <w:top w:w="70" w:type="dxa"/>
-              <w:left w:w="70" w:type="dxa"/>
-              <w:bottom w:w="70" w:type="dxa"/>
-              <w:right w:w="70" w:type="dxa"/>
-            </w:tcMar>
-          </w:tcPr>
-          <w:p>
-            <w:pPr>
-              <w:spacing w:after="40" w:before="40"/>
-            </w:pPr>
-            <w:r>
-              <w:rPr>
-                <w:b w:val="0"/>
-                <w:sz w:val="19"/>
-              </w:rPr>
-              <w:t>08–09</w:t>
-            </w:r>
-          </w:p>
-        </w:tc>
-        <w:tc>
-          <w:tcPr>
-            <w:tcW w:type="dxa" w:w="6624"/>
-            <w:tcMar>
-              <w:top w:w="70" w:type="dxa"/>
-              <w:left w:w="70" w:type="dxa"/>
-              <w:bottom w:w="70" w:type="dxa"/>
-              <w:right w:w="70" w:type="dxa"/>
-            </w:tcMar>
-          </w:tcPr>
-          <w:p>
-            <w:pPr>
-              <w:spacing w:after="40" w:before="40"/>
-            </w:pPr>
-            <w:r>
-              <w:rPr>
-                <w:b w:val="0"/>
-                <w:sz w:val="19"/>
-              </w:rPr>
-              <w:t>Ground-station acknowledgement and final UAV delivery state</w:t>
-            </w:r>
-          </w:p>
-        </w:tc>
-      </w:tr>
-    </w:tbl>
-    <w:p>
-      <w:pPr>
-        <w:spacing w:after="40" w:before="0" w:line="40" w:lineRule="exact"/>
-      </w:pPr>
-    </w:p>
-    <w:p>
-      <w:r>
-        <w:rPr/>
-        <w:t>The request_id, mission_id, record-content hash and envelope hash link these records for comparison. run_summary.json lists the result and test conditions. SHA256SUMS.txt contains the output-file checksums.</w:t>
-      </w:r>
-    </w:p>
-    <w:p>
-      <w:r>
-        <w:rPr/>
-        <w:t>The software tests cover incorrect or missing acknowledgements, duplicate data and recovery after a restart. Source files and logs contain the test cases and results; Section 8 lists the demo videos and outdoor materials.</w:t>
-      </w:r>
-    </w:p>
-    <w:p>
-      <w:r>
-        <w:rPr/>
-        <w:t>The 30 September relay records are in verification/records/phone_relay/20260930/. The relay runs use synthetic uploads and a Mosquitto broker.</w:t>
-      </w:r>
-    </w:p>
-    <w:p>
-      <w:pPr>
-        <w:pStyle w:val="Heading1"/>
-        <w:keepNext/>
-      </w:pPr>
-      <w:r>
-        <w:rPr>
-          <w:b/>
-          <w:color w:val="000000"/>
-        </w:rPr>
-        <w:t>8  Demo Videos, Outdoor Materials, Sources and Integrity</w:t>
+        <w:t>7  System Videos and Outdoor Materials</w:t>
       </w:r>
     </w:p>
     <w:p>
@@ -4049,7 +3056,7 @@
                 <w:b/>
                 <w:sz w:val="19"/>
               </w:rPr>
-              <w:t>Test component</w:t>
+              <w:t>System component</w:t>
             </w:r>
           </w:p>
         </w:tc>
@@ -4073,7 +3080,7 @@
                 <w:b/>
                 <w:sz w:val="19"/>
               </w:rPr>
-              <w:t>Demo video</w:t>
+              <w:t>Video</w:t>
             </w:r>
           </w:p>
         </w:tc>
@@ -4116,7 +3123,7 @@
             <w:pPr>
               <w:spacing w:after="40" w:before="40"/>
             </w:pPr>
-            <w:hyperlink r:id="rId18">
+            <w:hyperlink r:id="rId13">
               <w:r>
                 <w:rPr>
                   <w:color w:val="000000"/>
@@ -4165,7 +3172,7 @@
             <w:pPr>
               <w:spacing w:after="40" w:before="40"/>
             </w:pPr>
-            <w:hyperlink r:id="rId19">
+            <w:hyperlink r:id="rId14">
               <w:r>
                 <w:rPr>
                   <w:color w:val="000000"/>
@@ -4214,7 +3221,7 @@
             <w:pPr>
               <w:spacing w:after="40" w:before="40"/>
             </w:pPr>
-            <w:hyperlink r:id="rId20">
+            <w:hyperlink r:id="rId15">
               <w:r>
                 <w:rPr>
                   <w:color w:val="000000"/>
@@ -4236,12 +3243,12 @@
         <w:rPr/>
         <w:t xml:space="preserve">See </w:t>
       </w:r>
-      <w:hyperlink r:id="rId21">
+      <w:hyperlink r:id="rId16">
         <w:r>
           <w:rPr>
             <w:color w:val="000000"/>
           </w:rPr>
-          <w:t>Demo videos and test materials</w:t>
+          <w:t>System videos and outdoor materials</w:t>
         </w:r>
       </w:hyperlink>
       <w:r>
@@ -4595,63 +3602,6 @@
           <w:b/>
           <w:color w:val="000000"/>
         </w:rPr>
-        <w:t>Source provenance</w:t>
-      </w:r>
-    </w:p>
-    <w:p>
-      <w:r>
-        <w:rPr/>
-        <w:t>The mobile application, ground station and UAV software originate from the FYP projects and subsequent local revisions. Upstream repository links, remote commit identifiers, local input files and checksums are recorded in verification/records/source_provenance.json. The current implementation is recorded in verification/source_revision.json. Remote commits and local revisions are identified separately.</w:t>
-      </w:r>
-    </w:p>
-    <w:p>
-      <w:r>
-        <w:rPr/>
-        <w:t>The local input revision is WCNC-GPS-FRESHNESS-20260916. The current revision adds route-based trip-time estimation, operator verification before SOS event creation, and equal initial event priority across all three modes. Simulation source and data checksums are also recorded in simulation/verification/source_manifest.json.</w:t>
-      </w:r>
-    </w:p>
-    <w:p>
-      <w:pPr>
-        <w:pStyle w:val="Heading2"/>
-        <w:keepNext/>
-      </w:pPr>
-      <w:r>
-        <w:rPr>
-          <w:b/>
-          <w:color w:val="000000"/>
-        </w:rPr>
-        <w:t>Check archive integrity</w:t>
-      </w:r>
-    </w:p>
-    <w:p>
-      <w:pPr>
-        <w:pStyle w:val="NoSpacing"/>
-        <w:spacing w:before="40" w:after="100"/>
-      </w:pPr>
-      <w:r>
-        <w:rPr>
-          <w:rFonts w:ascii="Consolas" w:hAnsi="Consolas"/>
-          <w:sz w:val="18"/>
-        </w:rPr>
-        <w:t>python verification/tools/check_archive.py</w:t>
-      </w:r>
-    </w:p>
-    <w:p>
-      <w:r>
-        <w:rPr/>
-        <w:t>This command reads verification/records/file_manifest.json and checks each listed file's SHA-256 checksum and size. If source code, parameters or results are changed, save a new verification record. Preserve the original timestamps and identifiers of existing test outputs.</w:t>
-      </w:r>
-    </w:p>
-    <w:p>
-      <w:pPr>
-        <w:pStyle w:val="Heading2"/>
-        <w:keepNext/>
-      </w:pPr>
-      <w:r>
-        <w:rPr>
-          <w:b/>
-          <w:color w:val="000000"/>
-        </w:rPr>
         <w:t>References</w:t>
       </w:r>
     </w:p>
@@ -4671,13 +3621,13 @@
           <w:b/>
           <w:color w:val="000000"/>
         </w:rPr>
-        <w:t>9 Implementation and Evidence Index</w:t>
+        <w:t>8 Implementation Index</w:t>
       </w:r>
     </w:p>
     <w:p>
       <w:r>
         <w:rPr/>
-        <w:t>This index follows the 30 September anonymous manuscript. M, G and U use the component abbreviations in Section 1. Paths identify source files, tests and saved results.</w:t>
+        <w:t>M, G and U use the component abbreviations in Section 1. The following paths identify the source files implementing each system function.</w:t>
       </w:r>
     </w:p>
     <w:p>
@@ -4696,41 +3646,19 @@
     <w:p>
       <w:r>
         <w:rPr/>
-        <w:t xml:space="preserve">Event Booking is implemented in M/src/services/eventBookingRecord.ts and M/src/pages/EventBookingPage.tsx. </w:t>
-      </w:r>
-      <w:r>
-        <w:rPr>
-          <w:rFonts w:ascii="Consolas" w:hAnsi="Consolas"/>
-          <w:sz w:val="18"/>
-        </w:rPr>
-        <w:t>M/__tests__/eventBookingRecord.test.ts</w:t>
-      </w:r>
-      <w:r>
-        <w:rPr/>
-        <w:t xml:space="preserve"> checks the 4 km/h estimate, complete end timestamps and route edits. G/src/rescue_event_manager.py detects overdue records and manages the contact steps; G/tests/test_rescue_event_manager.py checks the transitions.</w:t>
+        <w:t>Event Booking uses M/src/services/eventBookingRecord.ts and M/src/pages/EventBookingPage.tsx for planned routes and trip-time estimation. G/src/rescue_event_manager.py detects overdue records and manages the contact procedure.</w:t>
       </w:r>
     </w:p>
     <w:p>
       <w:r>
         <w:rPr/>
-        <w:t>Quick Start uses M/src/pages/AndroidQuickStartPage.tsx and M/src/services/persistentTracking.ts. The native TrackingService, TrackingStore and TrackingCore in M/android/app/src/main/java/com/fypproject/tracking/ collect and persist samples. G/src/quick_start_freshness.py uses the latest valid sample time. verification/integration/test_quick_start_freshness_contract.py compiles the production Kotlin gate and exercises the mobile and ground-station contract, including 0.999 s, 1.000 s and 1.001 s boundary cases. Configure GS_T_LOCATION_UPDATE_SECONDS for deployment.</w:t>
+        <w:t>Quick Start uses M/src/pages/AndroidQuickStartPage.tsx and M/src/services/persistentTracking.ts. TrackingService, TrackingStore and TrackingCore in M/android/app/src/main/java/com/fypproject/tracking/ collect and persist samples. G/src/quick_start_freshness.py uses the latest valid sample time. Set GS_T_LOCATION_UPDATE_SECONDS for the deployment.</w:t>
       </w:r>
     </w:p>
     <w:p>
       <w:r>
         <w:rPr/>
-        <w:t xml:space="preserve">SOS upload and dialing are implemented in M/src/pages/SosPage.tsx and checked by </w:t>
-      </w:r>
-      <w:r>
-        <w:rPr>
-          <w:rFonts w:ascii="Consolas" w:hAnsi="Consolas"/>
-          <w:sz w:val="18"/>
-        </w:rPr>
-        <w:t>M/__tests__/SosPage.test.tsx</w:t>
-      </w:r>
-      <w:r>
-        <w:rPr/>
-        <w:t>. G/src/rescue_event_manager.py enforces contact verification and explicit search confirmation. G/tests/test_sos_verification.py checks premature confirmation, cancellation, duplicate handling and unverified legacy events. The SOS instruction change is recorded in verification/records/sos_operator_verification_20260929.json.</w:t>
+        <w:t>SOS upload and dialing are implemented in M/src/pages/SosPage.tsx. G/src/rescue_event_manager.py enforces contact verification and explicit search confirmation.</w:t>
       </w:r>
     </w:p>
     <w:p>
@@ -4749,7 +3677,7 @@
     <w:p>
       <w:r>
         <w:rPr/>
-        <w:t>G/src/ground_station.py and G/src/active_event_queue.py implement event selection, preparation, review and confirmed dispatch. G/src/sos_pattern.py generates the square spiral. G/tests/test_ground_station_rescue_flow.py, G/tests/test_active_event_queue.py and G/tests/test_sos_pattern.py cover these behaviors. verification/integration/test_flight_execution_contract.py checks the mission contract across components. GS_T_WAIT_SECONDS controls the common waiting-time rule.</w:t>
+        <w:t>G/src/ground_station.py and G/src/active_event_queue.py implement event selection, route preparation, review and confirmed dispatch. G/src/sos_pattern.py generates the square spiral. GS_T_WAIT_SECONDS controls the common waiting-time rule. G/src/dispatch_journal.py preserves mission transfer state across retries and restarts.</w:t>
       </w:r>
     </w:p>
     <w:p>
@@ -4768,13 +3696,13 @@
     <w:p>
       <w:r>
         <w:rPr/>
-        <w:t>U/catkin_ws/src/rescue_bridge/src/ contains the mission communication program and mission_commander.cpp, which advances navigation goals. The test_*.py files there and U/catkin_ws/src/rescue_bridge/test/test_target_lifecycle.cpp test local logic. A ROS build requires the environment in docs/Flight_Environment_Setup.txt.</w:t>
+        <w:t>U/catkin_ws/src/rescue_bridge/src/ contains the mission communication program and mission_commander.cpp, which advances navigation goals. A ROS build requires the environment in docs/Flight_Environment_Setup.txt.</w:t>
       </w:r>
     </w:p>
     <w:p>
       <w:r>
         <w:rPr/>
-        <w:t>U/drone_system/receiver/phone_sos_receiver.py and G/src/rescue_record_protocol.py receive, persist, forward and acknowledge records. The receiver tests, ground-station tests in G/tests/ and verification/integration/test_phone_uav_groundstation.py check integrity, retries and mission association. verification/records/phone_relay/20260928/ and verification/records/phone_relay/20260930/ preserve concrete broker-test inputs and outputs.</w:t>
+        <w:t>U/drone_system/receiver/phone_sos_receiver.py and G/src/rescue_record_protocol.py receive, persist, return and acknowledge phone records.</w:t>
       </w:r>
     </w:p>
     <w:p>
@@ -4787,19 +3715,13 @@
           <w:b/>
           <w:color w:val="000000"/>
         </w:rPr>
-        <w:t>Simulation and outdoor evidence</w:t>
+        <w:t>Simulation</w:t>
       </w:r>
     </w:p>
     <w:p>
       <w:r>
         <w:rPr/>
-        <w:t>simulation/run_three_mode_simulation.m constructs the fixed-seed scenario and full trajectories. simulation/output/ holds inputs, events, execution traces, mission_summary.csv and three_mode_study.mat. simulation/verify_outputs.py checks numeric results against the terrain tile and spiral algorithm. simulation/render_paper_terrain.m renders the manuscript's Figure 4 from saved data. verification/records/figure4_mode_names_20260929.json records the title update without changing trajectories.</w:t>
-      </w:r>
-    </w:p>
-    <w:p>
-      <w:r>
-        <w:rPr/>
-        <w:t>U/drone_system/launcher/cam_recorder.py saves onboard video; adjacent recording tests cover storage and failure handling. docs/assets/outdoor/ contains the original videos, hardware photograph and site frames supporting the manuscript's outdoor observations. Images support operator inspection and post-flight review. Figure 3 in the current manuscript is the hardware image and Figure 5 contains the outdoor observations.</w:t>
+        <w:t>simulation/run_three_mode_simulation.m constructs the fixed-seed scenario and full trajectories. simulation/output/ holds inputs, events, execution traces, mission_summary.csv and three_mode_study.mat. simulation/render_paper_terrain.m renders the manuscript's terrain figure from saved data.</w:t>
       </w:r>
     </w:p>
     <w:sectPr>

</xml_diff>

<commit_message>
Align project naming with the paper title
</commit_message>
<xml_diff>
--- a/docs/Technical_Guide.docx
+++ b/docs/Technical_Guide.docx
@@ -12,7 +12,7 @@
           <w:b/>
           <w:color w:val="000000"/>
         </w:rPr>
-        <w:t>Mountain Search UAV System Technical Guide</w:t>
+        <w:t>User-Triggered UAV Dispatching System Technical Guide</w:t>
       </w:r>
     </w:p>
     <w:p>
@@ -37,7 +37,7 @@
     <w:p>
       <w:r>
         <w:rPr/>
-        <w:t>Mountain Search UAV System | Technical Guide | 1 October 2026</w:t>
+        <w:t>User-Triggered UAV Dispatching System | Technical Guide | 1 October 2026</w:t>
         <w:br/>
         <w:t>Implementation baseline: UAV-SEARCH-20260928</w:t>
       </w:r>
@@ -3764,7 +3764,7 @@
       <w:rPr>
         <w:sz w:val="16"/>
       </w:rPr>
-      <w:t>MOUNTAIN SEARCH UAV SYSTEM  |  TECHNICAL GUIDE</w:t>
+      <w:t>USER-TRIGGERED UAV DISPATCHING SYSTEM  |  TECHNICAL GUIDE</w:t>
     </w:r>
   </w:p>
 </w:hdr>

</xml_diff>

<commit_message>
Separate implementation and document the paper simulation
</commit_message>
<xml_diff>
--- a/docs/Technical_Guide.docx
+++ b/docs/Technical_Guide.docx
@@ -6,6 +6,8 @@
       <w:pPr>
         <w:pStyle w:val="Title"/>
         <w:keepNext/>
+        <w:keepLines/>
+        <w:widowControl/>
       </w:pPr>
       <w:r>
         <w:rPr>
@@ -16,6 +18,10 @@
       </w:r>
     </w:p>
     <w:p>
+      <w:pPr>
+        <w:keepLines/>
+        <w:widowControl/>
+      </w:pPr>
       <w:r>
         <w:rPr/>
         <w:t>This guide explains how to set up and operate the Android mobile application, Windows ground station and onboard UAV software. It also describes the three-mode MATLAB simulation, saved results and original system imagery.</w:t>
@@ -25,6 +31,8 @@
       <w:pPr>
         <w:pStyle w:val="Heading1"/>
         <w:keepNext/>
+        <w:keepLines/>
+        <w:widowControl/>
       </w:pPr>
       <w:r>
         <w:rPr>
@@ -35,23 +43,33 @@
       </w:r>
     </w:p>
     <w:p>
+      <w:pPr>
+        <w:keepLines/>
+        <w:widowControl/>
+      </w:pPr>
       <w:r>
         <w:rPr/>
-        <w:t>User-Triggered UAV Dispatching System | Technical Guide | 1 October 2026</w:t>
+        <w:t>User-Triggered UAV Dispatching System | Technical Guide | 2 October 2026</w:t>
         <w:br/>
         <w:t>Implementation baseline: UAV-SEARCH-20260928</w:t>
       </w:r>
     </w:p>
     <w:p>
+      <w:pPr>
+        <w:keepLines/>
+        <w:widowControl/>
+      </w:pPr>
       <w:r>
         <w:rPr/>
-        <w:t>This archive contains the mobile application, ground station and UAV source code, together with MATLAB simulations of the three search modes and outdoor footage. All paths in this guide are relative to the archive root.</w:t>
+        <w:t>The implementation directory contains the mobile application, ground station and UAV software described in Sections II and III-A of the paper. The separate simulation directory contains the MATLAB search-mission study from Section III-B. Original interface images and outdoor footage accompany the guides. All paths in this guide are relative to the repository root.</w:t>
       </w:r>
     </w:p>
     <w:p>
       <w:pPr>
         <w:pStyle w:val="Heading2"/>
         <w:keepNext/>
+        <w:keepLines/>
+        <w:widowControl/>
       </w:pPr>
       <w:r>
         <w:rPr>
@@ -81,11 +99,13 @@
       </w:tblGrid>
       <w:tr>
         <w:trPr>
+          <w:cantSplit/>
           <w:tblHeader/>
         </w:trPr>
         <w:tc>
           <w:tcPr>
             <w:tcW w:type="dxa" w:w="3528"/>
+            <w:vAlign w:val="center"/>
             <w:tcMar>
               <w:top w:w="70" w:type="dxa"/>
               <w:left w:w="70" w:type="dxa"/>
@@ -110,6 +130,7 @@
         <w:tc>
           <w:tcPr>
             <w:tcW w:type="dxa" w:w="6624"/>
+            <w:vAlign w:val="center"/>
             <w:tcMar>
               <w:top w:w="70" w:type="dxa"/>
               <w:left w:w="70" w:type="dxa"/>
@@ -133,9 +154,13 @@
         </w:tc>
       </w:tr>
       <w:tr>
+        <w:trPr>
+          <w:cantSplit/>
+        </w:trPr>
         <w:tc>
           <w:tcPr>
             <w:tcW w:type="dxa" w:w="3528"/>
+            <w:vAlign w:val="center"/>
             <w:tcMar>
               <w:top w:w="70" w:type="dxa"/>
               <w:left w:w="70" w:type="dxa"/>
@@ -152,13 +177,14 @@
                 <w:b w:val="0"/>
                 <w:sz w:val="19"/>
               </w:rPr>
-              <w:t>code/</w:t>
+              <w:t>implementation/</w:t>
             </w:r>
           </w:p>
         </w:tc>
         <w:tc>
           <w:tcPr>
             <w:tcW w:type="dxa" w:w="6624"/>
+            <w:vAlign w:val="center"/>
             <w:tcMar>
               <w:top w:w="70" w:type="dxa"/>
               <w:left w:w="70" w:type="dxa"/>
@@ -181,9 +207,13 @@
         </w:tc>
       </w:tr>
       <w:tr>
+        <w:trPr>
+          <w:cantSplit/>
+        </w:trPr>
         <w:tc>
           <w:tcPr>
             <w:tcW w:type="dxa" w:w="3528"/>
+            <w:vAlign w:val="center"/>
             <w:tcMar>
               <w:top w:w="70" w:type="dxa"/>
               <w:left w:w="70" w:type="dxa"/>
@@ -207,6 +237,7 @@
         <w:tc>
           <w:tcPr>
             <w:tcW w:type="dxa" w:w="6624"/>
+            <w:vAlign w:val="center"/>
             <w:tcMar>
               <w:top w:w="70" w:type="dxa"/>
               <w:left w:w="70" w:type="dxa"/>
@@ -229,9 +260,13 @@
         </w:tc>
       </w:tr>
       <w:tr>
+        <w:trPr>
+          <w:cantSplit/>
+        </w:trPr>
         <w:tc>
           <w:tcPr>
             <w:tcW w:type="dxa" w:w="3528"/>
+            <w:vAlign w:val="center"/>
             <w:tcMar>
               <w:top w:w="70" w:type="dxa"/>
               <w:left w:w="70" w:type="dxa"/>
@@ -255,6 +290,7 @@
         <w:tc>
           <w:tcPr>
             <w:tcW w:type="dxa" w:w="6624"/>
+            <w:vAlign w:val="center"/>
             <w:tcMar>
               <w:top w:w="70" w:type="dxa"/>
               <w:left w:w="70" w:type="dxa"/>
@@ -277,9 +313,13 @@
         </w:tc>
       </w:tr>
       <w:tr>
+        <w:trPr>
+          <w:cantSplit/>
+        </w:trPr>
         <w:tc>
           <w:tcPr>
             <w:tcW w:type="dxa" w:w="3528"/>
+            <w:vAlign w:val="center"/>
             <w:tcMar>
               <w:top w:w="70" w:type="dxa"/>
               <w:left w:w="70" w:type="dxa"/>
@@ -303,6 +343,7 @@
         <w:tc>
           <w:tcPr>
             <w:tcW w:type="dxa" w:w="6624"/>
+            <w:vAlign w:val="center"/>
             <w:tcMar>
               <w:top w:w="70" w:type="dxa"/>
               <w:left w:w="70" w:type="dxa"/>
@@ -325,9 +366,13 @@
         </w:tc>
       </w:tr>
       <w:tr>
+        <w:trPr>
+          <w:cantSplit/>
+        </w:trPr>
         <w:tc>
           <w:tcPr>
             <w:tcW w:type="dxa" w:w="3528"/>
+            <w:vAlign w:val="center"/>
             <w:tcMar>
               <w:top w:w="70" w:type="dxa"/>
               <w:left w:w="70" w:type="dxa"/>
@@ -351,6 +396,7 @@
         <w:tc>
           <w:tcPr>
             <w:tcW w:type="dxa" w:w="6624"/>
+            <w:vAlign w:val="center"/>
             <w:tcMar>
               <w:top w:w="70" w:type="dxa"/>
               <w:left w:w="70" w:type="dxa"/>
@@ -375,6 +421,8 @@
     </w:tbl>
     <w:p>
       <w:pPr>
+        <w:keepLines/>
+        <w:widowControl/>
         <w:spacing w:after="40" w:before="0" w:line="40" w:lineRule="exact"/>
       </w:pPr>
     </w:p>
@@ -382,6 +430,8 @@
       <w:pPr>
         <w:pStyle w:val="Heading2"/>
         <w:keepNext/>
+        <w:keepLines/>
+        <w:widowControl/>
       </w:pPr>
       <w:r>
         <w:rPr>
@@ -392,6 +442,10 @@
       </w:r>
     </w:p>
     <w:p>
+      <w:pPr>
+        <w:keepLines/>
+        <w:widowControl/>
+      </w:pPr>
       <w:r>
         <w:rPr/>
         <w:t>M, G and U refer to the mobile, ground-station and UAV directories, respectively:</w:t>
@@ -400,24 +454,28 @@
     <w:p>
       <w:pPr>
         <w:pStyle w:val="NoSpacing"/>
+        <w:keepLines/>
+        <w:widowControl/>
         <w:spacing w:before="40" w:after="100"/>
       </w:pPr>
       <w:r>
         <w:rPr>
-          <w:rFonts w:ascii="Consolas" w:hAnsi="Consolas"/>
+          <w:rFonts w:ascii="Courier New" w:hAnsi="Courier New"/>
           <w:sz w:val="18"/>
         </w:rPr>
-        <w:t>code/mobile_application</w:t>
+        <w:t>implementation/mobile_application</w:t>
         <w:br/>
-        <w:t>code/ground_station</w:t>
+        <w:t>implementation/ground_station</w:t>
         <w:br/>
-        <w:t>code/search_uav</w:t>
+        <w:t>implementation/search_uav</w:t>
       </w:r>
     </w:p>
     <w:p>
       <w:pPr>
         <w:pStyle w:val="Heading2"/>
         <w:keepNext/>
+        <w:keepLines/>
+        <w:widowControl/>
       </w:pPr>
       <w:r>
         <w:rPr>
@@ -428,12 +486,20 @@
       </w:r>
     </w:p>
     <w:p>
+      <w:pPr>
+        <w:keepLines/>
+        <w:widowControl/>
+      </w:pPr>
       <w:r>
         <w:rPr/>
         <w:t>Mode 1 estimates the trip end time from the planned route and a fixed walking speed. Mode 2 checks whether the latest valid GPS sample exceeds the configured update timeout. Mode 3 places an SOS request in the verification queue. In all three modes, the operator verifies the situation and confirms a search before creating an event, reviewing its route and dispatching the mission.</w:t>
       </w:r>
     </w:p>
     <w:p>
+      <w:pPr>
+        <w:keepLines/>
+        <w:widowControl/>
+      </w:pPr>
       <w:r>
         <w:rPr/>
         <w:t>The software retains its English and Chinese interface options. Section 8 maps the system functions to their implementation files.</w:t>
@@ -443,6 +509,8 @@
       <w:pPr>
         <w:pStyle w:val="Heading1"/>
         <w:keepNext/>
+        <w:keepLines/>
+        <w:widowControl/>
       </w:pPr>
       <w:r>
         <w:rPr>
@@ -453,6 +521,10 @@
       </w:r>
     </w:p>
     <w:p>
+      <w:pPr>
+        <w:keepLines/>
+        <w:widowControl/>
+      </w:pPr>
       <w:r>
         <w:rPr/>
         <w:t>Use Node.js 24 and the Android SDK/JDK for the mobile application, Python 3.12 with Tk support on Windows for the ground station, and Ubuntu 20.04 with ROS Noetic for the UAV. MATLAB R2025b was used for the saved simulation.</w:t>
@@ -462,6 +534,8 @@
       <w:pPr>
         <w:pStyle w:val="Heading2"/>
         <w:keepNext/>
+        <w:keepLines/>
+        <w:widowControl/>
       </w:pPr>
       <w:r>
         <w:rPr>
@@ -472,9 +546,13 @@
       </w:r>
     </w:p>
     <w:p>
+      <w:pPr>
+        <w:keepLines/>
+        <w:widowControl/>
+      </w:pPr>
       <w:r>
         <w:rPr/>
-        <w:t xml:space="preserve">From code/mobile_application, install the locked dependencies with npm ci. Copy src/services/db/firebaseConfig.example.ts to src/services/db/firebaseConfig.ts and fill the deployment values. Supply the native Android service configuration and map credentials. Start Metro with npm start and run npm run android in another terminal. The </w:t>
+        <w:t xml:space="preserve">From implementation/mobile_application, install the locked dependencies with npm ci. Copy src/services/db/firebaseConfig.example.ts to src/services/db/firebaseConfig.ts and fill the deployment values. Supply the native Android service configuration and map credentials. Start Metro with npm start and run npm run android in another terminal. The </w:t>
       </w:r>
       <w:hyperlink r:id="rId11">
         <w:r>
@@ -493,6 +571,8 @@
       <w:pPr>
         <w:pStyle w:val="Heading2"/>
         <w:keepNext/>
+        <w:keepLines/>
+        <w:widowControl/>
       </w:pPr>
       <w:r>
         <w:rPr>
@@ -503,6 +583,10 @@
       </w:r>
     </w:p>
     <w:p>
+      <w:pPr>
+        <w:keepLines/>
+        <w:widowControl/>
+      </w:pPr>
       <w:r>
         <w:rPr/>
         <w:t>From the repository root in PowerShell, create and activate a Python environment:</w:t>
@@ -511,30 +595,38 @@
     <w:p>
       <w:pPr>
         <w:pStyle w:val="NoSpacing"/>
+        <w:keepLines/>
+        <w:widowControl/>
         <w:spacing w:before="40" w:after="100"/>
       </w:pPr>
       <w:r>
         <w:rPr>
-          <w:rFonts w:ascii="Consolas" w:hAnsi="Consolas"/>
+          <w:rFonts w:ascii="Courier New" w:hAnsi="Courier New"/>
           <w:sz w:val="18"/>
         </w:rPr>
         <w:t>py -3.12 -m venv .venv</w:t>
         <w:br/>
         <w:t>.\.venv\Scripts\Activate.ps1</w:t>
         <w:br/>
-        <w:t>python -m pip install -r code\ground_station\requirements.txt</w:t>
+        <w:t>python -m pip install -r implementation\ground_station\requirements.txt</w:t>
       </w:r>
     </w:p>
     <w:p>
+      <w:pPr>
+        <w:keepLines/>
+        <w:widowControl/>
+      </w:pPr>
       <w:r>
         <w:rPr/>
-        <w:t>Fill code/ground_station/config/runtime.env using the adjacent example, then export its settings before launching the application. Section 4 gives the runtime settings and launch commands. To produce the executable, install code/ground_station/packaging/requirements-build.txt and run code/ground_station/packaging/build_windows_release.ps1.</w:t>
+        <w:t>Fill implementation/ground_station/config/runtime.env using the adjacent example, then export its settings before launching the application. Section 4 gives the runtime settings and launch commands. To produce the executable, install implementation/ground_station/packaging/requirements-build.txt and run implementation/ground_station/packaging/build_windows_release.ps1.</w:t>
       </w:r>
     </w:p>
     <w:p>
       <w:pPr>
         <w:pStyle w:val="Heading2"/>
         <w:keepNext/>
+        <w:keepLines/>
+        <w:widowControl/>
       </w:pPr>
       <w:r>
         <w:rPr>
@@ -545,6 +637,10 @@
       </w:r>
     </w:p>
     <w:p>
+      <w:pPr>
+        <w:keepLines/>
+        <w:widowControl/>
+      </w:pPr>
       <w:r>
         <w:rPr/>
         <w:t xml:space="preserve">Follow </w:t>
@@ -566,6 +662,8 @@
       <w:pPr>
         <w:pStyle w:val="Heading1"/>
         <w:keepNext/>
+        <w:keepLines/>
+        <w:widowControl/>
       </w:pPr>
       <w:r>
         <w:rPr>
@@ -579,6 +677,8 @@
       <w:pPr>
         <w:pStyle w:val="Heading2"/>
         <w:keepNext/>
+        <w:keepLines/>
+        <w:widowControl/>
       </w:pPr>
       <w:r>
         <w:rPr>
@@ -589,12 +689,20 @@
       </w:r>
     </w:p>
     <w:p>
+      <w:pPr>
+        <w:keepLines/>
+        <w:widowControl/>
+      </w:pPr>
       <w:r>
         <w:rPr/>
         <w:t>The user enters a trip name, departure date and departure time, then selects successive locations along the planned route on the map. The interface displays the estimated end date and time automatically. Editing the route, departure date or departure time recalculates the estimate.</w:t>
       </w:r>
     </w:p>
     <w:p>
+      <w:pPr>
+        <w:keepLines/>
+        <w:widowControl/>
+      </w:pPr>
       <w:r>
         <w:rPr/>
         <w:t>The application uses the Haversine formula between consecutive coordinates and sums these distances. It uses a fixed walking speed of 4 km/h and rounds the estimated duration up to a whole minute. The end timestamp is the departure timestamp plus that duration. Dates spanning midnight, a year boundary or a leap day retain the complete end timestamp.</w:t>
@@ -603,11 +711,13 @@
     <w:p>
       <w:pPr>
         <w:pStyle w:val="NoSpacing"/>
+        <w:keepLines/>
+        <w:widowControl/>
         <w:spacing w:before="40" w:after="100"/>
       </w:pPr>
       <w:r>
         <w:rPr>
-          <w:rFonts w:ascii="Consolas" w:hAnsi="Consolas"/>
+          <w:rFonts w:ascii="Courier New" w:hAnsi="Courier New"/>
           <w:sz w:val="18"/>
         </w:rPr>
         <w:t>duration_minutes = ceil(route_distance_m / 4000 * 60)</w:t>
@@ -616,6 +726,10 @@
       </w:r>
     </w:p>
     <w:p>
+      <w:pPr>
+        <w:keepLines/>
+        <w:widowControl/>
+      </w:pPr>
       <w:r>
         <w:rPr/>
         <w:t>The 4 km/h value follows the general walking-time reference in Ordnance Survey's Map Reading guide. This estimate uses horizontal route distance; selected points should represent the planned route turns. Gradient, ground conditions and stops affect actual duration, so an overdue record still requires operator contact and verification.</w:t>
@@ -641,11 +755,13 @@
       </w:tblGrid>
       <w:tr>
         <w:trPr>
+          <w:cantSplit/>
           <w:tblHeader/>
         </w:trPr>
         <w:tc>
           <w:tcPr>
             <w:tcW w:type="dxa" w:w="3528"/>
+            <w:vAlign w:val="center"/>
             <w:tcMar>
               <w:top w:w="70" w:type="dxa"/>
               <w:left w:w="70" w:type="dxa"/>
@@ -670,6 +786,7 @@
         <w:tc>
           <w:tcPr>
             <w:tcW w:type="dxa" w:w="6624"/>
+            <w:vAlign w:val="center"/>
             <w:tcMar>
               <w:top w:w="70" w:type="dxa"/>
               <w:left w:w="70" w:type="dxa"/>
@@ -693,9 +810,13 @@
         </w:tc>
       </w:tr>
       <w:tr>
+        <w:trPr>
+          <w:cantSplit/>
+        </w:trPr>
         <w:tc>
           <w:tcPr>
             <w:tcW w:type="dxa" w:w="3528"/>
+            <w:vAlign w:val="center"/>
             <w:tcMar>
               <w:top w:w="70" w:type="dxa"/>
               <w:left w:w="70" w:type="dxa"/>
@@ -719,6 +840,7 @@
         <w:tc>
           <w:tcPr>
             <w:tcW w:type="dxa" w:w="6624"/>
+            <w:vAlign w:val="center"/>
             <w:tcMar>
               <w:top w:w="70" w:type="dxa"/>
               <w:left w:w="70" w:type="dxa"/>
@@ -741,9 +863,13 @@
         </w:tc>
       </w:tr>
       <w:tr>
+        <w:trPr>
+          <w:cantSplit/>
+        </w:trPr>
         <w:tc>
           <w:tcPr>
             <w:tcW w:type="dxa" w:w="3528"/>
+            <w:vAlign w:val="center"/>
             <w:tcMar>
               <w:top w:w="70" w:type="dxa"/>
               <w:left w:w="70" w:type="dxa"/>
@@ -767,6 +893,7 @@
         <w:tc>
           <w:tcPr>
             <w:tcW w:type="dxa" w:w="6624"/>
+            <w:vAlign w:val="center"/>
             <w:tcMar>
               <w:top w:w="70" w:type="dxa"/>
               <w:left w:w="70" w:type="dxa"/>
@@ -789,9 +916,13 @@
         </w:tc>
       </w:tr>
       <w:tr>
+        <w:trPr>
+          <w:cantSplit/>
+        </w:trPr>
         <w:tc>
           <w:tcPr>
             <w:tcW w:type="dxa" w:w="3528"/>
+            <w:vAlign w:val="center"/>
             <w:tcMar>
               <w:top w:w="70" w:type="dxa"/>
               <w:left w:w="70" w:type="dxa"/>
@@ -815,6 +946,7 @@
         <w:tc>
           <w:tcPr>
             <w:tcW w:type="dxa" w:w="6624"/>
+            <w:vAlign w:val="center"/>
             <w:tcMar>
               <w:top w:w="70" w:type="dxa"/>
               <w:left w:w="70" w:type="dxa"/>
@@ -837,9 +969,13 @@
         </w:tc>
       </w:tr>
       <w:tr>
+        <w:trPr>
+          <w:cantSplit/>
+        </w:trPr>
         <w:tc>
           <w:tcPr>
             <w:tcW w:type="dxa" w:w="3528"/>
+            <w:vAlign w:val="center"/>
             <w:tcMar>
               <w:top w:w="70" w:type="dxa"/>
               <w:left w:w="70" w:type="dxa"/>
@@ -863,6 +999,7 @@
         <w:tc>
           <w:tcPr>
             <w:tcW w:type="dxa" w:w="6624"/>
+            <w:vAlign w:val="center"/>
             <w:tcMar>
               <w:top w:w="70" w:type="dxa"/>
               <w:left w:w="70" w:type="dxa"/>
@@ -885,9 +1022,13 @@
         </w:tc>
       </w:tr>
       <w:tr>
+        <w:trPr>
+          <w:cantSplit/>
+        </w:trPr>
         <w:tc>
           <w:tcPr>
             <w:tcW w:type="dxa" w:w="3528"/>
+            <w:vAlign w:val="center"/>
             <w:tcMar>
               <w:top w:w="70" w:type="dxa"/>
               <w:left w:w="70" w:type="dxa"/>
@@ -911,6 +1052,7 @@
         <w:tc>
           <w:tcPr>
             <w:tcW w:type="dxa" w:w="6624"/>
+            <w:vAlign w:val="center"/>
             <w:tcMar>
               <w:top w:w="70" w:type="dxa"/>
               <w:left w:w="70" w:type="dxa"/>
@@ -933,9 +1075,13 @@
         </w:tc>
       </w:tr>
       <w:tr>
+        <w:trPr>
+          <w:cantSplit/>
+        </w:trPr>
         <w:tc>
           <w:tcPr>
             <w:tcW w:type="dxa" w:w="3528"/>
+            <w:vAlign w:val="center"/>
             <w:tcMar>
               <w:top w:w="70" w:type="dxa"/>
               <w:left w:w="70" w:type="dxa"/>
@@ -959,6 +1105,7 @@
         <w:tc>
           <w:tcPr>
             <w:tcW w:type="dxa" w:w="6624"/>
+            <w:vAlign w:val="center"/>
             <w:tcMar>
               <w:top w:w="70" w:type="dxa"/>
               <w:left w:w="70" w:type="dxa"/>
@@ -981,9 +1128,13 @@
         </w:tc>
       </w:tr>
       <w:tr>
+        <w:trPr>
+          <w:cantSplit/>
+        </w:trPr>
         <w:tc>
           <w:tcPr>
             <w:tcW w:type="dxa" w:w="3528"/>
+            <w:vAlign w:val="center"/>
             <w:tcMar>
               <w:top w:w="70" w:type="dxa"/>
               <w:left w:w="70" w:type="dxa"/>
@@ -1007,6 +1158,7 @@
         <w:tc>
           <w:tcPr>
             <w:tcW w:type="dxa" w:w="6624"/>
+            <w:vAlign w:val="center"/>
             <w:tcMar>
               <w:top w:w="70" w:type="dxa"/>
               <w:left w:w="70" w:type="dxa"/>
@@ -1031,6 +1183,8 @@
     </w:tbl>
     <w:p>
       <w:pPr>
+        <w:keepLines/>
+        <w:widowControl/>
         <w:spacing w:after="40" w:before="0" w:line="40" w:lineRule="exact"/>
       </w:pPr>
     </w:p>
@@ -1038,6 +1192,8 @@
       <w:pPr>
         <w:pStyle w:val="Heading2"/>
         <w:keepNext/>
+        <w:keepLines/>
+        <w:widowControl/>
       </w:pPr>
       <w:r>
         <w:rPr>
@@ -1048,24 +1204,40 @@
       </w:r>
     </w:p>
     <w:p>
+      <w:pPr>
+        <w:keepLines/>
+        <w:widowControl/>
+      </w:pPr>
       <w:r>
         <w:rPr/>
         <w:t>Mode 2 uploads GPS positions and sample timestamps during the hike. The ground station checks the latest valid sample for a timeout and uses the uploaded position history when preparing a flight. Mode 3 stores the location and request information recorded when the user activates SOS, for operator verification and square-spiral route generation.</w:t>
       </w:r>
     </w:p>
     <w:p>
+      <w:pPr>
+        <w:keepLines/>
+        <w:widowControl/>
+      </w:pPr>
       <w:r>
         <w:rPr/>
         <w:t>Mode 2 uses sampling time, not upload or receipt time. A stationary position with fresh samples does not trigger the current update-timeout rule. SOS uploads go to this system's Firebase database and ground station. The separate Call 999 Now button opens the phone dialer. The manuscript retains an earlier interface screenshot; the current English and Chinese SOS instructions explicitly describe ground-station operator verification.</w:t>
       </w:r>
     </w:p>
     <w:p>
+      <w:pPr>
+        <w:keepLines/>
+        <w:widowControl/>
+      </w:pPr>
       <w:r>
         <w:rPr/>
         <w:t>Implementation: M/src/services/eventBookingRecord.ts. Booking interface: M/src/pages/EventBookingPage.tsx.</w:t>
       </w:r>
     </w:p>
     <w:p>
+      <w:pPr>
+        <w:keepLines/>
+        <w:widowControl/>
+      </w:pPr>
       <w:r>
         <w:rPr/>
         <w:t>Reference: Ordnance Survey, Map Reading, “Timing”, printed page 23. The complete source link is in docs/Sources.txt.</w:t>
@@ -1075,6 +1247,8 @@
       <w:pPr>
         <w:pStyle w:val="Heading2"/>
         <w:keepNext/>
+        <w:keepLines/>
+        <w:widowControl/>
       </w:pPr>
       <w:r>
         <w:rPr>
@@ -1085,6 +1259,10 @@
       </w:r>
     </w:p>
     <w:p>
+      <w:pPr>
+        <w:keepLines/>
+        <w:widowControl/>
+      </w:pPr>
       <w:r>
         <w:rPr/>
         <w:t>The current mobile source supports Android only. For device operation, fill M/src/services/db/firebaseConfig.ts with the project's client configuration and use the same Realtime Database URL as the ground station. Configure the Android toolchain, native Firebase files and map credentials separately. From M, npm start starts Metro; npm run android invokes the Android build.</w:t>
@@ -1094,6 +1272,8 @@
       <w:pPr>
         <w:pStyle w:val="Heading1"/>
         <w:keepNext/>
+        <w:keepLines/>
+        <w:widowControl/>
       </w:pPr>
       <w:r>
         <w:rPr>
@@ -1107,6 +1287,8 @@
       <w:pPr>
         <w:pStyle w:val="Heading2"/>
         <w:keepNext/>
+        <w:keepLines/>
+        <w:widowControl/>
       </w:pPr>
       <w:r>
         <w:rPr>
@@ -1117,12 +1299,20 @@
       </w:r>
     </w:p>
     <w:p>
+      <w:pPr>
+        <w:keepLines/>
+        <w:widowControl/>
+      </w:pPr>
       <w:r>
         <w:rPr/>
         <w:t>Overdue bookings, GPS update timeouts and new SOS requests enter the verification queue. The operator reads the user and emergency-contact details, contacts them and records the outcome. A confirmed safe status closes the alert. If safety cannot be confirmed, the operator contacts the available emergency contacts. After completing these records, the operator explicitly confirms a search before the platform creates a search event.</w:t>
       </w:r>
     </w:p>
     <w:p>
+      <w:pPr>
+        <w:keepLines/>
+        <w:widowControl/>
+      </w:pPr>
       <w:r>
         <w:rPr/>
         <w:t>An SOS request no longer creates a dispatchable event directly. Repeated scans or confirmations do not create duplicates. A cancelled SOS cannot be confirmed through a stale alert. An unverified SOS event from the earlier implementation must complete contact verification before route preparation, provided it has not already entered execution.</w:t>
@@ -1132,6 +1322,8 @@
       <w:pPr>
         <w:pStyle w:val="Heading2"/>
         <w:keepNext/>
+        <w:keepLines/>
+        <w:widowControl/>
       </w:pPr>
       <w:r>
         <w:rPr>
@@ -1142,12 +1334,20 @@
       </w:r>
     </w:p>
     <w:p>
+      <w:pPr>
+        <w:keepLines/>
+        <w:widowControl/>
+      </w:pPr>
       <w:r>
         <w:rPr/>
         <w:t>After the operator selects an event, the ground station reads the associated user records and generates a route. Mode 1 uses the planned route; Mode 2 uses GPS history ordered by sample time; Mode 3 generates a square spiral around the SOS location. The operator reviews the route and settings before dispatch. Changes to the relevant records or operation state require the mission to be prepared again.</w:t>
       </w:r>
     </w:p>
     <w:p>
+      <w:pPr>
+        <w:keepLines/>
+        <w:widowControl/>
+      </w:pPr>
       <w:r>
         <w:rPr/>
         <w:t>All three modes have the same initial event priority and the same waiting-time rule. SOS mode alone does not assign the highest priority. The operator selects and dispatches the mission.</w:t>
@@ -1157,6 +1357,8 @@
       <w:pPr>
         <w:pStyle w:val="Heading2"/>
         <w:keepNext/>
+        <w:keepLines/>
+        <w:widowControl/>
       </w:pPr>
       <w:r>
         <w:rPr>
@@ -1186,11 +1388,13 @@
       </w:tblGrid>
       <w:tr>
         <w:trPr>
+          <w:cantSplit/>
           <w:tblHeader/>
         </w:trPr>
         <w:tc>
           <w:tcPr>
             <w:tcW w:type="dxa" w:w="4680"/>
+            <w:vAlign w:val="center"/>
             <w:tcMar>
               <w:top w:w="70" w:type="dxa"/>
               <w:left w:w="70" w:type="dxa"/>
@@ -1215,6 +1419,7 @@
         <w:tc>
           <w:tcPr>
             <w:tcW w:type="dxa" w:w="5472"/>
+            <w:vAlign w:val="center"/>
             <w:tcMar>
               <w:top w:w="70" w:type="dxa"/>
               <w:left w:w="70" w:type="dxa"/>
@@ -1238,9 +1443,13 @@
         </w:tc>
       </w:tr>
       <w:tr>
+        <w:trPr>
+          <w:cantSplit/>
+        </w:trPr>
         <w:tc>
           <w:tcPr>
             <w:tcW w:type="dxa" w:w="4680"/>
+            <w:vAlign w:val="center"/>
             <w:tcMar>
               <w:top w:w="70" w:type="dxa"/>
               <w:left w:w="70" w:type="dxa"/>
@@ -1264,6 +1473,7 @@
         <w:tc>
           <w:tcPr>
             <w:tcW w:type="dxa" w:w="5472"/>
+            <w:vAlign w:val="center"/>
             <w:tcMar>
               <w:top w:w="70" w:type="dxa"/>
               <w:left w:w="70" w:type="dxa"/>
@@ -1286,9 +1496,13 @@
         </w:tc>
       </w:tr>
       <w:tr>
+        <w:trPr>
+          <w:cantSplit/>
+        </w:trPr>
         <w:tc>
           <w:tcPr>
             <w:tcW w:type="dxa" w:w="4680"/>
+            <w:vAlign w:val="center"/>
             <w:tcMar>
               <w:top w:w="70" w:type="dxa"/>
               <w:left w:w="70" w:type="dxa"/>
@@ -1312,6 +1526,7 @@
         <w:tc>
           <w:tcPr>
             <w:tcW w:type="dxa" w:w="5472"/>
+            <w:vAlign w:val="center"/>
             <w:tcMar>
               <w:top w:w="70" w:type="dxa"/>
               <w:left w:w="70" w:type="dxa"/>
@@ -1334,9 +1549,13 @@
         </w:tc>
       </w:tr>
       <w:tr>
+        <w:trPr>
+          <w:cantSplit/>
+        </w:trPr>
         <w:tc>
           <w:tcPr>
             <w:tcW w:type="dxa" w:w="4680"/>
+            <w:vAlign w:val="center"/>
             <w:tcMar>
               <w:top w:w="70" w:type="dxa"/>
               <w:left w:w="70" w:type="dxa"/>
@@ -1360,6 +1579,7 @@
         <w:tc>
           <w:tcPr>
             <w:tcW w:type="dxa" w:w="5472"/>
+            <w:vAlign w:val="center"/>
             <w:tcMar>
               <w:top w:w="70" w:type="dxa"/>
               <w:left w:w="70" w:type="dxa"/>
@@ -1382,9 +1602,13 @@
         </w:tc>
       </w:tr>
       <w:tr>
+        <w:trPr>
+          <w:cantSplit/>
+        </w:trPr>
         <w:tc>
           <w:tcPr>
             <w:tcW w:type="dxa" w:w="4680"/>
+            <w:vAlign w:val="center"/>
             <w:tcMar>
               <w:top w:w="70" w:type="dxa"/>
               <w:left w:w="70" w:type="dxa"/>
@@ -1408,6 +1632,7 @@
         <w:tc>
           <w:tcPr>
             <w:tcW w:type="dxa" w:w="5472"/>
+            <w:vAlign w:val="center"/>
             <w:tcMar>
               <w:top w:w="70" w:type="dxa"/>
               <w:left w:w="70" w:type="dxa"/>
@@ -1430,9 +1655,13 @@
         </w:tc>
       </w:tr>
       <w:tr>
+        <w:trPr>
+          <w:cantSplit/>
+        </w:trPr>
         <w:tc>
           <w:tcPr>
             <w:tcW w:type="dxa" w:w="4680"/>
+            <w:vAlign w:val="center"/>
             <w:tcMar>
               <w:top w:w="70" w:type="dxa"/>
               <w:left w:w="70" w:type="dxa"/>
@@ -1456,6 +1685,7 @@
         <w:tc>
           <w:tcPr>
             <w:tcW w:type="dxa" w:w="5472"/>
+            <w:vAlign w:val="center"/>
             <w:tcMar>
               <w:top w:w="70" w:type="dxa"/>
               <w:left w:w="70" w:type="dxa"/>
@@ -1478,9 +1708,13 @@
         </w:tc>
       </w:tr>
       <w:tr>
+        <w:trPr>
+          <w:cantSplit/>
+        </w:trPr>
         <w:tc>
           <w:tcPr>
             <w:tcW w:type="dxa" w:w="4680"/>
+            <w:vAlign w:val="center"/>
             <w:tcMar>
               <w:top w:w="70" w:type="dxa"/>
               <w:left w:w="70" w:type="dxa"/>
@@ -1504,6 +1738,7 @@
         <w:tc>
           <w:tcPr>
             <w:tcW w:type="dxa" w:w="5472"/>
+            <w:vAlign w:val="center"/>
             <w:tcMar>
               <w:top w:w="70" w:type="dxa"/>
               <w:left w:w="70" w:type="dxa"/>
@@ -1526,9 +1761,13 @@
         </w:tc>
       </w:tr>
       <w:tr>
+        <w:trPr>
+          <w:cantSplit/>
+        </w:trPr>
         <w:tc>
           <w:tcPr>
             <w:tcW w:type="dxa" w:w="4680"/>
+            <w:vAlign w:val="center"/>
             <w:tcMar>
               <w:top w:w="70" w:type="dxa"/>
               <w:left w:w="70" w:type="dxa"/>
@@ -1552,6 +1791,7 @@
         <w:tc>
           <w:tcPr>
             <w:tcW w:type="dxa" w:w="5472"/>
+            <w:vAlign w:val="center"/>
             <w:tcMar>
               <w:top w:w="70" w:type="dxa"/>
               <w:left w:w="70" w:type="dxa"/>
@@ -1576,16 +1816,26 @@
     </w:tbl>
     <w:p>
       <w:pPr>
+        <w:keepLines/>
+        <w:widowControl/>
         <w:spacing w:after="40" w:before="0" w:line="40" w:lineRule="exact"/>
       </w:pPr>
     </w:p>
     <w:p>
+      <w:pPr>
+        <w:keepLines/>
+        <w:widowControl/>
+      </w:pPr>
       <w:r>
         <w:rPr/>
         <w:t>Use G/config/runtime.env.example as the template. Supply and export the actual values, then run python main.py from G. Both threshold fields are blank in the template.</w:t>
       </w:r>
     </w:p>
     <w:p>
+      <w:pPr>
+        <w:keepLines/>
+        <w:widowControl/>
+      </w:pPr>
       <w:r>
         <w:rPr/>
         <w:t>Copy the template to G/config/runtime.env and fill it locally. The application reads exported environment variables. From the repository root in PowerShell:</w:t>
@@ -1594,14 +1844,16 @@
     <w:p>
       <w:pPr>
         <w:pStyle w:val="NoSpacing"/>
+        <w:keepLines/>
+        <w:widowControl/>
         <w:spacing w:before="40" w:after="100"/>
       </w:pPr>
       <w:r>
         <w:rPr>
-          <w:rFonts w:ascii="Consolas" w:hAnsi="Consolas"/>
+          <w:rFonts w:ascii="Courier New" w:hAnsi="Courier New"/>
           <w:sz w:val="18"/>
         </w:rPr>
-        <w:t>Get-Content code\ground_station\config\runtime.env | ForEach-Object {</w:t>
+        <w:t>Get-Content implementation\ground_station\config\runtime.env | ForEach-Object {</w:t>
         <w:br/>
         <w:t xml:space="preserve">    if ($_ -match '^\s*([^#=\s]+)=(.*)$') {</w:t>
         <w:br/>
@@ -1611,18 +1863,26 @@
         <w:br/>
         <w:t>}</w:t>
         <w:br/>
-        <w:t>Set-Location code\ground_station</w:t>
+        <w:t>Set-Location implementation\ground_station</w:t>
         <w:br/>
         <w:t>python main.py</w:t>
       </w:r>
     </w:p>
     <w:p>
+      <w:pPr>
+        <w:keepLines/>
+        <w:widowControl/>
+      </w:pPr>
       <w:r>
         <w:rPr/>
         <w:t>Both the ground station and UAV must reach the configured broker over the deployment network. Use the same database URL in the mobile and ground-station configuration.</w:t>
       </w:r>
     </w:p>
     <w:p>
+      <w:pPr>
+        <w:keepLines/>
+        <w:widowControl/>
+      </w:pPr>
       <w:r>
         <w:rPr/>
         <w:t>Verification logic: G/src/rescue_event_manager.py. Persistence and mission preparation: G/src/rescue_repository.py, G/src/active_event_queue.py and G/src/ground_station.py.</w:t>
@@ -1632,6 +1892,8 @@
       <w:pPr>
         <w:pStyle w:val="Heading1"/>
         <w:keepNext/>
+        <w:keepLines/>
+        <w:widowControl/>
       </w:pPr>
       <w:r>
         <w:rPr>
@@ -1645,6 +1907,8 @@
       <w:pPr>
         <w:pStyle w:val="Heading2"/>
         <w:keepNext/>
+        <w:keepLines/>
+        <w:widowControl/>
       </w:pPr>
       <w:r>
         <w:rPr>
@@ -1655,12 +1919,20 @@
       </w:r>
     </w:p>
     <w:p>
+      <w:pPr>
+        <w:keepLines/>
+        <w:widowControl/>
+      </w:pPr>
       <w:r>
         <w:rPr/>
         <w:t>The ground station and UAV exchange missions and status over Wi-Fi. A mission contains event and execution identifiers, a waypoint sequence, flight altitude, hover duration and return settings. The bridge validates the mission, passes it to the flight program and reports waypoint arrivals and mission stages to the ground station.</w:t>
       </w:r>
     </w:p>
     <w:p>
+      <w:pPr>
+        <w:keepLines/>
+        <w:widowControl/>
+      </w:pPr>
       <w:r>
         <w:rPr/>
         <w:t>The phone-record receiver saves uploads received through its HTTP interface. After a matching mission reports completion of all waypoints and requests landing, the receiver forwards stored records to the ground station. The ground station saves each record and returns an acknowledgement matching its identifier and content hash. The UAV then marks that transfer as complete. The recording program saves downward-facing video on the onboard computer.</w:t>
@@ -1686,11 +1958,13 @@
       </w:tblGrid>
       <w:tr>
         <w:trPr>
+          <w:cantSplit/>
           <w:tblHeader/>
         </w:trPr>
         <w:tc>
           <w:tcPr>
             <w:tcW w:type="dxa" w:w="3528"/>
+            <w:vAlign w:val="center"/>
             <w:tcMar>
               <w:top w:w="70" w:type="dxa"/>
               <w:left w:w="70" w:type="dxa"/>
@@ -1715,6 +1989,7 @@
         <w:tc>
           <w:tcPr>
             <w:tcW w:type="dxa" w:w="6624"/>
+            <w:vAlign w:val="center"/>
             <w:tcMar>
               <w:top w:w="70" w:type="dxa"/>
               <w:left w:w="70" w:type="dxa"/>
@@ -1738,9 +2013,13 @@
         </w:tc>
       </w:tr>
       <w:tr>
+        <w:trPr>
+          <w:cantSplit/>
+        </w:trPr>
         <w:tc>
           <w:tcPr>
             <w:tcW w:type="dxa" w:w="3528"/>
+            <w:vAlign w:val="center"/>
             <w:tcMar>
               <w:top w:w="70" w:type="dxa"/>
               <w:left w:w="70" w:type="dxa"/>
@@ -1764,6 +2043,7 @@
         <w:tc>
           <w:tcPr>
             <w:tcW w:type="dxa" w:w="6624"/>
+            <w:vAlign w:val="center"/>
             <w:tcMar>
               <w:top w:w="70" w:type="dxa"/>
               <w:left w:w="70" w:type="dxa"/>
@@ -1786,9 +2066,13 @@
         </w:tc>
       </w:tr>
       <w:tr>
+        <w:trPr>
+          <w:cantSplit/>
+        </w:trPr>
         <w:tc>
           <w:tcPr>
             <w:tcW w:type="dxa" w:w="3528"/>
+            <w:vAlign w:val="center"/>
             <w:tcMar>
               <w:top w:w="70" w:type="dxa"/>
               <w:left w:w="70" w:type="dxa"/>
@@ -1812,6 +2096,7 @@
         <w:tc>
           <w:tcPr>
             <w:tcW w:type="dxa" w:w="6624"/>
+            <w:vAlign w:val="center"/>
             <w:tcMar>
               <w:top w:w="70" w:type="dxa"/>
               <w:left w:w="70" w:type="dxa"/>
@@ -1834,9 +2119,13 @@
         </w:tc>
       </w:tr>
       <w:tr>
+        <w:trPr>
+          <w:cantSplit/>
+        </w:trPr>
         <w:tc>
           <w:tcPr>
             <w:tcW w:type="dxa" w:w="3528"/>
+            <w:vAlign w:val="center"/>
             <w:tcMar>
               <w:top w:w="70" w:type="dxa"/>
               <w:left w:w="70" w:type="dxa"/>
@@ -1860,6 +2149,7 @@
         <w:tc>
           <w:tcPr>
             <w:tcW w:type="dxa" w:w="6624"/>
+            <w:vAlign w:val="center"/>
             <w:tcMar>
               <w:top w:w="70" w:type="dxa"/>
               <w:left w:w="70" w:type="dxa"/>
@@ -1882,9 +2172,13 @@
         </w:tc>
       </w:tr>
       <w:tr>
+        <w:trPr>
+          <w:cantSplit/>
+        </w:trPr>
         <w:tc>
           <w:tcPr>
             <w:tcW w:type="dxa" w:w="3528"/>
+            <w:vAlign w:val="center"/>
             <w:tcMar>
               <w:top w:w="70" w:type="dxa"/>
               <w:left w:w="70" w:type="dxa"/>
@@ -1908,6 +2202,7 @@
         <w:tc>
           <w:tcPr>
             <w:tcW w:type="dxa" w:w="6624"/>
+            <w:vAlign w:val="center"/>
             <w:tcMar>
               <w:top w:w="70" w:type="dxa"/>
               <w:left w:w="70" w:type="dxa"/>
@@ -1930,9 +2225,13 @@
         </w:tc>
       </w:tr>
       <w:tr>
+        <w:trPr>
+          <w:cantSplit/>
+        </w:trPr>
         <w:tc>
           <w:tcPr>
             <w:tcW w:type="dxa" w:w="3528"/>
+            <w:vAlign w:val="center"/>
             <w:tcMar>
               <w:top w:w="70" w:type="dxa"/>
               <w:left w:w="70" w:type="dxa"/>
@@ -1956,6 +2255,7 @@
         <w:tc>
           <w:tcPr>
             <w:tcW w:type="dxa" w:w="6624"/>
+            <w:vAlign w:val="center"/>
             <w:tcMar>
               <w:top w:w="70" w:type="dxa"/>
               <w:left w:w="70" w:type="dxa"/>
@@ -1980,6 +2280,8 @@
     </w:tbl>
     <w:p>
       <w:pPr>
+        <w:keepLines/>
+        <w:widowControl/>
         <w:spacing w:after="40" w:before="0" w:line="40" w:lineRule="exact"/>
       </w:pPr>
     </w:p>
@@ -1987,6 +2289,8 @@
       <w:pPr>
         <w:pStyle w:val="Heading2"/>
         <w:keepNext/>
+        <w:keepLines/>
+        <w:widowControl/>
       </w:pPr>
       <w:r>
         <w:rPr>
@@ -1997,6 +2301,10 @@
       </w:r>
     </w:p>
     <w:p>
+      <w:pPr>
+        <w:keepLines/>
+        <w:widowControl/>
+      </w:pPr>
       <w:r>
         <w:rPr/>
         <w:t>The flight stack uses Fast-Drone-250 from the original Drone repository at the commit below. The external dependency retains its own licenses and documentation.</w:t>
@@ -2005,17 +2313,23 @@
     <w:p>
       <w:pPr>
         <w:pStyle w:val="NoSpacing"/>
+        <w:keepLines/>
+        <w:widowControl/>
         <w:spacing w:before="40" w:after="100"/>
       </w:pPr>
       <w:r>
         <w:rPr>
-          <w:rFonts w:ascii="Consolas" w:hAnsi="Consolas"/>
+          <w:rFonts w:ascii="Courier New" w:hAnsi="Courier New"/>
           <w:sz w:val="18"/>
         </w:rPr>
         <w:t>b3ac1591b63d15270c9856e7b664da0cf9d3ea48</w:t>
       </w:r>
     </w:p>
     <w:p>
+      <w:pPr>
+        <w:keepLines/>
+        <w:widowControl/>
+      </w:pPr>
       <w:r>
         <w:rPr/>
         <w:t xml:space="preserve">Download and placement commands are in </w:t>
@@ -2034,12 +2348,20 @@
       </w:r>
     </w:p>
     <w:p>
+      <w:pPr>
+        <w:keepLines/>
+        <w:widowControl/>
+      </w:pPr>
       <w:r>
         <w:rPr/>
         <w:t>The ROS environment uses Noetic and catkin. Build the external flight workspace before the rescue_bridge workspace. The default flight altitude in rescue_bridge.launch is the original project setting of 5 m. The 80 m above-ground setting in Section 6 belongs to the separate MATLAB simulation.</w:t>
       </w:r>
     </w:p>
     <w:p>
+      <w:pPr>
+        <w:keepLines/>
+        <w:widowControl/>
+      </w:pPr>
       <w:r>
         <w:rPr/>
         <w:t>Phone-receiver settings are in U/drone_system/config/rescue_receiver.env.example. Set UAV_RESCUE_TOKEN when exposing the interface on the local network. Keep database credentials, runtime tokens and actual user records in their respective deployment environments.</w:t>
@@ -2049,6 +2371,8 @@
       <w:pPr>
         <w:pStyle w:val="Heading1"/>
         <w:keepNext/>
+        <w:keepLines/>
+        <w:widowControl/>
       </w:pPr>
       <w:r>
         <w:rPr>
@@ -2059,6 +2383,10 @@
       </w:r>
     </w:p>
     <w:p>
+      <w:pPr>
+        <w:keepLines/>
+        <w:widowControl/>
+      </w:pPr>
       <w:r>
         <w:rPr/>
         <w:t>The simulation uses terrain near Pak Tam Chung, Sai Kung. The three modes share a launch location and a target in the hills, using a planned route, pre-dispatch GPS history and a square spiral around the target, respectively. Each mission includes takeoff, cruise, target-area activity, return and landing.</w:t>
@@ -2084,11 +2412,13 @@
       </w:tblGrid>
       <w:tr>
         <w:trPr>
+          <w:cantSplit/>
           <w:tblHeader/>
         </w:trPr>
         <w:tc>
           <w:tcPr>
             <w:tcW w:type="dxa" w:w="3528"/>
+            <w:vAlign w:val="center"/>
             <w:tcMar>
               <w:top w:w="70" w:type="dxa"/>
               <w:left w:w="70" w:type="dxa"/>
@@ -2113,6 +2443,7 @@
         <w:tc>
           <w:tcPr>
             <w:tcW w:type="dxa" w:w="6624"/>
+            <w:vAlign w:val="center"/>
             <w:tcMar>
               <w:top w:w="70" w:type="dxa"/>
               <w:left w:w="70" w:type="dxa"/>
@@ -2136,9 +2467,13 @@
         </w:tc>
       </w:tr>
       <w:tr>
+        <w:trPr>
+          <w:cantSplit/>
+        </w:trPr>
         <w:tc>
           <w:tcPr>
             <w:tcW w:type="dxa" w:w="3528"/>
+            <w:vAlign w:val="center"/>
             <w:tcMar>
               <w:top w:w="70" w:type="dxa"/>
               <w:left w:w="70" w:type="dxa"/>
@@ -2162,6 +2497,7 @@
         <w:tc>
           <w:tcPr>
             <w:tcW w:type="dxa" w:w="6624"/>
+            <w:vAlign w:val="center"/>
             <w:tcMar>
               <w:top w:w="70" w:type="dxa"/>
               <w:left w:w="70" w:type="dxa"/>
@@ -2184,9 +2520,13 @@
         </w:tc>
       </w:tr>
       <w:tr>
+        <w:trPr>
+          <w:cantSplit/>
+        </w:trPr>
         <w:tc>
           <w:tcPr>
             <w:tcW w:type="dxa" w:w="3528"/>
+            <w:vAlign w:val="center"/>
             <w:tcMar>
               <w:top w:w="70" w:type="dxa"/>
               <w:left w:w="70" w:type="dxa"/>
@@ -2210,6 +2550,7 @@
         <w:tc>
           <w:tcPr>
             <w:tcW w:type="dxa" w:w="6624"/>
+            <w:vAlign w:val="center"/>
             <w:tcMar>
               <w:top w:w="70" w:type="dxa"/>
               <w:left w:w="70" w:type="dxa"/>
@@ -2232,9 +2573,13 @@
         </w:tc>
       </w:tr>
       <w:tr>
+        <w:trPr>
+          <w:cantSplit/>
+        </w:trPr>
         <w:tc>
           <w:tcPr>
             <w:tcW w:type="dxa" w:w="3528"/>
+            <w:vAlign w:val="center"/>
             <w:tcMar>
               <w:top w:w="70" w:type="dxa"/>
               <w:left w:w="70" w:type="dxa"/>
@@ -2258,6 +2603,7 @@
         <w:tc>
           <w:tcPr>
             <w:tcW w:type="dxa" w:w="6624"/>
+            <w:vAlign w:val="center"/>
             <w:tcMar>
               <w:top w:w="70" w:type="dxa"/>
               <w:left w:w="70" w:type="dxa"/>
@@ -2280,9 +2626,13 @@
         </w:tc>
       </w:tr>
       <w:tr>
+        <w:trPr>
+          <w:cantSplit/>
+        </w:trPr>
         <w:tc>
           <w:tcPr>
             <w:tcW w:type="dxa" w:w="3528"/>
+            <w:vAlign w:val="center"/>
             <w:tcMar>
               <w:top w:w="70" w:type="dxa"/>
               <w:left w:w="70" w:type="dxa"/>
@@ -2306,6 +2656,7 @@
         <w:tc>
           <w:tcPr>
             <w:tcW w:type="dxa" w:w="6624"/>
+            <w:vAlign w:val="center"/>
             <w:tcMar>
               <w:top w:w="70" w:type="dxa"/>
               <w:left w:w="70" w:type="dxa"/>
@@ -2328,9 +2679,13 @@
         </w:tc>
       </w:tr>
       <w:tr>
+        <w:trPr>
+          <w:cantSplit/>
+        </w:trPr>
         <w:tc>
           <w:tcPr>
             <w:tcW w:type="dxa" w:w="3528"/>
+            <w:vAlign w:val="center"/>
             <w:tcMar>
               <w:top w:w="70" w:type="dxa"/>
               <w:left w:w="70" w:type="dxa"/>
@@ -2354,6 +2709,7 @@
         <w:tc>
           <w:tcPr>
             <w:tcW w:type="dxa" w:w="6624"/>
+            <w:vAlign w:val="center"/>
             <w:tcMar>
               <w:top w:w="70" w:type="dxa"/>
               <w:left w:w="70" w:type="dxa"/>
@@ -2376,9 +2732,13 @@
         </w:tc>
       </w:tr>
       <w:tr>
+        <w:trPr>
+          <w:cantSplit/>
+        </w:trPr>
         <w:tc>
           <w:tcPr>
             <w:tcW w:type="dxa" w:w="3528"/>
+            <w:vAlign w:val="center"/>
             <w:tcMar>
               <w:top w:w="70" w:type="dxa"/>
               <w:left w:w="70" w:type="dxa"/>
@@ -2402,6 +2762,7 @@
         <w:tc>
           <w:tcPr>
             <w:tcW w:type="dxa" w:w="6624"/>
+            <w:vAlign w:val="center"/>
             <w:tcMar>
               <w:top w:w="70" w:type="dxa"/>
               <w:left w:w="70" w:type="dxa"/>
@@ -2424,9 +2785,13 @@
         </w:tc>
       </w:tr>
       <w:tr>
+        <w:trPr>
+          <w:cantSplit/>
+        </w:trPr>
         <w:tc>
           <w:tcPr>
             <w:tcW w:type="dxa" w:w="3528"/>
+            <w:vAlign w:val="center"/>
             <w:tcMar>
               <w:top w:w="70" w:type="dxa"/>
               <w:left w:w="70" w:type="dxa"/>
@@ -2450,6 +2815,7 @@
         <w:tc>
           <w:tcPr>
             <w:tcW w:type="dxa" w:w="6624"/>
+            <w:vAlign w:val="center"/>
             <w:tcMar>
               <w:top w:w="70" w:type="dxa"/>
               <w:left w:w="70" w:type="dxa"/>
@@ -2472,9 +2838,13 @@
         </w:tc>
       </w:tr>
       <w:tr>
+        <w:trPr>
+          <w:cantSplit/>
+        </w:trPr>
         <w:tc>
           <w:tcPr>
             <w:tcW w:type="dxa" w:w="3528"/>
+            <w:vAlign w:val="center"/>
             <w:tcMar>
               <w:top w:w="70" w:type="dxa"/>
               <w:left w:w="70" w:type="dxa"/>
@@ -2498,6 +2868,7 @@
         <w:tc>
           <w:tcPr>
             <w:tcW w:type="dxa" w:w="6624"/>
+            <w:vAlign w:val="center"/>
             <w:tcMar>
               <w:top w:w="70" w:type="dxa"/>
               <w:left w:w="70" w:type="dxa"/>
@@ -2522,6 +2893,8 @@
     </w:tbl>
     <w:p>
       <w:pPr>
+        <w:keepLines/>
+        <w:widowControl/>
         <w:spacing w:after="40" w:before="0" w:line="40" w:lineRule="exact"/>
       </w:pPr>
     </w:p>
@@ -2529,6 +2902,68 @@
       <w:pPr>
         <w:pStyle w:val="Heading2"/>
         <w:keepNext/>
+        <w:keepLines/>
+        <w:widowControl/>
+      </w:pPr>
+      <w:r>
+        <w:rPr>
+          <w:b/>
+          <w:color w:val="000000"/>
+        </w:rPr>
+        <w:t>Target selection and route inputs</w:t>
+      </w:r>
+    </w:p>
+    <w:p>
+      <w:pPr>
+        <w:keepLines/>
+        <w:widowControl/>
+      </w:pPr>
+      <w:r>
+        <w:rPr/>
+        <w:t>MATLAB uses the Twister generator with seed 20260926. It samples target candidates uniformly between 1,500 and 4,000 m east and between 500 and 4,000 m north of launch. Candidates must be 2,000 to 4,500 m from launch and at 100 to 500 m terrain elevation. A 17 by 17 grid extending 240 m in each direction must stay at or above 40 m elevation. Terrain along mission and return segments must stay at or above 2 m, sampled at intervals no greater than 5 m. The first accepted candidate is used; the saved study accepts candidate 6. Flight clearance is checked separately after trajectories are generated.</w:t>
+      </w:r>
+    </w:p>
+    <w:p>
+      <w:pPr>
+        <w:keepLines/>
+        <w:widowControl/>
+      </w:pPr>
+      <w:r>
+        <w:rPr/>
+        <w:t>Mode 1 places three waypoints at 27%, 63% and 100% of the launch-to-target baseline, with lateral offsets of 210 m left, 150 m right and 0 m. Mode 2 uses 15 equally spaced baseline fractions from 27% to 100%, interpolates these offsets and adds a 210 m half-sine detour. Mode 3 visits the target centre followed by all 18 square-spiral endpoints. Route construction is deterministic after the target is selected.</w:t>
+      </w:r>
+    </w:p>
+    <w:p>
+      <w:pPr>
+        <w:pStyle w:val="Heading2"/>
+        <w:keepNext/>
+        <w:keepLines/>
+        <w:widowControl/>
+      </w:pPr>
+      <w:r>
+        <w:rPr>
+          <w:b/>
+          <w:color w:val="000000"/>
+        </w:rPr>
+        <w:t>Simulation timing</w:t>
+      </w:r>
+    </w:p>
+    <w:p>
+      <w:pPr>
+        <w:keepLines/>
+        <w:widowControl/>
+      </w:pPr>
+      <w:r>
+        <w:rPr/>
+        <w:t>The clock begins at takeoff. All input records are available before dispatch; overdue decisions, GPS update timeouts, SOS reception, operator verification and communication delays are outside the simulation clock. Each mission includes waypoint hovers, direct return, a final hover and landing. The model uses ideal terrain-following positions and speed limits, without aircraft dynamics, wind, radio coverage or automatic person detection.</w:t>
+      </w:r>
+    </w:p>
+    <w:p>
+      <w:pPr>
+        <w:pStyle w:val="Heading2"/>
+        <w:keepNext/>
+        <w:keepLines/>
+        <w:widowControl/>
       </w:pPr>
       <w:r>
         <w:rPr>
@@ -2539,6 +2974,10 @@
       </w:r>
     </w:p>
     <w:p>
+      <w:pPr>
+        <w:keepLines/>
+        <w:widowControl/>
+      </w:pPr>
       <w:r>
         <w:rPr/>
         <w:t>Set the MATLAB current folder to simulation and select the required entry point:</w:t>
@@ -2547,11 +2986,13 @@
     <w:p>
       <w:pPr>
         <w:pStyle w:val="NoSpacing"/>
+        <w:keepLines/>
+        <w:widowControl/>
         <w:spacing w:before="40" w:after="100"/>
       </w:pPr>
       <w:r>
         <w:rPr>
-          <w:rFonts w:ascii="Consolas" w:hAnsi="Consolas"/>
+          <w:rFonts w:ascii="Courier New" w:hAnsi="Courier New"/>
           <w:sz w:val="18"/>
         </w:rPr>
         <w:t>run_all('paper')</w:t>
@@ -2562,9 +3003,35 @@
       </w:r>
     </w:p>
     <w:p>
+      <w:pPr>
+        <w:keepLines/>
+        <w:widowControl/>
+      </w:pPr>
       <w:r>
         <w:rPr/>
         <w:t>paper redraws the figure from saved trajectories into a new directory under simulation/regenerated. simulate recomputes all modes into the selected output directory. video renders the saved trajectories into its selected directory and requires ffmpeg. Each output directory must be new; simulation/output remains the saved input and result archive. The renderers use Event Booking, Quick Start and SOS.</w:t>
+      </w:r>
+    </w:p>
+    <w:p>
+      <w:pPr>
+        <w:keepLines/>
+        <w:widowControl/>
+      </w:pPr>
+      <w:r>
+        <w:rPr/>
+        <w:t xml:space="preserve">The saved study records MATLAB R2025b Update 4. Recomputing prints the seed, accepted candidate and mission summary, writes settings, input and execution tables, and saves figures and a MATLAB workspace. The paper figure is also written under the new result directory's paper subdirectory. The </w:t>
+      </w:r>
+      <w:hyperlink r:id="rId13">
+        <w:r>
+          <w:rPr>
+            <w:color w:val="000000"/>
+          </w:rPr>
+          <w:t>simulation guide</w:t>
+        </w:r>
+      </w:hyperlink>
+      <w:r>
+        <w:rPr/>
+        <w:t xml:space="preserve"> gives the full sampling rules, input construction, command outputs and result-file descriptions.</w:t>
       </w:r>
     </w:p>
     <w:tbl>
@@ -2589,11 +3056,13 @@
       </w:tblGrid>
       <w:tr>
         <w:trPr>
+          <w:cantSplit/>
           <w:tblHeader/>
         </w:trPr>
         <w:tc>
           <w:tcPr>
             <w:tcW w:type="dxa" w:w="1800"/>
+            <w:vAlign w:val="center"/>
             <w:tcMar>
               <w:top w:w="70" w:type="dxa"/>
               <w:left w:w="70" w:type="dxa"/>
@@ -2618,6 +3087,7 @@
         <w:tc>
           <w:tcPr>
             <w:tcW w:type="dxa" w:w="1872"/>
+            <w:vAlign w:val="center"/>
             <w:tcMar>
               <w:top w:w="70" w:type="dxa"/>
               <w:left w:w="70" w:type="dxa"/>
@@ -2642,6 +3112,7 @@
         <w:tc>
           <w:tcPr>
             <w:tcW w:type="dxa" w:w="3168"/>
+            <w:vAlign w:val="center"/>
             <w:tcMar>
               <w:top w:w="70" w:type="dxa"/>
               <w:left w:w="70" w:type="dxa"/>
@@ -2666,6 +3137,7 @@
         <w:tc>
           <w:tcPr>
             <w:tcW w:type="dxa" w:w="3312"/>
+            <w:vAlign w:val="center"/>
             <w:tcMar>
               <w:top w:w="70" w:type="dxa"/>
               <w:left w:w="70" w:type="dxa"/>
@@ -2689,9 +3161,13 @@
         </w:tc>
       </w:tr>
       <w:tr>
+        <w:trPr>
+          <w:cantSplit/>
+        </w:trPr>
         <w:tc>
           <w:tcPr>
             <w:tcW w:type="dxa" w:w="1800"/>
+            <w:vAlign w:val="center"/>
             <w:tcMar>
               <w:top w:w="70" w:type="dxa"/>
               <w:left w:w="70" w:type="dxa"/>
@@ -2715,6 +3191,7 @@
         <w:tc>
           <w:tcPr>
             <w:tcW w:type="dxa" w:w="1872"/>
+            <w:vAlign w:val="center"/>
             <w:tcMar>
               <w:top w:w="70" w:type="dxa"/>
               <w:left w:w="70" w:type="dxa"/>
@@ -2738,6 +3215,7 @@
         <w:tc>
           <w:tcPr>
             <w:tcW w:type="dxa" w:w="3168"/>
+            <w:vAlign w:val="center"/>
             <w:tcMar>
               <w:top w:w="70" w:type="dxa"/>
               <w:left w:w="70" w:type="dxa"/>
@@ -2761,6 +3239,7 @@
         <w:tc>
           <w:tcPr>
             <w:tcW w:type="dxa" w:w="3312"/>
+            <w:vAlign w:val="center"/>
             <w:tcMar>
               <w:top w:w="70" w:type="dxa"/>
               <w:left w:w="70" w:type="dxa"/>
@@ -2783,9 +3262,13 @@
         </w:tc>
       </w:tr>
       <w:tr>
+        <w:trPr>
+          <w:cantSplit/>
+        </w:trPr>
         <w:tc>
           <w:tcPr>
             <w:tcW w:type="dxa" w:w="1800"/>
+            <w:vAlign w:val="center"/>
             <w:tcMar>
               <w:top w:w="70" w:type="dxa"/>
               <w:left w:w="70" w:type="dxa"/>
@@ -2809,6 +3292,7 @@
         <w:tc>
           <w:tcPr>
             <w:tcW w:type="dxa" w:w="1872"/>
+            <w:vAlign w:val="center"/>
             <w:tcMar>
               <w:top w:w="70" w:type="dxa"/>
               <w:left w:w="70" w:type="dxa"/>
@@ -2832,6 +3316,7 @@
         <w:tc>
           <w:tcPr>
             <w:tcW w:type="dxa" w:w="3168"/>
+            <w:vAlign w:val="center"/>
             <w:tcMar>
               <w:top w:w="70" w:type="dxa"/>
               <w:left w:w="70" w:type="dxa"/>
@@ -2855,6 +3340,7 @@
         <w:tc>
           <w:tcPr>
             <w:tcW w:type="dxa" w:w="3312"/>
+            <w:vAlign w:val="center"/>
             <w:tcMar>
               <w:top w:w="70" w:type="dxa"/>
               <w:left w:w="70" w:type="dxa"/>
@@ -2877,9 +3363,13 @@
         </w:tc>
       </w:tr>
       <w:tr>
+        <w:trPr>
+          <w:cantSplit/>
+        </w:trPr>
         <w:tc>
           <w:tcPr>
             <w:tcW w:type="dxa" w:w="1800"/>
+            <w:vAlign w:val="center"/>
             <w:tcMar>
               <w:top w:w="70" w:type="dxa"/>
               <w:left w:w="70" w:type="dxa"/>
@@ -2903,6 +3393,7 @@
         <w:tc>
           <w:tcPr>
             <w:tcW w:type="dxa" w:w="1872"/>
+            <w:vAlign w:val="center"/>
             <w:tcMar>
               <w:top w:w="70" w:type="dxa"/>
               <w:left w:w="70" w:type="dxa"/>
@@ -2926,6 +3417,7 @@
         <w:tc>
           <w:tcPr>
             <w:tcW w:type="dxa" w:w="3168"/>
+            <w:vAlign w:val="center"/>
             <w:tcMar>
               <w:top w:w="70" w:type="dxa"/>
               <w:left w:w="70" w:type="dxa"/>
@@ -2949,6 +3441,7 @@
         <w:tc>
           <w:tcPr>
             <w:tcW w:type="dxa" w:w="3312"/>
+            <w:vAlign w:val="center"/>
             <w:tcMar>
               <w:top w:w="70" w:type="dxa"/>
               <w:left w:w="70" w:type="dxa"/>
@@ -2973,16 +3466,26 @@
     </w:tbl>
     <w:p>
       <w:pPr>
+        <w:keepLines/>
+        <w:widowControl/>
         <w:spacing w:after="40" w:before="0" w:line="40" w:lineRule="exact"/>
       </w:pPr>
     </w:p>
     <w:p>
+      <w:pPr>
+        <w:keepLines/>
+        <w:widowControl/>
+      </w:pPr>
       <w:r>
         <w:rPr/>
         <w:t>Elevation comes from the Mapzen / Tilezen Skadi N22E114.hgt tile, with a 3601 × 3601 grid at 1 arc-second spacing and EGM96 elevations. Bilinear interpolation gives a 25 m plotting grid without increasing source resolution. Routes and GPS history are synthetic inputs generated with the fixed seed. Times start at simulated takeoff. Parameters, inputs and executed trajectories are in simulation/output/scenario_and_settings.json, the per-mode waypoint CSV files and the execution_trace.csv files.</w:t>
       </w:r>
     </w:p>
     <w:p>
+      <w:pPr>
+        <w:keepLines/>
+        <w:widowControl/>
+      </w:pPr>
       <w:r>
         <w:rPr/>
         <w:t>Mode 2 timestamps use 1 m/s to construct the synthetic walking history; this is separate from the mobile booking estimate of 4 km/h. All 15 samples exist before dispatch. Mode 3 visits the centre plus 18 spiral endpoints, completes the entire route and then returns; reaching the target does not terminate the search early.</w:t>
@@ -2992,6 +3495,8 @@
       <w:pPr>
         <w:pStyle w:val="Heading1"/>
         <w:keepNext/>
+        <w:keepLines/>
+        <w:widowControl/>
       </w:pPr>
       <w:r>
         <w:rPr>
@@ -3005,6 +3510,8 @@
       <w:pPr>
         <w:pStyle w:val="Heading2"/>
         <w:keepNext/>
+        <w:keepLines/>
+        <w:widowControl/>
       </w:pPr>
       <w:r>
         <w:rPr>
@@ -3034,11 +3541,13 @@
       </w:tblGrid>
       <w:tr>
         <w:trPr>
+          <w:cantSplit/>
           <w:tblHeader/>
         </w:trPr>
         <w:tc>
           <w:tcPr>
             <w:tcW w:type="dxa" w:w="3528"/>
+            <w:vAlign w:val="center"/>
             <w:tcMar>
               <w:top w:w="70" w:type="dxa"/>
               <w:left w:w="70" w:type="dxa"/>
@@ -3063,6 +3572,7 @@
         <w:tc>
           <w:tcPr>
             <w:tcW w:type="dxa" w:w="6624"/>
+            <w:vAlign w:val="center"/>
             <w:tcMar>
               <w:top w:w="70" w:type="dxa"/>
               <w:left w:w="70" w:type="dxa"/>
@@ -3086,9 +3596,13 @@
         </w:tc>
       </w:tr>
       <w:tr>
+        <w:trPr>
+          <w:cantSplit/>
+        </w:trPr>
         <w:tc>
           <w:tcPr>
             <w:tcW w:type="dxa" w:w="3528"/>
+            <w:vAlign w:val="center"/>
             <w:tcMar>
               <w:top w:w="70" w:type="dxa"/>
               <w:left w:w="70" w:type="dxa"/>
@@ -3112,6 +3626,7 @@
         <w:tc>
           <w:tcPr>
             <w:tcW w:type="dxa" w:w="6624"/>
+            <w:vAlign w:val="center"/>
             <w:tcMar>
               <w:top w:w="70" w:type="dxa"/>
               <w:left w:w="70" w:type="dxa"/>
@@ -3123,7 +3638,7 @@
             <w:pPr>
               <w:spacing w:after="40" w:before="40"/>
             </w:pPr>
-            <w:hyperlink r:id="rId13">
+            <w:hyperlink r:id="rId14">
               <w:r>
                 <w:rPr>
                   <w:color w:val="000000"/>
@@ -3135,9 +3650,13 @@
         </w:tc>
       </w:tr>
       <w:tr>
+        <w:trPr>
+          <w:cantSplit/>
+        </w:trPr>
         <w:tc>
           <w:tcPr>
             <w:tcW w:type="dxa" w:w="3528"/>
+            <w:vAlign w:val="center"/>
             <w:tcMar>
               <w:top w:w="70" w:type="dxa"/>
               <w:left w:w="70" w:type="dxa"/>
@@ -3161,6 +3680,7 @@
         <w:tc>
           <w:tcPr>
             <w:tcW w:type="dxa" w:w="6624"/>
+            <w:vAlign w:val="center"/>
             <w:tcMar>
               <w:top w:w="70" w:type="dxa"/>
               <w:left w:w="70" w:type="dxa"/>
@@ -3172,7 +3692,7 @@
             <w:pPr>
               <w:spacing w:after="40" w:before="40"/>
             </w:pPr>
-            <w:hyperlink r:id="rId14">
+            <w:hyperlink r:id="rId15">
               <w:r>
                 <w:rPr>
                   <w:color w:val="000000"/>
@@ -3184,9 +3704,13 @@
         </w:tc>
       </w:tr>
       <w:tr>
+        <w:trPr>
+          <w:cantSplit/>
+        </w:trPr>
         <w:tc>
           <w:tcPr>
             <w:tcW w:type="dxa" w:w="3528"/>
+            <w:vAlign w:val="center"/>
             <w:tcMar>
               <w:top w:w="70" w:type="dxa"/>
               <w:left w:w="70" w:type="dxa"/>
@@ -3210,6 +3734,7 @@
         <w:tc>
           <w:tcPr>
             <w:tcW w:type="dxa" w:w="6624"/>
+            <w:vAlign w:val="center"/>
             <w:tcMar>
               <w:top w:w="70" w:type="dxa"/>
               <w:left w:w="70" w:type="dxa"/>
@@ -3221,7 +3746,7 @@
             <w:pPr>
               <w:spacing w:after="40" w:before="40"/>
             </w:pPr>
-            <w:hyperlink r:id="rId15">
+            <w:hyperlink r:id="rId16">
               <w:r>
                 <w:rPr>
                   <w:color w:val="000000"/>
@@ -3235,15 +3760,21 @@
     </w:tbl>
     <w:p>
       <w:pPr>
+        <w:keepLines/>
+        <w:widowControl/>
         <w:spacing w:after="40" w:before="0" w:line="40" w:lineRule="exact"/>
       </w:pPr>
     </w:p>
     <w:p>
+      <w:pPr>
+        <w:keepLines/>
+        <w:widowControl/>
+      </w:pPr>
       <w:r>
         <w:rPr/>
         <w:t xml:space="preserve">See </w:t>
       </w:r>
-      <w:hyperlink r:id="rId16">
+      <w:hyperlink r:id="rId17">
         <w:r>
           <w:rPr>
             <w:color w:val="000000"/>
@@ -3260,6 +3791,8 @@
       <w:pPr>
         <w:pStyle w:val="Heading2"/>
         <w:keepNext/>
+        <w:keepLines/>
+        <w:widowControl/>
       </w:pPr>
       <w:r>
         <w:rPr>
@@ -3289,11 +3822,13 @@
       </w:tblGrid>
       <w:tr>
         <w:trPr>
+          <w:cantSplit/>
           <w:tblHeader/>
         </w:trPr>
         <w:tc>
           <w:tcPr>
             <w:tcW w:type="dxa" w:w="3528"/>
+            <w:vAlign w:val="center"/>
             <w:tcMar>
               <w:top w:w="70" w:type="dxa"/>
               <w:left w:w="70" w:type="dxa"/>
@@ -3318,6 +3853,7 @@
         <w:tc>
           <w:tcPr>
             <w:tcW w:type="dxa" w:w="6624"/>
+            <w:vAlign w:val="center"/>
             <w:tcMar>
               <w:top w:w="70" w:type="dxa"/>
               <w:left w:w="70" w:type="dxa"/>
@@ -3341,9 +3877,13 @@
         </w:tc>
       </w:tr>
       <w:tr>
+        <w:trPr>
+          <w:cantSplit/>
+        </w:trPr>
         <w:tc>
           <w:tcPr>
             <w:tcW w:type="dxa" w:w="3528"/>
+            <w:vAlign w:val="center"/>
             <w:tcMar>
               <w:top w:w="70" w:type="dxa"/>
               <w:left w:w="70" w:type="dxa"/>
@@ -3367,6 +3907,7 @@
         <w:tc>
           <w:tcPr>
             <w:tcW w:type="dxa" w:w="6624"/>
+            <w:vAlign w:val="center"/>
             <w:tcMar>
               <w:top w:w="70" w:type="dxa"/>
               <w:left w:w="70" w:type="dxa"/>
@@ -3389,9 +3930,13 @@
         </w:tc>
       </w:tr>
       <w:tr>
+        <w:trPr>
+          <w:cantSplit/>
+        </w:trPr>
         <w:tc>
           <w:tcPr>
             <w:tcW w:type="dxa" w:w="3528"/>
+            <w:vAlign w:val="center"/>
             <w:tcMar>
               <w:top w:w="70" w:type="dxa"/>
               <w:left w:w="70" w:type="dxa"/>
@@ -3415,6 +3960,7 @@
         <w:tc>
           <w:tcPr>
             <w:tcW w:type="dxa" w:w="6624"/>
+            <w:vAlign w:val="center"/>
             <w:tcMar>
               <w:top w:w="70" w:type="dxa"/>
               <w:left w:w="70" w:type="dxa"/>
@@ -3437,9 +3983,13 @@
         </w:tc>
       </w:tr>
       <w:tr>
+        <w:trPr>
+          <w:cantSplit/>
+        </w:trPr>
         <w:tc>
           <w:tcPr>
             <w:tcW w:type="dxa" w:w="3528"/>
+            <w:vAlign w:val="center"/>
             <w:tcMar>
               <w:top w:w="70" w:type="dxa"/>
               <w:left w:w="70" w:type="dxa"/>
@@ -3463,6 +4013,7 @@
         <w:tc>
           <w:tcPr>
             <w:tcW w:type="dxa" w:w="6624"/>
+            <w:vAlign w:val="center"/>
             <w:tcMar>
               <w:top w:w="70" w:type="dxa"/>
               <w:left w:w="70" w:type="dxa"/>
@@ -3485,9 +4036,13 @@
         </w:tc>
       </w:tr>
       <w:tr>
+        <w:trPr>
+          <w:cantSplit/>
+        </w:trPr>
         <w:tc>
           <w:tcPr>
             <w:tcW w:type="dxa" w:w="3528"/>
+            <w:vAlign w:val="center"/>
             <w:tcMar>
               <w:top w:w="70" w:type="dxa"/>
               <w:left w:w="70" w:type="dxa"/>
@@ -3511,6 +4066,7 @@
         <w:tc>
           <w:tcPr>
             <w:tcW w:type="dxa" w:w="6624"/>
+            <w:vAlign w:val="center"/>
             <w:tcMar>
               <w:top w:w="70" w:type="dxa"/>
               <w:left w:w="70" w:type="dxa"/>
@@ -3533,9 +4089,13 @@
         </w:tc>
       </w:tr>
       <w:tr>
+        <w:trPr>
+          <w:cantSplit/>
+        </w:trPr>
         <w:tc>
           <w:tcPr>
             <w:tcW w:type="dxa" w:w="3528"/>
+            <w:vAlign w:val="center"/>
             <w:tcMar>
               <w:top w:w="70" w:type="dxa"/>
               <w:left w:w="70" w:type="dxa"/>
@@ -3559,6 +4119,7 @@
         <w:tc>
           <w:tcPr>
             <w:tcW w:type="dxa" w:w="6624"/>
+            <w:vAlign w:val="center"/>
             <w:tcMar>
               <w:top w:w="70" w:type="dxa"/>
               <w:left w:w="70" w:type="dxa"/>
@@ -3583,10 +4144,16 @@
     </w:tbl>
     <w:p>
       <w:pPr>
+        <w:keepLines/>
+        <w:widowControl/>
         <w:spacing w:after="40" w:before="0" w:line="40" w:lineRule="exact"/>
       </w:pPr>
     </w:p>
     <w:p>
+      <w:pPr>
+        <w:keepLines/>
+        <w:widowControl/>
+      </w:pPr>
       <w:r>
         <w:rPr/>
         <w:t>The video files and images show the UAV, ground-station operation, launch site and search area. Numerical simulation trajectories and timestamps are stored in simulation/output.</w:t>
@@ -3596,6 +4163,8 @@
       <w:pPr>
         <w:pStyle w:val="Heading2"/>
         <w:keepNext/>
+        <w:keepLines/>
+        <w:widowControl/>
       </w:pPr>
       <w:r>
         <w:rPr>
@@ -3606,6 +4175,10 @@
       </w:r>
     </w:p>
     <w:p>
+      <w:pPr>
+        <w:keepLines/>
+        <w:widowControl/>
+      </w:pPr>
       <w:r>
         <w:rPr/>
         <w:t>Ordnance Survey's Map Reading guide provides the walking-time reference. Mapzen / Tilezen Skadi provides the elevation tile. The three original FYP GitHub repositories identify the upstream projects. Complete links are in docs/Sources.txt.</w:t>
@@ -3615,6 +4188,9 @@
       <w:pPr>
         <w:pStyle w:val="Heading1"/>
         <w:keepNext/>
+        <w:keepLines/>
+        <w:pageBreakBefore/>
+        <w:widowControl/>
       </w:pPr>
       <w:r>
         <w:rPr>
@@ -3625,6 +4201,10 @@
       </w:r>
     </w:p>
     <w:p>
+      <w:pPr>
+        <w:keepLines/>
+        <w:widowControl/>
+      </w:pPr>
       <w:r>
         <w:rPr/>
         <w:t>M, G and U use the component abbreviations in Section 1. The following paths identify the source files implementing each system function.</w:t>
@@ -3634,6 +4214,8 @@
       <w:pPr>
         <w:pStyle w:val="Heading2"/>
         <w:keepNext/>
+        <w:keepLines/>
+        <w:widowControl/>
       </w:pPr>
       <w:r>
         <w:rPr>
@@ -3644,18 +4226,30 @@
       </w:r>
     </w:p>
     <w:p>
+      <w:pPr>
+        <w:keepLines/>
+        <w:widowControl/>
+      </w:pPr>
       <w:r>
         <w:rPr/>
         <w:t>Event Booking uses M/src/services/eventBookingRecord.ts and M/src/pages/EventBookingPage.tsx for planned routes and trip-time estimation. G/src/rescue_event_manager.py detects overdue records and manages the contact procedure.</w:t>
       </w:r>
     </w:p>
     <w:p>
+      <w:pPr>
+        <w:keepLines/>
+        <w:widowControl/>
+      </w:pPr>
       <w:r>
         <w:rPr/>
         <w:t>Quick Start uses M/src/pages/AndroidQuickStartPage.tsx and M/src/services/persistentTracking.ts. TrackingService, TrackingStore and TrackingCore in M/android/app/src/main/java/com/fypproject/tracking/ collect and persist samples. G/src/quick_start_freshness.py uses the latest valid sample time. Set GS_T_LOCATION_UPDATE_SECONDS for the deployment.</w:t>
       </w:r>
     </w:p>
     <w:p>
+      <w:pPr>
+        <w:keepLines/>
+        <w:widowControl/>
+      </w:pPr>
       <w:r>
         <w:rPr/>
         <w:t>SOS upload and dialing are implemented in M/src/pages/SosPage.tsx. G/src/rescue_event_manager.py enforces contact verification and explicit search confirmation.</w:t>
@@ -3665,6 +4259,8 @@
       <w:pPr>
         <w:pStyle w:val="Heading2"/>
         <w:keepNext/>
+        <w:keepLines/>
+        <w:widowControl/>
       </w:pPr>
       <w:r>
         <w:rPr>
@@ -3675,6 +4271,10 @@
       </w:r>
     </w:p>
     <w:p>
+      <w:pPr>
+        <w:keepLines/>
+        <w:widowControl/>
+      </w:pPr>
       <w:r>
         <w:rPr/>
         <w:t>G/src/ground_station.py and G/src/active_event_queue.py implement event selection, route preparation, review and confirmed dispatch. G/src/sos_pattern.py generates the square spiral. GS_T_WAIT_SECONDS controls the common waiting-time rule. G/src/dispatch_journal.py preserves mission transfer state across retries and restarts.</w:t>
@@ -3684,6 +4284,8 @@
       <w:pPr>
         <w:pStyle w:val="Heading2"/>
         <w:keepNext/>
+        <w:keepLines/>
+        <w:widowControl/>
       </w:pPr>
       <w:r>
         <w:rPr>
@@ -3694,12 +4296,20 @@
       </w:r>
     </w:p>
     <w:p>
+      <w:pPr>
+        <w:keepLines/>
+        <w:widowControl/>
+      </w:pPr>
       <w:r>
         <w:rPr/>
         <w:t>U/catkin_ws/src/rescue_bridge/src/ contains the mission communication program and mission_commander.cpp, which advances navigation goals. A ROS build requires the environment in docs/Flight_Environment_Setup.txt.</w:t>
       </w:r>
     </w:p>
     <w:p>
+      <w:pPr>
+        <w:keepLines/>
+        <w:widowControl/>
+      </w:pPr>
       <w:r>
         <w:rPr/>
         <w:t>U/drone_system/receiver/phone_sos_receiver.py and G/src/rescue_record_protocol.py receive, persist, return and acknowledge phone records.</w:t>
@@ -3709,6 +4319,8 @@
       <w:pPr>
         <w:pStyle w:val="Heading2"/>
         <w:keepNext/>
+        <w:keepLines/>
+        <w:widowControl/>
       </w:pPr>
       <w:r>
         <w:rPr>
@@ -3719,6 +4331,10 @@
       </w:r>
     </w:p>
     <w:p>
+      <w:pPr>
+        <w:keepLines/>
+        <w:widowControl/>
+      </w:pPr>
       <w:r>
         <w:rPr/>
         <w:t>simulation/run_three_mode_simulation.m constructs the fixed-seed scenario and full trajectories. simulation/output/ holds inputs, events, execution traces, mission_summary.csv and three_mode_study.mat. simulation/render_paper_terrain.m renders the manuscript's terrain figure from saved data.</w:t>

</xml_diff>